<commit_message>
feat: dark/light theme, mobile responsiveness, auto-save drafts, compact gemini modal, and updated guides
</commit_message>
<xml_diff>
--- a/USER_GUIDE.docx
+++ b/USER_GUIDE.docx
@@ -122,6 +122,91 @@
     </w:p>
     <w:p>
       <w:pPr>
+        <w:pStyle w:val="Heading2"/>
+        <w:bidi w:val="1"/>
+        <w:jc w:val="right"/>
+      </w:pPr>
+      <w:r>
+        <w:rPr>
+          <w:rFonts w:ascii="Segoe UI" w:hAnsi="Segoe UI"/>
+          <w:b/>
+          <w:color w:val="1E40AF"/>
+          <w:sz w:val="32"/>
+        </w:rPr>
+        <w:t>אפשרות 1: גלישה ישירה בענן (מומלץ לכל מכשיר – מחשב, טאבלט, סמארטפון)</w:t>
+      </w:r>
+    </w:p>
+    <w:p>
+      <w:pPr>
+        <w:bidi w:val="1"/>
+        <w:jc w:val="right"/>
+      </w:pPr>
+      <w:r>
+        <w:rPr>
+          <w:rFonts w:ascii="Segoe UI" w:hAnsi="Segoe UI"/>
+          <w:color w:val="334155"/>
+        </w:rPr>
+        <w:t>האפליקציה נפרסה לענן וזמינה אונליין ללא צורך בהתקנה כלל:</w:t>
+      </w:r>
+    </w:p>
+    <w:p>
+      <w:pPr>
+        <w:bidi w:val="1"/>
+        <w:jc w:val="right"/>
+      </w:pPr>
+      <w:r>
+        <w:rPr>
+          <w:rFonts w:ascii="Segoe UI" w:hAnsi="Segoe UI"/>
+          <w:color w:val="334155"/>
+        </w:rPr>
+        <w:t xml:space="preserve">👉 </w:t>
+      </w:r>
+      <w:r>
+        <w:rPr>
+          <w:rFonts w:ascii="Segoe UI" w:hAnsi="Segoe UI"/>
+          <w:b/>
+          <w:color w:val="0F172A"/>
+        </w:rPr>
+        <w:t>https://pyteen.onrender.com/</w:t>
+      </w:r>
+      <w:r>
+        <w:rPr>
+          <w:rFonts w:ascii="Segoe UI" w:hAnsi="Segoe UI"/>
+          <w:color w:val="334155"/>
+        </w:rPr>
+      </w:r>
+    </w:p>
+    <w:p>
+      <w:pPr>
+        <w:bidi w:val="1"/>
+        <w:jc w:val="right"/>
+      </w:pPr>
+      <w:r>
+        <w:rPr>
+          <w:rFonts w:ascii="Segoe UI" w:hAnsi="Segoe UI"/>
+          <w:color w:val="334155"/>
+        </w:rPr>
+        <w:t>פשוט פותחים את הקישור מכל דפדפן ומתחילים ללמוד מיד!</w:t>
+      </w:r>
+    </w:p>
+    <w:p>
+      <w:pPr>
+        <w:pStyle w:val="Heading2"/>
+        <w:bidi w:val="1"/>
+        <w:jc w:val="right"/>
+      </w:pPr>
+      <w:r>
+        <w:rPr>
+          <w:rFonts w:ascii="Segoe UI" w:hAnsi="Segoe UI"/>
+          <w:b/>
+          <w:color w:val="1E40AF"/>
+          <w:sz w:val="32"/>
+        </w:rPr>
+        <w:t>אפשרות 2: הפעלה מקומית על המחשב (Windows)</w:t>
+      </w:r>
+    </w:p>
+    <w:p>
+      <w:pPr>
         <w:pStyle w:val="ListNumber"/>
         <w:bidi w:val="1"/>
         <w:jc w:val="right"/>
@@ -131,73 +216,7 @@
           <w:rFonts w:ascii="Segoe UI" w:hAnsi="Segoe UI"/>
           <w:color w:val="334155"/>
         </w:rPr>
-      </w:r>
-      <w:r>
-        <w:rPr>
-          <w:rFonts w:ascii="Segoe UI" w:hAnsi="Segoe UI"/>
-          <w:b/>
-          <w:color w:val="1E293B"/>
-        </w:rPr>
-        <w:t>הפעלה מהירה (Windows):</w:t>
-      </w:r>
-      <w:r>
-        <w:rPr>
-          <w:rFonts w:ascii="Segoe UI" w:hAnsi="Segoe UI"/>
-          <w:color w:val="334155"/>
-        </w:rPr>
-      </w:r>
-    </w:p>
-    <w:p>
-      <w:pPr>
-        <w:bidi w:val="1"/>
-        <w:jc w:val="right"/>
-      </w:pPr>
-      <w:r>
-        <w:rPr>
-          <w:rFonts w:ascii="Segoe UI" w:hAnsi="Segoe UI"/>
-          <w:color w:val="334155"/>
-        </w:rPr>
-        <w:t>לוחצים פעמיים על הקובץ `run_app.bat` בתיקיית הפרויקט.</w:t>
-      </w:r>
-    </w:p>
-    <w:p>
-      <w:pPr>
-        <w:bidi w:val="1"/>
-        <w:jc w:val="right"/>
-      </w:pPr>
-      <w:r>
-        <w:rPr>
-          <w:rFonts w:ascii="Segoe UI" w:hAnsi="Segoe UI"/>
-          <w:color w:val="334155"/>
-        </w:rPr>
-        <w:t>האפליקציה תופעל אוטומטית והדפדפן שלך ייפתח בכתובת:</w:t>
-      </w:r>
-    </w:p>
-    <w:p>
-      <w:pPr>
-        <w:bidi w:val="1"/>
-        <w:jc w:val="right"/>
-      </w:pPr>
-      <w:r>
-        <w:rPr>
-          <w:rFonts w:ascii="Segoe UI" w:hAnsi="Segoe UI"/>
-          <w:color w:val="334155"/>
-        </w:rPr>
-        <w:t xml:space="preserve">👉 </w:t>
-      </w:r>
-      <w:r>
-        <w:rPr>
-          <w:rFonts w:ascii="Segoe UI" w:hAnsi="Segoe UI"/>
-          <w:b/>
-          <w:color w:val="0F172A"/>
-        </w:rPr>
-        <w:t>http://localhost:8080</w:t>
-      </w:r>
-      <w:r>
-        <w:rPr>
-          <w:rFonts w:ascii="Segoe UI" w:hAnsi="Segoe UI"/>
-          <w:color w:val="334155"/>
-        </w:rPr>
+        <w:t>מורידים את תיקיית הפרויקט למחשב.</w:t>
       </w:r>
     </w:p>
     <w:p>
@@ -211,6 +230,91 @@
           <w:rFonts w:ascii="Segoe UI" w:hAnsi="Segoe UI"/>
           <w:color w:val="334155"/>
         </w:rPr>
+        <w:t>לוחצים פעמיים על הקובץ `run_app.bat`.</w:t>
+      </w:r>
+    </w:p>
+    <w:p>
+      <w:pPr>
+        <w:pStyle w:val="ListNumber"/>
+        <w:bidi w:val="1"/>
+        <w:jc w:val="right"/>
+      </w:pPr>
+      <w:r>
+        <w:rPr>
+          <w:rFonts w:ascii="Segoe UI" w:hAnsi="Segoe UI"/>
+          <w:color w:val="334155"/>
+        </w:rPr>
+        <w:t>האפליקציה תופעל אוטומטית והדפדפן ייפתח בכתובת:</w:t>
+      </w:r>
+    </w:p>
+    <w:p>
+      <w:pPr>
+        <w:bidi w:val="1"/>
+        <w:jc w:val="right"/>
+      </w:pPr>
+      <w:r>
+        <w:rPr>
+          <w:rFonts w:ascii="Segoe UI" w:hAnsi="Segoe UI"/>
+          <w:color w:val="334155"/>
+        </w:rPr>
+        <w:t xml:space="preserve">👉 </w:t>
+      </w:r>
+      <w:r>
+        <w:rPr>
+          <w:rFonts w:ascii="Segoe UI" w:hAnsi="Segoe UI"/>
+          <w:b/>
+          <w:color w:val="0F172A"/>
+        </w:rPr>
+        <w:t>http://localhost:8080</w:t>
+      </w:r>
+      <w:r>
+        <w:rPr>
+          <w:rFonts w:ascii="Segoe UI" w:hAnsi="Segoe UI"/>
+          <w:color w:val="334155"/>
+        </w:rPr>
+      </w:r>
+    </w:p>
+    <w:p>
+      <w:pPr>
+        <w:pStyle w:val="Heading2"/>
+        <w:bidi w:val="1"/>
+        <w:jc w:val="right"/>
+      </w:pPr>
+      <w:r>
+        <w:rPr>
+          <w:rFonts w:ascii="Segoe UI" w:hAnsi="Segoe UI"/>
+          <w:b/>
+          <w:color w:val="1E40AF"/>
+          <w:sz w:val="32"/>
+        </w:rPr>
+        <w:t>מסך הפתיחה</w:t>
+      </w:r>
+    </w:p>
+    <w:p>
+      <w:pPr>
+        <w:bidi w:val="1"/>
+        <w:jc w:val="right"/>
+      </w:pPr>
+      <w:r>
+        <w:rPr>
+          <w:rFonts w:ascii="Segoe UI" w:hAnsi="Segoe UI"/>
+          <w:color w:val="334155"/>
+        </w:rPr>
+        <w:t>בדף הבית תראה סקירה של מסלול הלימוד (42 שלבים ב-14 פרקים), לצד מונה התקדמות דינמי.</w:t>
+      </w:r>
+    </w:p>
+    <w:p>
+      <w:pPr>
+        <w:pStyle w:val="ListBullet"/>
+        <w:bidi w:val="1"/>
+        <w:jc w:val="right"/>
+      </w:pPr>
+      <w:r>
+        <w:rPr>
+          <w:rFonts w:ascii="Segoe UI" w:hAnsi="Segoe UI"/>
+          <w:color w:val="334155"/>
+        </w:rPr>
+        <w:t xml:space="preserve">אם זו הפעם הראשונה שלך – לחץ על </w:t>
       </w:r>
       <w:r>
         <w:rPr>
@@ -218,17 +322,19 @@
           <w:b/>
           <w:color w:val="1E293B"/>
         </w:rPr>
-        <w:t>מסך הפתיחה:</w:t>
+        <w:t>"🚀 התחל ללמוד עכשיו"</w:t>
       </w:r>
       <w:r>
         <w:rPr>
           <w:rFonts w:ascii="Segoe UI" w:hAnsi="Segoe UI"/>
           <w:color w:val="334155"/>
         </w:rPr>
+        <w:t>.</w:t>
       </w:r>
     </w:p>
     <w:p>
       <w:pPr>
+        <w:pStyle w:val="ListBullet"/>
         <w:bidi w:val="1"/>
         <w:jc w:val="right"/>
       </w:pPr>
@@ -237,22 +343,22 @@
           <w:rFonts w:ascii="Segoe UI" w:hAnsi="Segoe UI"/>
           <w:color w:val="334155"/>
         </w:rPr>
-        <w:t xml:space="preserve">בדף הבית תראה סקירה של מסלול הלימוד (42 שלבים ב-14 פרקים). לוחצים על </w:t>
+        <w:t xml:space="preserve">אם כבר למדת בעבר – המערכת תזהה אותך ותציג כפתור חכם: </w:t>
       </w:r>
       <w:r>
         <w:rPr>
           <w:rFonts w:ascii="Segoe UI" w:hAnsi="Segoe UI"/>
           <w:b/>
-          <w:color w:val="0F172A"/>
-        </w:rPr>
-        <w:t>"🚀 התחל ללמוד עכשיו"</w:t>
+          <w:color w:val="1E293B"/>
+        </w:rPr>
+        <w:t>"🚀 המשך מאיפה שהפסקת (שלב X)"</w:t>
       </w:r>
       <w:r>
         <w:rPr>
           <w:rFonts w:ascii="Segoe UI" w:hAnsi="Segoe UI"/>
           <w:color w:val="334155"/>
         </w:rPr>
-        <w:t xml:space="preserve"> כדי להיכנס ישירות לשלב הבא שלך!</w:t>
+        <w:t xml:space="preserve"> שייקח אותך ישר לשיעור האחרון!</w:t>
       </w:r>
     </w:p>
     <w:p>
@@ -268,7 +374,7 @@
           <w:color w:val="0E7490"/>
           <w:sz w:val="40"/>
         </w:rPr>
-        <w:t>🖥️ סיור בסביבת הלמידה – מה יש על המסך?</w:t>
+        <w:t>🌓 מצבי תצוגה – לילה כהה או יום בהיר (Dark &amp; Light Modes)</w:t>
       </w:r>
     </w:p>
     <w:p>
@@ -281,11 +387,12 @@
           <w:rFonts w:ascii="Segoe UI" w:hAnsi="Segoe UI"/>
           <w:color w:val="334155"/>
         </w:rPr>
-        <w:t>מסך העבודה מחולק לשלושה אזורים עיקריים:</w:t>
+        <w:t>האפליקציה כוללת מערכת ערכות נושא (Themes) מלאה:</w:t>
       </w:r>
     </w:p>
     <w:p>
       <w:pPr>
+        <w:pStyle w:val="ListBullet"/>
         <w:bidi w:val="1"/>
         <w:jc w:val="right"/>
       </w:pPr>
@@ -294,11 +401,26 @@
           <w:rFonts w:ascii="Segoe UI" w:hAnsi="Segoe UI"/>
           <w:color w:val="334155"/>
         </w:rPr>
-        <w:t>```</w:t>
+      </w:r>
+      <w:r>
+        <w:rPr>
+          <w:rFonts w:ascii="Segoe UI" w:hAnsi="Segoe UI"/>
+          <w:b/>
+          <w:color w:val="1E293B"/>
+        </w:rPr>
+        <w:t>🌙 מצב לילה (Dark Mode):</w:t>
+      </w:r>
+      <w:r>
+        <w:rPr>
+          <w:rFonts w:ascii="Segoe UI" w:hAnsi="Segoe UI"/>
+          <w:color w:val="334155"/>
+        </w:rPr>
+        <w:t xml:space="preserve"> עיצוב יוקרתי בגווני כחול-עמוק וגרפיט, המקל על העיניים בעת למידה ממושכת או בשעות הערב.</w:t>
       </w:r>
     </w:p>
     <w:p>
       <w:pPr>
+        <w:pStyle w:val="ListBullet"/>
         <w:bidi w:val="1"/>
         <w:jc w:val="right"/>
       </w:pPr>
@@ -307,72 +429,21 @@
           <w:rFonts w:ascii="Segoe UI" w:hAnsi="Segoe UI"/>
           <w:color w:val="334155"/>
         </w:rPr>
-        <w:t>┌─────────────────┬──────────────────────────┬──────────────────────────┐</w:t>
-      </w:r>
-    </w:p>
-    <w:p>
-      <w:pPr>
-        <w:bidi w:val="1"/>
-        <w:jc w:val="right"/>
-      </w:pPr>
+      </w:r>
+      <w:r>
+        <w:rPr>
+          <w:rFonts w:ascii="Segoe UI" w:hAnsi="Segoe UI"/>
+          <w:b/>
+          <w:color w:val="1E293B"/>
+        </w:rPr>
+        <w:t>☀️ מצב יום (Light Mode):</w:t>
+      </w:r>
       <w:r>
         <w:rPr>
           <w:rFonts w:ascii="Segoe UI" w:hAnsi="Segoe UI"/>
           <w:color w:val="334155"/>
         </w:rPr>
-        <w:t>│  📚 סרגל צד      │  📖 חלונית התאוריה       │  💻 עורך הקוד והמסוף    │</w:t>
-      </w:r>
-    </w:p>
-    <w:p>
-      <w:pPr>
-        <w:bidi w:val="1"/>
-        <w:jc w:val="right"/>
-      </w:pPr>
-      <w:r>
-        <w:rPr>
-          <w:rFonts w:ascii="Segoe UI" w:hAnsi="Segoe UI"/>
-          <w:color w:val="334155"/>
-        </w:rPr>
-        <w:t>│  (רשימת הפרקים, │  (התמונה הגדולה, הסבר,   │  (כתיבת קוד, הרצה,       │</w:t>
-      </w:r>
-    </w:p>
-    <w:p>
-      <w:pPr>
-        <w:bidi w:val="1"/>
-        <w:jc w:val="right"/>
-      </w:pPr>
-      <w:r>
-        <w:rPr>
-          <w:rFonts w:ascii="Segoe UI" w:hAnsi="Segoe UI"/>
-          <w:color w:val="334155"/>
-        </w:rPr>
-        <w:t>│  סינון וחיפוש)  │   טיפים, ומנטור Gemini) │   משוב שגיאות ופלט)      │</w:t>
-      </w:r>
-    </w:p>
-    <w:p>
-      <w:pPr>
-        <w:bidi w:val="1"/>
-        <w:jc w:val="right"/>
-      </w:pPr>
-      <w:r>
-        <w:rPr>
-          <w:rFonts w:ascii="Segoe UI" w:hAnsi="Segoe UI"/>
-          <w:color w:val="334155"/>
-        </w:rPr>
-        <w:t>└─────────────────┴──────────────────────────┴──────────────────────────┘</w:t>
-      </w:r>
-    </w:p>
-    <w:p>
-      <w:pPr>
-        <w:bidi w:val="1"/>
-        <w:jc w:val="right"/>
-      </w:pPr>
-      <w:r>
-        <w:rPr>
-          <w:rFonts w:ascii="Segoe UI" w:hAnsi="Segoe UI"/>
-          <w:color w:val="334155"/>
-        </w:rPr>
-        <w:t>```</w:t>
+        <w:t xml:space="preserve"> עיצוב נקי ובהיר עם ניגודיות גבוהה, מושלם לקריאה באור יום מלא או בכיתת לימוד.</w:t>
       </w:r>
     </w:p>
     <w:p>
@@ -388,7 +459,50 @@
           <w:color w:val="1E40AF"/>
           <w:sz w:val="32"/>
         </w:rPr>
-        <w:t>1. 📚 סרגל הצד (Sidebar) – הניווט שלך</w:t>
+        <w:t>איך מחליפים מצב?</w:t>
+      </w:r>
+    </w:p>
+    <w:p>
+      <w:pPr>
+        <w:bidi w:val="1"/>
+        <w:jc w:val="right"/>
+      </w:pPr>
+      <w:r>
+        <w:rPr>
+          <w:rFonts w:ascii="Segoe UI" w:hAnsi="Segoe UI"/>
+          <w:color w:val="334155"/>
+        </w:rPr>
+        <w:t xml:space="preserve">בסרגל העליון (Header) מצד שמאל מופיע כפתור </w:t>
+      </w:r>
+      <w:r>
+        <w:rPr>
+          <w:rFonts w:ascii="Segoe UI" w:hAnsi="Segoe UI"/>
+          <w:b/>
+          <w:color w:val="0F172A"/>
+        </w:rPr>
+        <w:t>"🌙 לילה כהה"</w:t>
+      </w:r>
+      <w:r>
+        <w:rPr>
+          <w:rFonts w:ascii="Segoe UI" w:hAnsi="Segoe UI"/>
+          <w:color w:val="334155"/>
+        </w:rPr>
+        <w:t xml:space="preserve"> / </w:t>
+      </w:r>
+      <w:r>
+        <w:rPr>
+          <w:rFonts w:ascii="Segoe UI" w:hAnsi="Segoe UI"/>
+          <w:b/>
+          <w:color w:val="0F172A"/>
+        </w:rPr>
+        <w:t>"☀️ יום בהיר"</w:t>
+      </w:r>
+      <w:r>
+        <w:rPr>
+          <w:rFonts w:ascii="Segoe UI" w:hAnsi="Segoe UI"/>
+          <w:color w:val="334155"/>
+        </w:rPr>
+        <w:t>. לחיצה אחת מחליפה את התצוגה באופן מיידי בכל חלקי האתר.</w:t>
       </w:r>
     </w:p>
     <w:p>
@@ -409,13 +523,14 @@
           <w:b/>
           <w:color w:val="1E293B"/>
         </w:rPr>
-        <w:t>סינון לפי רמות:</w:t>
+        <w:t>שמירה אוטומטית:</w:t>
       </w:r>
       <w:r>
         <w:rPr>
           <w:rFonts w:ascii="Segoe UI" w:hAnsi="Segoe UI"/>
           <w:color w:val="334155"/>
         </w:rPr>
+        <w:t xml:space="preserve"> בחירתך נשמרת בדפדפן (`localStorage`), כך שבכל כניסה עתידית האתר יופיע בדיוק במצב המועדף עליך.</w:t>
       </w:r>
     </w:p>
     <w:p>
@@ -436,14 +551,83 @@
           <w:b/>
           <w:color w:val="1E293B"/>
         </w:rPr>
-        <w:t>"כל השיעורים"</w:t>
+        <w:t>זיהוי ברירת מחדל של המכשיר:</w:t>
       </w:r>
       <w:r>
         <w:rPr>
           <w:rFonts w:ascii="Segoe UI" w:hAnsi="Segoe UI"/>
           <w:color w:val="334155"/>
         </w:rPr>
-        <w:t xml:space="preserve"> (42 שלבים).</w:t>
+        <w:t xml:space="preserve"> בכניסה הראשונה, המערכת מזהה אוטומטית האם מערכת ההפעלה שלך מוגדרת למצב כהה או בהיר ומתאימה את עצמה.</w:t>
+      </w:r>
+    </w:p>
+    <w:p>
+      <w:pPr>
+        <w:pStyle w:val="Heading1"/>
+        <w:bidi w:val="1"/>
+        <w:jc w:val="right"/>
+      </w:pPr>
+      <w:r>
+        <w:rPr>
+          <w:rFonts w:ascii="Segoe UI" w:hAnsi="Segoe UI"/>
+          <w:b/>
+          <w:color w:val="0E7490"/>
+          <w:sz w:val="40"/>
+        </w:rPr>
+        <w:t>📱 חוויית שימוש מותאמת לנייד ולטאבלט (Mobile &amp; Tablet)</w:t>
+      </w:r>
+    </w:p>
+    <w:p>
+      <w:pPr>
+        <w:bidi w:val="1"/>
+        <w:jc w:val="right"/>
+      </w:pPr>
+      <w:r>
+        <w:rPr>
+          <w:rFonts w:ascii="Segoe UI" w:hAnsi="Segoe UI"/>
+          <w:color w:val="334155"/>
+        </w:rPr>
+        <w:t>"פייתון בקלות" מותאמת באופן מלא למסכי מגע, סמארטפונים וטאבלטים:</w:t>
+      </w:r>
+    </w:p>
+    <w:p>
+      <w:pPr>
+        <w:pStyle w:val="ListNumber"/>
+        <w:bidi w:val="1"/>
+        <w:jc w:val="right"/>
+      </w:pPr>
+      <w:r>
+        <w:rPr>
+          <w:rFonts w:ascii="Segoe UI" w:hAnsi="Segoe UI"/>
+          <w:color w:val="334155"/>
+        </w:rPr>
+      </w:r>
+      <w:r>
+        <w:rPr>
+          <w:rFonts w:ascii="Segoe UI" w:hAnsi="Segoe UI"/>
+          <w:b/>
+          <w:color w:val="1E293B"/>
+        </w:rPr>
+        <w:t>סרגל ניווט תחתון/עליון ייעודי:</w:t>
+      </w:r>
+      <w:r>
+        <w:rPr>
+          <w:rFonts w:ascii="Segoe UI" w:hAnsi="Segoe UI"/>
+          <w:color w:val="334155"/>
+        </w:rPr>
+      </w:r>
+    </w:p>
+    <w:p>
+      <w:pPr>
+        <w:bidi w:val="1"/>
+        <w:jc w:val="right"/>
+      </w:pPr>
+      <w:r>
+        <w:rPr>
+          <w:rFonts w:ascii="Segoe UI" w:hAnsi="Segoe UI"/>
+          <w:color w:val="334155"/>
+        </w:rPr>
+        <w:t>במסכים צרים מופיע תפריט לשוניות נוח למעבר מהיר:</w:t>
       </w:r>
     </w:p>
     <w:p>
@@ -464,14 +648,14 @@
           <w:b/>
           <w:color w:val="1E293B"/>
         </w:rPr>
-        <w:t>"יסודות"</w:t>
+        <w:t>`📖 תוכן השיעור`</w:t>
       </w:r>
       <w:r>
         <w:rPr>
           <w:rFonts w:ascii="Segoe UI" w:hAnsi="Segoe UI"/>
           <w:color w:val="334155"/>
         </w:rPr>
-        <w:t xml:space="preserve"> (שלבים 1–25: משתנים, תנאים, לולאות, רשימות ופונקציות).</w:t>
+        <w:t xml:space="preserve"> – קריאת ההסבר, הטיפים והתמונה הגדולה.</w:t>
       </w:r>
     </w:p>
     <w:p>
@@ -492,14 +676,14 @@
           <w:b/>
           <w:color w:val="1E293B"/>
         </w:rPr>
-        <w:t>"מתקדם"</w:t>
+        <w:t>`💻 עורך והרצה`</w:t>
       </w:r>
       <w:r>
         <w:rPr>
           <w:rFonts w:ascii="Segoe UI" w:hAnsi="Segoe UI"/>
           <w:color w:val="334155"/>
         </w:rPr>
-        <w:t xml:space="preserve"> (שלבים 26–42: טאפלים, סטים, טיפול בשגיאות, מודולים, מחלקות OOP ופרויקטים).</w:t>
+        <w:t xml:space="preserve"> – כתיבת הקוד והפעלתו.</w:t>
       </w:r>
     </w:p>
     <w:p>
@@ -520,17 +704,19 @@
           <w:b/>
           <w:color w:val="1E293B"/>
         </w:rPr>
-        <w:t>אקורדיון פרקים:</w:t>
+        <w:t>`📚 רשימת שלבים`</w:t>
       </w:r>
       <w:r>
         <w:rPr>
           <w:rFonts w:ascii="Segoe UI" w:hAnsi="Segoe UI"/>
           <w:color w:val="334155"/>
         </w:rPr>
+        <w:t xml:space="preserve"> – צפייה בסילבוס ובחירת שלב.</w:t>
       </w:r>
     </w:p>
     <w:p>
       <w:pPr>
+        <w:pStyle w:val="ListNumber"/>
         <w:bidi w:val="1"/>
         <w:jc w:val="right"/>
       </w:pPr>
@@ -539,7 +725,240 @@
           <w:rFonts w:ascii="Segoe UI" w:hAnsi="Segoe UI"/>
           <w:color w:val="334155"/>
         </w:rPr>
-        <w:t>כל פרק ניתן לפתיחה ולסגירה בלחיצה על הכותרת שלו. לצד כל פרק מוצג מונה התקדמות (למשל `3/3 ✓`).</w:t>
+      </w:r>
+      <w:r>
+        <w:rPr>
+          <w:rFonts w:ascii="Segoe UI" w:hAnsi="Segoe UI"/>
+          <w:b/>
+          <w:color w:val="1E293B"/>
+        </w:rPr>
+        <w:t>כפתור מעבר מהיר לעורך:</w:t>
+      </w:r>
+      <w:r>
+        <w:rPr>
+          <w:rFonts w:ascii="Segoe UI" w:hAnsi="Segoe UI"/>
+          <w:color w:val="334155"/>
+        </w:rPr>
+        <w:t xml:space="preserve"> בסוף כל הסבר תאורטי מופיע כפתור גדול </w:t>
+      </w:r>
+      <w:r>
+        <w:rPr>
+          <w:rFonts w:ascii="Segoe UI" w:hAnsi="Segoe UI"/>
+          <w:b/>
+          <w:color w:val="1E293B"/>
+        </w:rPr>
+        <w:t>"עבור לכתיבת קוד והרצה 💻 ⬅️"</w:t>
+      </w:r>
+      <w:r>
+        <w:rPr>
+          <w:rFonts w:ascii="Segoe UI" w:hAnsi="Segoe UI"/>
+          <w:color w:val="334155"/>
+        </w:rPr>
+        <w:t>.</w:t>
+      </w:r>
+    </w:p>
+    <w:p>
+      <w:pPr>
+        <w:pStyle w:val="ListNumber"/>
+        <w:bidi w:val="1"/>
+        <w:jc w:val="right"/>
+      </w:pPr>
+      <w:r>
+        <w:rPr>
+          <w:rFonts w:ascii="Segoe UI" w:hAnsi="Segoe UI"/>
+          <w:color w:val="334155"/>
+        </w:rPr>
+      </w:r>
+      <w:r>
+        <w:rPr>
+          <w:rFonts w:ascii="Segoe UI" w:hAnsi="Segoe UI"/>
+          <w:b/>
+          <w:color w:val="1E293B"/>
+        </w:rPr>
+        <w:t>כפתור `[ ⌨️ Tab ]` ייעודי:</w:t>
+      </w:r>
+      <w:r>
+        <w:rPr>
+          <w:rFonts w:ascii="Segoe UI" w:hAnsi="Segoe UI"/>
+          <w:color w:val="334155"/>
+        </w:rPr>
+      </w:r>
+    </w:p>
+    <w:p>
+      <w:pPr>
+        <w:bidi w:val="1"/>
+        <w:jc w:val="right"/>
+      </w:pPr>
+      <w:r>
+        <w:rPr>
+          <w:rFonts w:ascii="Segoe UI" w:hAnsi="Segoe UI"/>
+          <w:color w:val="334155"/>
+        </w:rPr>
+        <w:t>במקלדות וירטואליות של סמארטפונים אין מקש Tab פיזי. הוספנו כפתור `[ ⌨️ Tab ]` בסרגל העורך שמכניס בדיוק 4 רווחים בכל לחיצה – בלי להסתבך עם מקש הרווח!</w:t>
+      </w:r>
+    </w:p>
+    <w:p>
+      <w:pPr>
+        <w:pStyle w:val="ListNumber"/>
+        <w:bidi w:val="1"/>
+        <w:jc w:val="right"/>
+      </w:pPr>
+      <w:r>
+        <w:rPr>
+          <w:rFonts w:ascii="Segoe UI" w:hAnsi="Segoe UI"/>
+          <w:color w:val="334155"/>
+        </w:rPr>
+      </w:r>
+      <w:r>
+        <w:rPr>
+          <w:rFonts w:ascii="Segoe UI" w:hAnsi="Segoe UI"/>
+          <w:b/>
+          <w:color w:val="1E293B"/>
+        </w:rPr>
+        <w:t>מניעת זום אוטומטי:</w:t>
+      </w:r>
+      <w:r>
+        <w:rPr>
+          <w:rFonts w:ascii="Segoe UI" w:hAnsi="Segoe UI"/>
+          <w:color w:val="334155"/>
+        </w:rPr>
+        <w:t xml:space="preserve"> גודל הגופן מותאם למניעת התקרבות מעצבנת (Auto-zoom) בעת נגיעה בתיבת העריכה במכשירי iOS ו-Android.</w:t>
+      </w:r>
+    </w:p>
+    <w:p>
+      <w:pPr>
+        <w:pStyle w:val="Heading1"/>
+        <w:bidi w:val="1"/>
+        <w:jc w:val="right"/>
+      </w:pPr>
+      <w:r>
+        <w:rPr>
+          <w:rFonts w:ascii="Segoe UI" w:hAnsi="Segoe UI"/>
+          <w:b/>
+          <w:color w:val="0E7490"/>
+          <w:sz w:val="40"/>
+        </w:rPr>
+        <w:t>🖥️ סיור בסביבת הלמידה – מה יש על המסך?</w:t>
+      </w:r>
+    </w:p>
+    <w:p>
+      <w:pPr>
+        <w:bidi w:val="1"/>
+        <w:jc w:val="right"/>
+      </w:pPr>
+      <w:r>
+        <w:rPr>
+          <w:rFonts w:ascii="Segoe UI" w:hAnsi="Segoe UI"/>
+          <w:color w:val="334155"/>
+        </w:rPr>
+        <w:t>במחשב שולחני, מסך העבודה מחולק לשלושה אזורים עיקריים:</w:t>
+      </w:r>
+    </w:p>
+    <w:p>
+      <w:pPr>
+        <w:bidi w:val="1"/>
+        <w:jc w:val="right"/>
+      </w:pPr>
+      <w:r>
+        <w:rPr>
+          <w:rFonts w:ascii="Segoe UI" w:hAnsi="Segoe UI"/>
+          <w:color w:val="334155"/>
+        </w:rPr>
+        <w:t>```</w:t>
+      </w:r>
+    </w:p>
+    <w:p>
+      <w:pPr>
+        <w:bidi w:val="1"/>
+        <w:jc w:val="right"/>
+      </w:pPr>
+      <w:r>
+        <w:rPr>
+          <w:rFonts w:ascii="Segoe UI" w:hAnsi="Segoe UI"/>
+          <w:color w:val="334155"/>
+        </w:rPr>
+        <w:t>┌─────────────────┬──────────────────────────┬──────────────────────────┐</w:t>
+      </w:r>
+    </w:p>
+    <w:p>
+      <w:pPr>
+        <w:bidi w:val="1"/>
+        <w:jc w:val="right"/>
+      </w:pPr>
+      <w:r>
+        <w:rPr>
+          <w:rFonts w:ascii="Segoe UI" w:hAnsi="Segoe UI"/>
+          <w:color w:val="334155"/>
+        </w:rPr>
+        <w:t>│  📚 סרגל צד      │  📖 חלונית התאוריה       │  💻 עורך הקוד והמסוף    │</w:t>
+      </w:r>
+    </w:p>
+    <w:p>
+      <w:pPr>
+        <w:bidi w:val="1"/>
+        <w:jc w:val="right"/>
+      </w:pPr>
+      <w:r>
+        <w:rPr>
+          <w:rFonts w:ascii="Segoe UI" w:hAnsi="Segoe UI"/>
+          <w:color w:val="334155"/>
+        </w:rPr>
+        <w:t>│  (רשימת הפרקים, │  (התמונה הגדולה, הסבר,   │  (כתיבת קוד, הרצה,       │</w:t>
+      </w:r>
+    </w:p>
+    <w:p>
+      <w:pPr>
+        <w:bidi w:val="1"/>
+        <w:jc w:val="right"/>
+      </w:pPr>
+      <w:r>
+        <w:rPr>
+          <w:rFonts w:ascii="Segoe UI" w:hAnsi="Segoe UI"/>
+          <w:color w:val="334155"/>
+        </w:rPr>
+        <w:t>│  סינון וחיפוש)  │   טיפים, ומנטור Gemini) │   משוב שגיאות ופלט)      │</w:t>
+      </w:r>
+    </w:p>
+    <w:p>
+      <w:pPr>
+        <w:bidi w:val="1"/>
+        <w:jc w:val="right"/>
+      </w:pPr>
+      <w:r>
+        <w:rPr>
+          <w:rFonts w:ascii="Segoe UI" w:hAnsi="Segoe UI"/>
+          <w:color w:val="334155"/>
+        </w:rPr>
+        <w:t>└─────────────────┴──────────────────────────┴──────────────────────────┘</w:t>
+      </w:r>
+    </w:p>
+    <w:p>
+      <w:pPr>
+        <w:bidi w:val="1"/>
+        <w:jc w:val="right"/>
+      </w:pPr>
+      <w:r>
+        <w:rPr>
+          <w:rFonts w:ascii="Segoe UI" w:hAnsi="Segoe UI"/>
+          <w:color w:val="334155"/>
+        </w:rPr>
+        <w:t>```</w:t>
+      </w:r>
+    </w:p>
+    <w:p>
+      <w:pPr>
+        <w:pStyle w:val="Heading2"/>
+        <w:bidi w:val="1"/>
+        <w:jc w:val="right"/>
+      </w:pPr>
+      <w:r>
+        <w:rPr>
+          <w:rFonts w:ascii="Segoe UI" w:hAnsi="Segoe UI"/>
+          <w:b/>
+          <w:color w:val="1E40AF"/>
+          <w:sz w:val="32"/>
+        </w:rPr>
+        <w:t>1. 📚 סרגל הצד (Sidebar) – הניווט שלך</w:t>
       </w:r>
     </w:p>
     <w:p>
@@ -560,26 +979,13 @@
           <w:b/>
           <w:color w:val="1E293B"/>
         </w:rPr>
-        <w:t>חיפוש מהיר:</w:t>
+        <w:t>סינון לפי רמות:</w:t>
       </w:r>
       <w:r>
         <w:rPr>
           <w:rFonts w:ascii="Segoe UI" w:hAnsi="Segoe UI"/>
           <w:color w:val="334155"/>
         </w:rPr>
-      </w:r>
-    </w:p>
-    <w:p>
-      <w:pPr>
-        <w:bidi w:val="1"/>
-        <w:jc w:val="right"/>
-      </w:pPr>
-      <w:r>
-        <w:rPr>
-          <w:rFonts w:ascii="Segoe UI" w:hAnsi="Segoe UI"/>
-          <w:color w:val="334155"/>
-        </w:rPr>
-        <w:t>תיבת חיפוש בראש הסרגל מאפשרת למצוא כל נושא או מושג בשניות (למשל: "while", "מילון", "שגיאות").</w:t>
       </w:r>
     </w:p>
     <w:p>
@@ -600,6 +1006,170 @@
           <w:b/>
           <w:color w:val="1E293B"/>
         </w:rPr>
+        <w:t>"כל השיעורים"</w:t>
+      </w:r>
+      <w:r>
+        <w:rPr>
+          <w:rFonts w:ascii="Segoe UI" w:hAnsi="Segoe UI"/>
+          <w:color w:val="334155"/>
+        </w:rPr>
+        <w:t xml:space="preserve"> (42 שלבים).</w:t>
+      </w:r>
+    </w:p>
+    <w:p>
+      <w:pPr>
+        <w:pStyle w:val="ListBullet"/>
+        <w:bidi w:val="1"/>
+        <w:jc w:val="right"/>
+      </w:pPr>
+      <w:r>
+        <w:rPr>
+          <w:rFonts w:ascii="Segoe UI" w:hAnsi="Segoe UI"/>
+          <w:color w:val="334155"/>
+        </w:rPr>
+      </w:r>
+      <w:r>
+        <w:rPr>
+          <w:rFonts w:ascii="Segoe UI" w:hAnsi="Segoe UI"/>
+          <w:b/>
+          <w:color w:val="1E293B"/>
+        </w:rPr>
+        <w:t>"יסודות"</w:t>
+      </w:r>
+      <w:r>
+        <w:rPr>
+          <w:rFonts w:ascii="Segoe UI" w:hAnsi="Segoe UI"/>
+          <w:color w:val="334155"/>
+        </w:rPr>
+        <w:t xml:space="preserve"> (שלבים 1–25: משתנים, תנאים, לולאות, רשימות ופונקציות).</w:t>
+      </w:r>
+    </w:p>
+    <w:p>
+      <w:pPr>
+        <w:pStyle w:val="ListBullet"/>
+        <w:bidi w:val="1"/>
+        <w:jc w:val="right"/>
+      </w:pPr>
+      <w:r>
+        <w:rPr>
+          <w:rFonts w:ascii="Segoe UI" w:hAnsi="Segoe UI"/>
+          <w:color w:val="334155"/>
+        </w:rPr>
+      </w:r>
+      <w:r>
+        <w:rPr>
+          <w:rFonts w:ascii="Segoe UI" w:hAnsi="Segoe UI"/>
+          <w:b/>
+          <w:color w:val="1E293B"/>
+        </w:rPr>
+        <w:t>"מתקדם"</w:t>
+      </w:r>
+      <w:r>
+        <w:rPr>
+          <w:rFonts w:ascii="Segoe UI" w:hAnsi="Segoe UI"/>
+          <w:color w:val="334155"/>
+        </w:rPr>
+        <w:t xml:space="preserve"> (שלבים 26–42: טאפלים, סטים, טיפול בשגיאות, מודולים, מחלקות OOP ופרויקטים).</w:t>
+      </w:r>
+    </w:p>
+    <w:p>
+      <w:pPr>
+        <w:pStyle w:val="ListBullet"/>
+        <w:bidi w:val="1"/>
+        <w:jc w:val="right"/>
+      </w:pPr>
+      <w:r>
+        <w:rPr>
+          <w:rFonts w:ascii="Segoe UI" w:hAnsi="Segoe UI"/>
+          <w:color w:val="334155"/>
+        </w:rPr>
+      </w:r>
+      <w:r>
+        <w:rPr>
+          <w:rFonts w:ascii="Segoe UI" w:hAnsi="Segoe UI"/>
+          <w:b/>
+          <w:color w:val="1E293B"/>
+        </w:rPr>
+        <w:t>אקורדיון פרקים:</w:t>
+      </w:r>
+      <w:r>
+        <w:rPr>
+          <w:rFonts w:ascii="Segoe UI" w:hAnsi="Segoe UI"/>
+          <w:color w:val="334155"/>
+        </w:rPr>
+      </w:r>
+    </w:p>
+    <w:p>
+      <w:pPr>
+        <w:bidi w:val="1"/>
+        <w:jc w:val="right"/>
+      </w:pPr>
+      <w:r>
+        <w:rPr>
+          <w:rFonts w:ascii="Segoe UI" w:hAnsi="Segoe UI"/>
+          <w:color w:val="334155"/>
+        </w:rPr>
+        <w:t>כל פרק ניתן לפתיחה ולסגירה בלחיצה על הכותרת שלו. לצד כל פרק מוצג מונה התקדמות (למשל `3/3 ✓`).</w:t>
+      </w:r>
+    </w:p>
+    <w:p>
+      <w:pPr>
+        <w:pStyle w:val="ListBullet"/>
+        <w:bidi w:val="1"/>
+        <w:jc w:val="right"/>
+      </w:pPr>
+      <w:r>
+        <w:rPr>
+          <w:rFonts w:ascii="Segoe UI" w:hAnsi="Segoe UI"/>
+          <w:color w:val="334155"/>
+        </w:rPr>
+      </w:r>
+      <w:r>
+        <w:rPr>
+          <w:rFonts w:ascii="Segoe UI" w:hAnsi="Segoe UI"/>
+          <w:b/>
+          <w:color w:val="1E293B"/>
+        </w:rPr>
+        <w:t>חיפוש מהיר:</w:t>
+      </w:r>
+      <w:r>
+        <w:rPr>
+          <w:rFonts w:ascii="Segoe UI" w:hAnsi="Segoe UI"/>
+          <w:color w:val="334155"/>
+        </w:rPr>
+      </w:r>
+    </w:p>
+    <w:p>
+      <w:pPr>
+        <w:bidi w:val="1"/>
+        <w:jc w:val="right"/>
+      </w:pPr>
+      <w:r>
+        <w:rPr>
+          <w:rFonts w:ascii="Segoe UI" w:hAnsi="Segoe UI"/>
+          <w:color w:val="334155"/>
+        </w:rPr>
+        <w:t>תיבת חיפוש בראש הסרגל מאפשרת למצוא כל נושא או מושג בשניות (למשל: "while", "מילון", "שגיאות").</w:t>
+      </w:r>
+    </w:p>
+    <w:p>
+      <w:pPr>
+        <w:pStyle w:val="ListBullet"/>
+        <w:bidi w:val="1"/>
+        <w:jc w:val="right"/>
+      </w:pPr>
+      <w:r>
+        <w:rPr>
+          <w:rFonts w:ascii="Segoe UI" w:hAnsi="Segoe UI"/>
+          <w:color w:val="334155"/>
+        </w:rPr>
+      </w:r>
+      <w:r>
+        <w:rPr>
+          <w:rFonts w:ascii="Segoe UI" w:hAnsi="Segoe UI"/>
+          <w:b/>
+          <w:color w:val="1E293B"/>
+        </w:rPr>
         <w:t>סימוני הצלחה:</w:t>
       </w:r>
       <w:r>
@@ -1005,7 +1575,7 @@
           <w:b/>
           <w:color w:val="1E293B"/>
         </w:rPr>
-        <w:t>כפתורי עזר:</w:t>
+        <w:t>שמירה אוטומטית של טיוטות (Auto-Save):</w:t>
       </w:r>
       <w:r>
         <w:rPr>
@@ -1025,21 +1595,7 @@
           <w:rFonts w:ascii="Segoe UI" w:hAnsi="Segoe UI"/>
           <w:color w:val="334155"/>
         </w:rPr>
-      </w:r>
-      <w:r>
-        <w:rPr>
-          <w:rFonts w:ascii="Segoe UI" w:hAnsi="Segoe UI"/>
-          <w:b/>
-          <w:color w:val="1E293B"/>
-        </w:rPr>
-        <w:t>▶️ הרץ קוד:</w:t>
-      </w:r>
-      <w:r>
-        <w:rPr>
-          <w:rFonts w:ascii="Segoe UI" w:hAnsi="Segoe UI"/>
-          <w:color w:val="334155"/>
-        </w:rPr>
-        <w:t xml:space="preserve"> מריץ את הקוד ובודק אם הפלט תואם למצופה.</w:t>
+        <w:t>כל שינוי שאתה מקליד נשמר אוטומטית בזיכרון המקומי של הדפדפן.</w:t>
       </w:r>
     </w:p>
     <w:p>
@@ -1053,6 +1609,7 @@
           <w:rFonts w:ascii="Segoe UI" w:hAnsi="Segoe UI"/>
           <w:color w:val="334155"/>
         </w:rPr>
+        <w:t xml:space="preserve">אינדיקטור ירוק </w:t>
       </w:r>
       <w:r>
         <w:rPr>
@@ -1060,14 +1617,14 @@
           <w:b/>
           <w:color w:val="1E293B"/>
         </w:rPr>
-        <w:t>🔄 איפוס קוד:</w:t>
+        <w:t>"💾 נשמר"</w:t>
       </w:r>
       <w:r>
         <w:rPr>
           <w:rFonts w:ascii="Segoe UI" w:hAnsi="Segoe UI"/>
           <w:color w:val="334155"/>
         </w:rPr>
-        <w:t xml:space="preserve"> מחזיר את הקוד בעורך למצבו ההתחלתי אם הסתבכת.</w:t>
+        <w:t xml:space="preserve"> מאשר שהקוד שלך מגובה. אם תרענן את הדף או תחזור מחר – הקוד שלך ימתין לך בדיוק כפי שהשארת אותו!</w:t>
       </w:r>
     </w:p>
     <w:p>
@@ -1088,7 +1645,7 @@
           <w:b/>
           <w:color w:val="1E293B"/>
         </w:rPr>
-        <w:t>🖥️ מסוף הפלט (Output Terminal):</w:t>
+        <w:t>כפתורי עזר:</w:t>
       </w:r>
       <w:r>
         <w:rPr>
@@ -1108,7 +1665,21 @@
           <w:rFonts w:ascii="Segoe UI" w:hAnsi="Segoe UI"/>
           <w:color w:val="334155"/>
         </w:rPr>
-        <w:t>מציג את תוצאות ההרצה בדיוק כפי שפייתון מחזירה.</w:t>
+      </w:r>
+      <w:r>
+        <w:rPr>
+          <w:rFonts w:ascii="Segoe UI" w:hAnsi="Segoe UI"/>
+          <w:b/>
+          <w:color w:val="1E293B"/>
+        </w:rPr>
+        <w:t>▶️ הרץ קוד:</w:t>
+      </w:r>
+      <w:r>
+        <w:rPr>
+          <w:rFonts w:ascii="Segoe UI" w:hAnsi="Segoe UI"/>
+          <w:color w:val="334155"/>
+        </w:rPr>
+        <w:t xml:space="preserve"> מריץ את הקוד ובודק אם הפלט תואם למצופה.</w:t>
       </w:r>
     </w:p>
     <w:p>
@@ -1129,29 +1700,14 @@
           <w:b/>
           <w:color w:val="1E293B"/>
         </w:rPr>
-        <w:t>הצלחה:</w:t>
+        <w:t>🔄 איפוס קוד:</w:t>
       </w:r>
       <w:r>
         <w:rPr>
           <w:rFonts w:ascii="Segoe UI" w:hAnsi="Segoe UI"/>
           <w:color w:val="334155"/>
         </w:rPr>
-        <w:t xml:space="preserve"> באנר ירוק מעודד עם כפתור מהיר </w:t>
-      </w:r>
-      <w:r>
-        <w:rPr>
-          <w:rFonts w:ascii="Segoe UI" w:hAnsi="Segoe UI"/>
-          <w:b/>
-          <w:color w:val="1E293B"/>
-        </w:rPr>
-        <w:t>"לשלב הבא ⬅️"</w:t>
-      </w:r>
-      <w:r>
-        <w:rPr>
-          <w:rFonts w:ascii="Segoe UI" w:hAnsi="Segoe UI"/>
-          <w:color w:val="334155"/>
-        </w:rPr>
-        <w:t>.</w:t>
+        <w:t xml:space="preserve"> מנקה את הטיוטה ומחזיר את הקוד בעורך למצבו ההתחלתי.</w:t>
       </w:r>
     </w:p>
     <w:p>
@@ -1172,6 +1728,90 @@
           <w:b/>
           <w:color w:val="1E293B"/>
         </w:rPr>
+        <w:t>🖥️ מסוף הפלט (Output Terminal):</w:t>
+      </w:r>
+      <w:r>
+        <w:rPr>
+          <w:rFonts w:ascii="Segoe UI" w:hAnsi="Segoe UI"/>
+          <w:color w:val="334155"/>
+        </w:rPr>
+      </w:r>
+    </w:p>
+    <w:p>
+      <w:pPr>
+        <w:pStyle w:val="ListBullet"/>
+        <w:bidi w:val="1"/>
+        <w:jc w:val="right"/>
+      </w:pPr>
+      <w:r>
+        <w:rPr>
+          <w:rFonts w:ascii="Segoe UI" w:hAnsi="Segoe UI"/>
+          <w:color w:val="334155"/>
+        </w:rPr>
+        <w:t>מציג את תוצאות ההרצה בדיוק כפי שפייתון מחזירה.</w:t>
+      </w:r>
+    </w:p>
+    <w:p>
+      <w:pPr>
+        <w:pStyle w:val="ListBullet"/>
+        <w:bidi w:val="1"/>
+        <w:jc w:val="right"/>
+      </w:pPr>
+      <w:r>
+        <w:rPr>
+          <w:rFonts w:ascii="Segoe UI" w:hAnsi="Segoe UI"/>
+          <w:color w:val="334155"/>
+        </w:rPr>
+      </w:r>
+      <w:r>
+        <w:rPr>
+          <w:rFonts w:ascii="Segoe UI" w:hAnsi="Segoe UI"/>
+          <w:b/>
+          <w:color w:val="1E293B"/>
+        </w:rPr>
+        <w:t>הצלחה:</w:t>
+      </w:r>
+      <w:r>
+        <w:rPr>
+          <w:rFonts w:ascii="Segoe UI" w:hAnsi="Segoe UI"/>
+          <w:color w:val="334155"/>
+        </w:rPr>
+        <w:t xml:space="preserve"> באנר ירוק מעודד עם כפתור מהיר </w:t>
+      </w:r>
+      <w:r>
+        <w:rPr>
+          <w:rFonts w:ascii="Segoe UI" w:hAnsi="Segoe UI"/>
+          <w:b/>
+          <w:color w:val="1E293B"/>
+        </w:rPr>
+        <w:t>"לשלב הבא ⬅️"</w:t>
+      </w:r>
+      <w:r>
+        <w:rPr>
+          <w:rFonts w:ascii="Segoe UI" w:hAnsi="Segoe UI"/>
+          <w:color w:val="334155"/>
+        </w:rPr>
+        <w:t>.</w:t>
+      </w:r>
+    </w:p>
+    <w:p>
+      <w:pPr>
+        <w:pStyle w:val="ListBullet"/>
+        <w:bidi w:val="1"/>
+        <w:jc w:val="right"/>
+      </w:pPr>
+      <w:r>
+        <w:rPr>
+          <w:rFonts w:ascii="Segoe UI" w:hAnsi="Segoe UI"/>
+          <w:color w:val="334155"/>
+        </w:rPr>
+      </w:r>
+      <w:r>
+        <w:rPr>
+          <w:rFonts w:ascii="Segoe UI" w:hAnsi="Segoe UI"/>
+          <w:b/>
+          <w:color w:val="1E293B"/>
+        </w:rPr>
         <w:t>שגיאה:</w:t>
       </w:r>
       <w:r>
@@ -1216,7 +1856,7 @@
           <w:b/>
           <w:color w:val="0F172A"/>
         </w:rPr>
-        <w:t>Gemini</w:t>
+        <w:t>Google Gemini</w:t>
       </w:r>
       <w:r>
         <w:rPr>
@@ -1239,6 +1879,195 @@
           <w:color w:val="1E40AF"/>
           <w:sz w:val="32"/>
         </w:rPr>
+        <w:t>עיצוב קומפקטי וחכם</w:t>
+      </w:r>
+    </w:p>
+    <w:p>
+      <w:pPr>
+        <w:bidi w:val="1"/>
+        <w:jc w:val="right"/>
+      </w:pPr>
+      <w:r>
+        <w:rPr>
+          <w:rFonts w:ascii="Segoe UI" w:hAnsi="Segoe UI"/>
+          <w:color w:val="334155"/>
+        </w:rPr>
+        <w:t>במקום כרטיסייה גדולה שתופסת חצי מסך, מנטור ה-AI מוצג כסרגל אלגנטי וקומפקטי המכיל את כל הפונקציות הנדרשות:</w:t>
+      </w:r>
+    </w:p>
+    <w:p>
+      <w:pPr>
+        <w:pStyle w:val="ListBullet"/>
+        <w:bidi w:val="1"/>
+        <w:jc w:val="right"/>
+      </w:pPr>
+      <w:r>
+        <w:rPr>
+          <w:rFonts w:ascii="Segoe UI" w:hAnsi="Segoe UI"/>
+          <w:color w:val="334155"/>
+        </w:rPr>
+      </w:r>
+      <w:r>
+        <w:rPr>
+          <w:rFonts w:ascii="Segoe UI" w:hAnsi="Segoe UI"/>
+          <w:b/>
+          <w:color w:val="1E293B"/>
+        </w:rPr>
+        <w:t>כפתור מידע `ℹ️ איך המנטור עובד?`:</w:t>
+      </w:r>
+      <w:r>
+        <w:rPr>
+          <w:rFonts w:ascii="Segoe UI" w:hAnsi="Segoe UI"/>
+          <w:color w:val="334155"/>
+        </w:rPr>
+      </w:r>
+    </w:p>
+    <w:p>
+      <w:pPr>
+        <w:bidi w:val="1"/>
+        <w:jc w:val="right"/>
+      </w:pPr>
+      <w:r>
+        <w:rPr>
+          <w:rFonts w:ascii="Segoe UI" w:hAnsi="Segoe UI"/>
+          <w:color w:val="334155"/>
+        </w:rPr>
+        <w:t>לחיצה על הכפתור פותחת חלון קופץ (Modal) המסביר בפירוט את 4 עקרונות הפדגוגיה של המנטור (למידה מותאמת, מניעת עומס, דוגמאות מהחיים ואתגרי המשך).</w:t>
+      </w:r>
+    </w:p>
+    <w:p>
+      <w:pPr>
+        <w:pStyle w:val="ListBullet"/>
+        <w:bidi w:val="1"/>
+        <w:jc w:val="right"/>
+      </w:pPr>
+      <w:r>
+        <w:rPr>
+          <w:rFonts w:ascii="Segoe UI" w:hAnsi="Segoe UI"/>
+          <w:color w:val="334155"/>
+        </w:rPr>
+      </w:r>
+      <w:r>
+        <w:rPr>
+          <w:rFonts w:ascii="Segoe UI" w:hAnsi="Segoe UI"/>
+          <w:b/>
+          <w:color w:val="1E293B"/>
+        </w:rPr>
+        <w:t>כפתור `⚡ העתק ופתח ב-Gemini`:</w:t>
+      </w:r>
+      <w:r>
+        <w:rPr>
+          <w:rFonts w:ascii="Segoe UI" w:hAnsi="Segoe UI"/>
+          <w:color w:val="334155"/>
+        </w:rPr>
+      </w:r>
+    </w:p>
+    <w:p>
+      <w:pPr>
+        <w:bidi w:val="1"/>
+        <w:jc w:val="right"/>
+      </w:pPr>
+      <w:r>
+        <w:rPr>
+          <w:rFonts w:ascii="Segoe UI" w:hAnsi="Segoe UI"/>
+          <w:color w:val="334155"/>
+        </w:rPr>
+        <w:t>מעתיק את הפרומפט המותאם אישית ללוח ופותח מיד את Google Gemini בלשונית חדשה. כל שנותר לך הוא ללחוץ `Ctrl + V` ולשלוח!</w:t>
+      </w:r>
+    </w:p>
+    <w:p>
+      <w:pPr>
+        <w:pStyle w:val="ListBullet"/>
+        <w:bidi w:val="1"/>
+        <w:jc w:val="right"/>
+      </w:pPr>
+      <w:r>
+        <w:rPr>
+          <w:rFonts w:ascii="Segoe UI" w:hAnsi="Segoe UI"/>
+          <w:color w:val="334155"/>
+        </w:rPr>
+      </w:r>
+      <w:r>
+        <w:rPr>
+          <w:rFonts w:ascii="Segoe UI" w:hAnsi="Segoe UI"/>
+          <w:b/>
+          <w:color w:val="1E293B"/>
+        </w:rPr>
+        <w:t>כפתור `📋 העתק פרומפט`:</w:t>
+      </w:r>
+      <w:r>
+        <w:rPr>
+          <w:rFonts w:ascii="Segoe UI" w:hAnsi="Segoe UI"/>
+          <w:color w:val="334155"/>
+        </w:rPr>
+      </w:r>
+    </w:p>
+    <w:p>
+      <w:pPr>
+        <w:bidi w:val="1"/>
+        <w:jc w:val="right"/>
+      </w:pPr>
+      <w:r>
+        <w:rPr>
+          <w:rFonts w:ascii="Segoe UI" w:hAnsi="Segoe UI"/>
+          <w:color w:val="334155"/>
+        </w:rPr>
+        <w:t>מעתיק את הפרומפט בלבד (עם חיווי `✔️ הועתק!`) ללא פתיחת לשונית נוספת – מושלם אם ג'מיני כבר פתוח אצלך במסך מפוצל!</w:t>
+      </w:r>
+    </w:p>
+    <w:p>
+      <w:pPr>
+        <w:pStyle w:val="ListBullet"/>
+        <w:bidi w:val="1"/>
+        <w:jc w:val="right"/>
+      </w:pPr>
+      <w:r>
+        <w:rPr>
+          <w:rFonts w:ascii="Segoe UI" w:hAnsi="Segoe UI"/>
+          <w:color w:val="334155"/>
+        </w:rPr>
+      </w:r>
+      <w:r>
+        <w:rPr>
+          <w:rFonts w:ascii="Segoe UI" w:hAnsi="Segoe UI"/>
+          <w:b/>
+          <w:color w:val="1E293B"/>
+        </w:rPr>
+        <w:t>כפתור `👁️ הצג/הסתר פרומפט`:</w:t>
+      </w:r>
+      <w:r>
+        <w:rPr>
+          <w:rFonts w:ascii="Segoe UI" w:hAnsi="Segoe UI"/>
+          <w:color w:val="334155"/>
+        </w:rPr>
+      </w:r>
+    </w:p>
+    <w:p>
+      <w:pPr>
+        <w:bidi w:val="1"/>
+        <w:jc w:val="right"/>
+      </w:pPr>
+      <w:r>
+        <w:rPr>
+          <w:rFonts w:ascii="Segoe UI" w:hAnsi="Segoe UI"/>
+          <w:color w:val="334155"/>
+        </w:rPr>
+        <w:t>פותח תיבת תצוגה מקדימה המאפשרת לך לקרוא את הפרומפט המלא לפני שליחתו או להעתיק ממנו רק חלקים.</w:t>
+      </w:r>
+    </w:p>
+    <w:p>
+      <w:pPr>
+        <w:pStyle w:val="Heading2"/>
+        <w:bidi w:val="1"/>
+        <w:jc w:val="right"/>
+      </w:pPr>
+      <w:r>
+        <w:rPr>
+          <w:rFonts w:ascii="Segoe UI" w:hAnsi="Segoe UI"/>
+          <w:b/>
+          <w:color w:val="1E40AF"/>
+          <w:sz w:val="32"/>
+        </w:rPr>
         <w:t>למה הפרומפט הזה ייחודי?</w:t>
       </w:r>
     </w:p>
@@ -1527,7 +2356,7 @@
     </w:p>
     <w:p>
       <w:pPr>
-        <w:pStyle w:val="Heading2"/>
+        <w:pStyle w:val="Heading1"/>
         <w:bidi w:val="1"/>
         <w:jc w:val="right"/>
       </w:pPr>
@@ -1535,10 +2364,23 @@
         <w:rPr>
           <w:rFonts w:ascii="Segoe UI" w:hAnsi="Segoe UI"/>
           <w:b/>
-          <w:color w:val="1E40AF"/>
-          <w:sz w:val="32"/>
-        </w:rPr>
-        <w:t>איך משתמשים בו?</w:t>
+          <w:color w:val="0E7490"/>
+          <w:sz w:val="40"/>
+        </w:rPr>
+        <w:t>💾 זיכרון התקדמות וטיוטות (ללא צורך בהרשמה או דאטה-בייס)</w:t>
+      </w:r>
+    </w:p>
+    <w:p>
+      <w:pPr>
+        <w:bidi w:val="1"/>
+        <w:jc w:val="right"/>
+      </w:pPr>
+      <w:r>
+        <w:rPr>
+          <w:rFonts w:ascii="Segoe UI" w:hAnsi="Segoe UI"/>
+          <w:color w:val="334155"/>
+        </w:rPr>
+        <w:t>בניגוד למערכות הדורשות רישום מיילים, סיסמאות ובסיסי נתונים כבדים:</w:t>
       </w:r>
     </w:p>
     <w:p>
@@ -1552,7 +2394,6 @@
           <w:rFonts w:ascii="Segoe UI" w:hAnsi="Segoe UI"/>
           <w:color w:val="334155"/>
         </w:rPr>
-        <w:t xml:space="preserve">לוחצים על הכפתור </w:t>
       </w:r>
       <w:r>
         <w:rPr>
@@ -1560,14 +2401,14 @@
           <w:b/>
           <w:color w:val="1E293B"/>
         </w:rPr>
-        <w:t>"⚡ העתק ופתח את Gemini"</w:t>
+        <w:t>פרטיות מלאה:</w:t>
       </w:r>
       <w:r>
         <w:rPr>
           <w:rFonts w:ascii="Segoe UI" w:hAnsi="Segoe UI"/>
           <w:color w:val="334155"/>
         </w:rPr>
-        <w:t>.</w:t>
+        <w:t xml:space="preserve"> כל הנתונים נשמרים מקומית על הדפדפן שלך (`localStorage`). שום מידע אישי לא נשלח לשרת.</w:t>
       </w:r>
     </w:p>
     <w:p>
@@ -1581,7 +2422,21 @@
           <w:rFonts w:ascii="Segoe UI" w:hAnsi="Segoe UI"/>
           <w:color w:val="334155"/>
         </w:rPr>
-        <w:t>נפתח חלון של Gemini בדפדפן, והפרומפט כבר מועתק ללוח שלך.</w:t>
+      </w:r>
+      <w:r>
+        <w:rPr>
+          <w:rFonts w:ascii="Segoe UI" w:hAnsi="Segoe UI"/>
+          <w:b/>
+          <w:color w:val="1E293B"/>
+        </w:rPr>
+        <w:t>השלבים שהושלמו:</w:t>
+      </w:r>
+      <w:r>
+        <w:rPr>
+          <w:rFonts w:ascii="Segoe UI" w:hAnsi="Segoe UI"/>
+          <w:color w:val="334155"/>
+        </w:rPr>
+        <w:t xml:space="preserve"> כל שלב שעברת בהצלחה מסומן ב-V ירוק בסרגל הצד ונשמר לצמיתות בדפדפן.</w:t>
       </w:r>
     </w:p>
     <w:p>
@@ -1595,7 +2450,64 @@
           <w:rFonts w:ascii="Segoe UI" w:hAnsi="Segoe UI"/>
           <w:color w:val="334155"/>
         </w:rPr>
-        <w:t>פשוט לוחצים `Ctrl + V` (הדבק) ו-`Enter` – ומקבלים שיעור פרטי מעמיק ומותאם אישית!</w:t>
+      </w:r>
+      <w:r>
+        <w:rPr>
+          <w:rFonts w:ascii="Segoe UI" w:hAnsi="Segoe UI"/>
+          <w:b/>
+          <w:color w:val="1E293B"/>
+        </w:rPr>
+        <w:t>טיוטת קוד לכל שיעור:</w:t>
+      </w:r>
+      <w:r>
+        <w:rPr>
+          <w:rFonts w:ascii="Segoe UI" w:hAnsi="Segoe UI"/>
+          <w:color w:val="334155"/>
+        </w:rPr>
+        <w:t xml:space="preserve"> המערכת שומרת את הקוד האישי שלך בכל שלב. אם יצאת באמצע פתרון תרגיל, תחזור בדיוק לאותה נקודה.</w:t>
+      </w:r>
+    </w:p>
+    <w:p>
+      <w:pPr>
+        <w:pStyle w:val="ListBullet"/>
+        <w:bidi w:val="1"/>
+        <w:jc w:val="right"/>
+      </w:pPr>
+      <w:r>
+        <w:rPr>
+          <w:rFonts w:ascii="Segoe UI" w:hAnsi="Segoe UI"/>
+          <w:color w:val="334155"/>
+        </w:rPr>
+      </w:r>
+      <w:r>
+        <w:rPr>
+          <w:rFonts w:ascii="Segoe UI" w:hAnsi="Segoe UI"/>
+          <w:b/>
+          <w:color w:val="1E293B"/>
+        </w:rPr>
+        <w:t>איפוס לפי הצורך:</w:t>
+      </w:r>
+      <w:r>
+        <w:rPr>
+          <w:rFonts w:ascii="Segoe UI" w:hAnsi="Segoe UI"/>
+          <w:color w:val="334155"/>
+        </w:rPr>
+        <w:t xml:space="preserve"> אם תרצה להתחיל שיעור מסוים מחדש, כפתור </w:t>
+      </w:r>
+      <w:r>
+        <w:rPr>
+          <w:rFonts w:ascii="Segoe UI" w:hAnsi="Segoe UI"/>
+          <w:b/>
+          <w:color w:val="1E293B"/>
+        </w:rPr>
+        <w:t>"🔄 איפוס קוד"</w:t>
+      </w:r>
+      <w:r>
+        <w:rPr>
+          <w:rFonts w:ascii="Segoe UI" w:hAnsi="Segoe UI"/>
+          <w:color w:val="334155"/>
+        </w:rPr>
+        <w:t xml:space="preserve"> יחזיר את ברירת המחדל של השיעור בלבד בלי לפגוע בהתקדמות הכללית.</w:t>
       </w:r>
     </w:p>
     <w:p>
@@ -3001,7 +3913,7 @@
           <w:b/>
           <w:color w:val="1E293B"/>
         </w:rPr>
-        <w:t>האם ההתקדמות שלי נשמרת אם אסגור את הדפדפן?</w:t>
+        <w:t>האם ההתקדמות והקוד שלי נשמרים אם אסגור את הדפדפן?</w:t>
       </w:r>
       <w:r>
         <w:rPr>
@@ -3027,14 +3939,14 @@
           <w:b/>
           <w:color w:val="0F172A"/>
         </w:rPr>
-        <w:t>כן!</w:t>
+        <w:t>כן, באופן מלא!</w:t>
       </w:r>
       <w:r>
         <w:rPr>
           <w:rFonts w:ascii="Segoe UI" w:hAnsi="Segoe UI"/>
           <w:color w:val="334155"/>
         </w:rPr>
-        <w:t xml:space="preserve"> האפליקציה שומרת את כל השלבים שהשלמת ב-LocalStorage של הדפדפן. בפעם הבאה שתיכנס, תמשיך בדיוק מהמקום שבו עצרת.</w:t>
+        <w:t xml:space="preserve"> האפליקציה שומרת את כל השלבים שהשלמת וטיוטות הקוד שכתבת ב-`localStorage` של הדפדפן. בפעם הבאה שתיכנס, תמשיך בדיוק מהמקום שבו עצרת.</w:t>
       </w:r>
     </w:p>
     <w:p>
@@ -3055,7 +3967,7 @@
           <w:b/>
           <w:color w:val="1E293B"/>
         </w:rPr>
-        <w:t>האם אפשר לחזור לשלבים קודמים?</w:t>
+        <w:t>האם אפשר להשתמש באפליקציה מהטלפון הנייד?</w:t>
       </w:r>
       <w:r>
         <w:rPr>
@@ -3081,14 +3993,14 @@
           <w:b/>
           <w:color w:val="0F172A"/>
         </w:rPr>
-        <w:t>בוודאי!</w:t>
+        <w:t>כן!</w:t>
       </w:r>
       <w:r>
         <w:rPr>
           <w:rFonts w:ascii="Segoe UI" w:hAnsi="Segoe UI"/>
           <w:color w:val="334155"/>
         </w:rPr>
-        <w:t xml:space="preserve"> אפשר ללחוץ על כל שיעור בסרגל הצד בכל רגע כדי לחזור, לרענן את הזיכרון או לנסות פתרון אחר.</w:t>
+        <w:t xml:space="preserve"> האתר מותאם לחלוטין לנייד כולל סרגל לשוניות מותאם, פריסה רספונסיבית וכפתור ייעודי להזחת Tab.</w:t>
       </w:r>
     </w:p>
     <w:p>
@@ -3109,7 +4021,7 @@
           <w:b/>
           <w:color w:val="1E293B"/>
         </w:rPr>
-        <w:t>איך מאפסים את ההתקדמות כדי להתחיל מחדש?</w:t>
+        <w:t>למה יש שני כפתורים שונים ל-Gemini?</w:t>
       </w:r>
       <w:r>
         <w:rPr>
@@ -3120,6 +4032,7 @@
     </w:p>
     <w:p>
       <w:pPr>
+        <w:pStyle w:val="ListBullet"/>
         <w:bidi w:val="1"/>
         <w:jc w:val="right"/>
       </w:pPr>
@@ -3128,7 +4041,145 @@
           <w:rFonts w:ascii="Segoe UI" w:hAnsi="Segoe UI"/>
           <w:color w:val="334155"/>
         </w:rPr>
-        <w:t>בדפדפן: לוחצים F12 -&gt; פותחים Application (או Storage) -&gt; בוחרים Local Storage -&gt; ומוחקים את המפתח `py_bekalut_completed`.</w:t>
+        <w:t xml:space="preserve">כפתור </w:t>
+      </w:r>
+      <w:r>
+        <w:rPr>
+          <w:rFonts w:ascii="Segoe UI" w:hAnsi="Segoe UI"/>
+          <w:b/>
+          <w:color w:val="1E293B"/>
+        </w:rPr>
+        <w:t>"⚡ העתק ופתח ב-Gemini"</w:t>
+      </w:r>
+      <w:r>
+        <w:rPr>
+          <w:rFonts w:ascii="Segoe UI" w:hAnsi="Segoe UI"/>
+          <w:color w:val="334155"/>
+        </w:rPr>
+        <w:t xml:space="preserve"> גם מעתיק את הפרומפט וגם פותח את ג'מיני בדפדפן.</w:t>
+      </w:r>
+    </w:p>
+    <w:p>
+      <w:pPr>
+        <w:pStyle w:val="ListBullet"/>
+        <w:bidi w:val="1"/>
+        <w:jc w:val="right"/>
+      </w:pPr>
+      <w:r>
+        <w:rPr>
+          <w:rFonts w:ascii="Segoe UI" w:hAnsi="Segoe UI"/>
+          <w:color w:val="334155"/>
+        </w:rPr>
+        <w:t xml:space="preserve">כפתור </w:t>
+      </w:r>
+      <w:r>
+        <w:rPr>
+          <w:rFonts w:ascii="Segoe UI" w:hAnsi="Segoe UI"/>
+          <w:b/>
+          <w:color w:val="1E293B"/>
+        </w:rPr>
+        <w:t>"📋 העתק פרומפט"</w:t>
+      </w:r>
+      <w:r>
+        <w:rPr>
+          <w:rFonts w:ascii="Segoe UI" w:hAnsi="Segoe UI"/>
+          <w:color w:val="334155"/>
+        </w:rPr>
+        <w:t xml:space="preserve"> מיועד למי שג'מיני כבר פתוח אצלו במסך מפוצל או בלשונית סמוכה, ורוצה להעתיק את הפרומפט ללוח בלי לפתוח חלונות מיותרים.</w:t>
+      </w:r>
+    </w:p>
+    <w:p>
+      <w:pPr>
+        <w:pStyle w:val="ListBullet"/>
+        <w:bidi w:val="1"/>
+        <w:jc w:val="right"/>
+      </w:pPr>
+      <w:r>
+        <w:rPr>
+          <w:rFonts w:ascii="Segoe UI" w:hAnsi="Segoe UI"/>
+          <w:color w:val="334155"/>
+        </w:rPr>
+      </w:r>
+      <w:r>
+        <w:rPr>
+          <w:rFonts w:ascii="Segoe UI" w:hAnsi="Segoe UI"/>
+          <w:b/>
+          <w:color w:val="1E293B"/>
+        </w:rPr>
+        <w:t>האם אפשר לחזור לשלבים קודמים?</w:t>
+      </w:r>
+      <w:r>
+        <w:rPr>
+          <w:rFonts w:ascii="Segoe UI" w:hAnsi="Segoe UI"/>
+          <w:color w:val="334155"/>
+        </w:rPr>
+      </w:r>
+    </w:p>
+    <w:p>
+      <w:pPr>
+        <w:bidi w:val="1"/>
+        <w:jc w:val="right"/>
+      </w:pPr>
+      <w:r>
+        <w:rPr>
+          <w:rFonts w:ascii="Segoe UI" w:hAnsi="Segoe UI"/>
+          <w:color w:val="334155"/>
+        </w:rPr>
+      </w:r>
+      <w:r>
+        <w:rPr>
+          <w:rFonts w:ascii="Segoe UI" w:hAnsi="Segoe UI"/>
+          <w:b/>
+          <w:color w:val="0F172A"/>
+        </w:rPr>
+        <w:t>בוודאי!</w:t>
+      </w:r>
+      <w:r>
+        <w:rPr>
+          <w:rFonts w:ascii="Segoe UI" w:hAnsi="Segoe UI"/>
+          <w:color w:val="334155"/>
+        </w:rPr>
+        <w:t xml:space="preserve"> אפשר ללחוץ על כל שיעור בסרגל הצד בכל רגע כדי לחזור, לרענן את הזיכרון או לנסות פתרון אחר.</w:t>
+      </w:r>
+    </w:p>
+    <w:p>
+      <w:pPr>
+        <w:pStyle w:val="ListBullet"/>
+        <w:bidi w:val="1"/>
+        <w:jc w:val="right"/>
+      </w:pPr>
+      <w:r>
+        <w:rPr>
+          <w:rFonts w:ascii="Segoe UI" w:hAnsi="Segoe UI"/>
+          <w:color w:val="334155"/>
+        </w:rPr>
+      </w:r>
+      <w:r>
+        <w:rPr>
+          <w:rFonts w:ascii="Segoe UI" w:hAnsi="Segoe UI"/>
+          <w:b/>
+          <w:color w:val="1E293B"/>
+        </w:rPr>
+        <w:t>איך מאפסים את ההתקדמות לחלוטין כדי להתחיל מחדש?</w:t>
+      </w:r>
+      <w:r>
+        <w:rPr>
+          <w:rFonts w:ascii="Segoe UI" w:hAnsi="Segoe UI"/>
+          <w:color w:val="334155"/>
+        </w:rPr>
+      </w:r>
+    </w:p>
+    <w:p>
+      <w:pPr>
+        <w:bidi w:val="1"/>
+        <w:jc w:val="right"/>
+      </w:pPr>
+      <w:r>
+        <w:rPr>
+          <w:rFonts w:ascii="Segoe UI" w:hAnsi="Segoe UI"/>
+          <w:color w:val="334155"/>
+        </w:rPr>
+        <w:t>בדפדפן: לוחצים F12 -&gt; פותחים Application (או Storage) -&gt; בוחרים Local Storage -&gt; ומוחקים את המפתחות שמתחילים ב-`py_bekalut_`.</w:t>
       </w:r>
     </w:p>
     <w:p>

</xml_diff>

<commit_message>
docs & views: update USER_GUIDE, README, docx and lesson_view with common mistakes and new features
</commit_message>
<xml_diff>
--- a/USER_GUIDE.docx
+++ b/USER_GUIDE.docx
@@ -66,14 +66,14 @@
           <w:b/>
           <w:color w:val="0F172A"/>
         </w:rPr>
-        <w:t>פייתון בקלות</w:t>
+        <w:t>פייתון בקלות (PyTeen)</w:t>
       </w:r>
       <w:r>
         <w:rPr>
           <w:rFonts w:ascii="Segoe UI" w:hAnsi="Segoe UI"/>
           <w:color w:val="334155"/>
         </w:rPr>
-        <w:t xml:space="preserve"> היא סביבת למידה אינטראקטיבית, חווייתית וקלילה, שנועדה לקחת אותך צעד אחר צעד – מההדפסה הראשונה של `"שלום פייתון!"` ועד לכתיבת תוכניות מונחות עצמים (OOP), טיפול בשגיאות ופרויקטים מתקדמים.</w:t>
+        <w:t xml:space="preserve"> היא סביבת למידה אינטראקטיבית, חווייתית וקלילה, שנועדה לקחת אותך צעד אחר צעד – מההדפסה הראשונה של `"Hello, Python!"` ועד לכתיבת תוכניות מונחות עצמים (OOP), טיפול בשגיאות ופרויקטים מתקדמים.</w:t>
       </w:r>
     </w:p>
     <w:p>
@@ -86,7 +86,7 @@
           <w:rFonts w:ascii="Segoe UI" w:hAnsi="Segoe UI"/>
           <w:color w:val="334155"/>
         </w:rPr>
-        <w:t xml:space="preserve">האפליקציה פועלת ישירות בדפדפן שלך, ללא צורך בהתקנות מורכבות, ועוצבה במיוחד כדי להעניק לך </w:t>
+        <w:t xml:space="preserve">האפליקציה פועלת ישירות בדפדפן שלך, ללא צורך בהתקנות מורכבות, עם הרצת פייתון מקומית ב-0 מילישניות (WebAssembly), כתיבת קוד תקנית ומדויקת באנגלית, דוגמאות שגיאה נפוצות בכל שלב, ועוצבה במיוחד כדי להעניק לך </w:t>
       </w:r>
       <w:r>
         <w:rPr>
@@ -1413,7 +1413,35 @@
           <w:rFonts w:ascii="Segoe UI" w:hAnsi="Segoe UI"/>
           <w:color w:val="334155"/>
         </w:rPr>
-        <w:t xml:space="preserve"> טיפ מעשי חשוב או הדגשה של טעויות נפוצות.</w:t>
+        <w:t xml:space="preserve"> טיפ מעשי חשוב לכתיבת קוד נכונה ויעילה.</w:t>
+      </w:r>
+    </w:p>
+    <w:p>
+      <w:pPr>
+        <w:pStyle w:val="ListBullet"/>
+        <w:bidi w:val="1"/>
+        <w:jc w:val="right"/>
+      </w:pPr>
+      <w:r>
+        <w:rPr>
+          <w:rFonts w:ascii="Segoe UI" w:hAnsi="Segoe UI"/>
+          <w:color w:val="334155"/>
+        </w:rPr>
+      </w:r>
+      <w:r>
+        <w:rPr>
+          <w:rFonts w:ascii="Segoe UI" w:hAnsi="Segoe UI"/>
+          <w:b/>
+          <w:color w:val="1E293B"/>
+        </w:rPr>
+        <w:t>⚠️ דוגמאות שגיאה וטעויות נפוצות:</w:t>
+      </w:r>
+      <w:r>
+        <w:rPr>
+          <w:rFonts w:ascii="Segoe UI" w:hAnsi="Segoe UI"/>
+          <w:color w:val="334155"/>
+        </w:rPr>
+        <w:t xml:space="preserve"> כרטיסייה ייעודית בכל שלב המציגה ממה להיזהר, שגיאות נפוצות שמתחילים עושים (כמו SyntaxError, IndentationError, NameError, מירכאות לא תואמות, שכחת נקודתיים וכו') ואיך להימנע מהן.</w:t>
       </w:r>
     </w:p>
     <w:p>
@@ -4208,6 +4236,45 @@
         </w:rPr>
       </w:r>
     </w:p>
+    <w:p>
+      <w:pPr>
+        <w:bidi w:val="1"/>
+        <w:jc w:val="right"/>
+      </w:pPr>
+      <w:r>
+        <w:rPr>
+          <w:rFonts w:ascii="Segoe UI" w:hAnsi="Segoe UI"/>
+          <w:color w:val="334155"/>
+        </w:rPr>
+        <w:t>&lt;div align="center"&gt;</w:t>
+      </w:r>
+    </w:p>
+    <w:p>
+      <w:pPr>
+        <w:bidi w:val="1"/>
+        <w:jc w:val="right"/>
+      </w:pPr>
+      <w:r>
+        <w:rPr>
+          <w:rFonts w:ascii="Segoe UI" w:hAnsi="Segoe UI"/>
+          <w:color w:val="334155"/>
+        </w:rPr>
+        <w:t>&lt;sub&gt;כל הזכויות שמורות למשפחת ברעם ©&lt;/sub&gt;</w:t>
+      </w:r>
+    </w:p>
+    <w:p>
+      <w:pPr>
+        <w:bidi w:val="1"/>
+        <w:jc w:val="right"/>
+      </w:pPr>
+      <w:r>
+        <w:rPr>
+          <w:rFonts w:ascii="Segoe UI" w:hAnsi="Segoe UI"/>
+          <w:color w:val="334155"/>
+        </w:rPr>
+        <w:t>&lt;/div&gt;</w:t>
+      </w:r>
+    </w:p>
     <w:sectPr>
       <w:pgSz w:w="12240" w:h="15840"/>
       <w:pgMar w:top="1152" w:right="1152" w:bottom="1152" w:left="1152" w:header="720" w:footer="720" w:gutter="0"/>

</xml_diff>

<commit_message>
feat: expand curriculum to 60 lessons with Data Science and Machine Learning track (NumPy, Pandas, Scikit-learn)
</commit_message>
<xml_diff>
--- a/USER_GUIDE.docx
+++ b/USER_GUIDE.docx
@@ -4,4280 +4,1597 @@
   <w:body>
     <w:p>
       <w:pPr>
-        <w:bidi w:val="1"/>
-        <w:jc w:val="center"/>
+        <w:pStyle w:val="Heading1"/>
+        <w:bidi/>
       </w:pPr>
       <w:r>
-        <w:rPr>
-          <w:rFonts w:ascii="Segoe UI" w:hAnsi="Segoe UI"/>
-          <w:b/>
-          <w:color w:val="0F172A"/>
-          <w:sz w:val="48"/>
-        </w:rPr>
-        <w:t>📘 מדריך למשתמש – פייתון בקלות</w:t>
+        <w:t>📘 מדריך למשתמש – פייתון בקלות (PyTeen)</w:t>
       </w:r>
     </w:p>
     <w:p>
       <w:pPr>
-        <w:bidi w:val="1"/>
-        <w:jc w:val="center"/>
+        <w:bidi/>
       </w:pPr>
       <w:r>
-        <w:rPr>
-          <w:rFonts w:ascii="Segoe UI" w:hAnsi="Segoe UI"/>
-          <w:i/>
-          <w:color w:val="64748B"/>
-          <w:sz w:val="26"/>
-        </w:rPr>
-        <w:t>המדריך המלא לשימוש באפליקציה, ניצול כל הפיצ'רים וטיפים מעשיים להצלחה והתמדה</w:t>
+        <w:t>&gt; **ברוך הבא למסע שלך בעולם התכנות! המדריך המלא לשימוש באפליקציה, ניצול כל הפיצ'רים וטיפים מעשיים להצלחה והתמדה.**</w:t>
       </w:r>
     </w:p>
-    <w:p/>
     <w:p>
       <w:pPr>
-        <w:pStyle w:val="Heading1"/>
-        <w:bidi w:val="1"/>
-        <w:jc w:val="right"/>
+        <w:bidi/>
       </w:pPr>
       <w:r>
-        <w:rPr>
-          <w:rFonts w:ascii="Segoe UI" w:hAnsi="Segoe UI"/>
-          <w:b/>
-          <w:color w:val="0E7490"/>
-          <w:sz w:val="40"/>
-        </w:rPr>
+        <w:t>---</w:t>
+      </w:r>
+    </w:p>
+    <w:p>
+      <w:pPr>
+        <w:pStyle w:val="Heading2"/>
+        <w:bidi/>
+      </w:pPr>
+      <w:r>
         <w:t>🎯 אודות האפליקציה: פייתון בקלות</w:t>
       </w:r>
     </w:p>
     <w:p>
       <w:pPr>
-        <w:bidi w:val="1"/>
-        <w:jc w:val="right"/>
+        <w:bidi/>
       </w:pPr>
       <w:r>
-        <w:rPr>
-          <w:rFonts w:ascii="Segoe UI" w:hAnsi="Segoe UI"/>
-          <w:color w:val="334155"/>
-        </w:rPr>
-      </w:r>
-      <w:r>
-        <w:rPr>
-          <w:rFonts w:ascii="Segoe UI" w:hAnsi="Segoe UI"/>
-          <w:b/>
-          <w:color w:val="0F172A"/>
-        </w:rPr>
-        <w:t>פייתון בקלות (PyTeen)</w:t>
-      </w:r>
-      <w:r>
-        <w:rPr>
-          <w:rFonts w:ascii="Segoe UI" w:hAnsi="Segoe UI"/>
-          <w:color w:val="334155"/>
-        </w:rPr>
-        <w:t xml:space="preserve"> היא סביבת למידה אינטראקטיבית, חווייתית וקלילה, שנועדה לקחת אותך צעד אחר צעד – מההדפסה הראשונה של `"Hello, Python!"` ועד לכתיבת תוכניות מונחות עצמים (OOP), טיפול בשגיאות ופרויקטים מתקדמים.</w:t>
+        <w:t>**פייתון בקלות (PyTeen)** היא סביבת למידה אינטראקטיבית, חווייתית וקלילה, שנועדה לקחת אותך צעד אחר צעד – מההדפסה הראשונה של `"Hello, Python!"` ועד לכתיבת תוכניות מונחות עצמים (OOP), טיפול בשגיאות, עיבוד נתונים ב-NumPy ו-Pandas, ולמידת מכונה ו-AI עם Scikit-learn.</w:t>
       </w:r>
     </w:p>
     <w:p>
       <w:pPr>
-        <w:bidi w:val="1"/>
-        <w:jc w:val="right"/>
+        <w:bidi/>
       </w:pPr>
       <w:r>
-        <w:rPr>
-          <w:rFonts w:ascii="Segoe UI" w:hAnsi="Segoe UI"/>
-          <w:color w:val="334155"/>
-        </w:rPr>
-        <w:t xml:space="preserve">האפליקציה פועלת ישירות בדפדפן שלך, ללא צורך בהתקנות מורכבות, עם הרצת פייתון מקומית ב-0 מילישניות (WebAssembly), כתיבת קוד תקנית ומדויקת באנגלית, דוגמאות שגיאה נפוצות בכל שלב, ועוצבה במיוחד כדי להעניק לך </w:t>
-      </w:r>
-      <w:r>
-        <w:rPr>
-          <w:rFonts w:ascii="Segoe UI" w:hAnsi="Segoe UI"/>
-          <w:b/>
-          <w:color w:val="0F172A"/>
-        </w:rPr>
-        <w:t>ביטחון, הבנה מעמיקה ותחושת הצלחה מתמדת</w:t>
-      </w:r>
-      <w:r>
-        <w:rPr>
-          <w:rFonts w:ascii="Segoe UI" w:hAnsi="Segoe UI"/>
-          <w:color w:val="334155"/>
-        </w:rPr>
-        <w:t>.</w:t>
+        <w:t>האפליקציה פועלת ישירות בדפדפן שלך, ללא צורך בהתקנות מורכבות, עם הרצת פייתון מקומית ב-0 מילישניות (WebAssembly), כתיבת קוד תקנית ומדויקת באנגלית, דוגמאות שגיאה נפוצות בכל שלב, ועוצבה במיוחד כדי להעניק לך **ביטחון, הבנה מעמיקה ותחושת הצלחה מתמדת**.</w:t>
       </w:r>
     </w:p>
     <w:p>
       <w:pPr>
-        <w:pStyle w:val="Heading1"/>
-        <w:bidi w:val="1"/>
-        <w:jc w:val="right"/>
+        <w:bidi/>
       </w:pPr>
       <w:r>
-        <w:rPr>
-          <w:rFonts w:ascii="Segoe UI" w:hAnsi="Segoe UI"/>
-          <w:b/>
-          <w:color w:val="0E7490"/>
-          <w:sz w:val="40"/>
-        </w:rPr>
+        <w:t>---</w:t>
+      </w:r>
+    </w:p>
+    <w:p>
+      <w:pPr>
+        <w:pStyle w:val="Heading2"/>
+        <w:bidi/>
+      </w:pPr>
+      <w:r>
         <w:t>🚀 איך מפעילים ומתחילים?</w:t>
       </w:r>
     </w:p>
     <w:p>
       <w:pPr>
-        <w:pStyle w:val="Heading2"/>
-        <w:bidi w:val="1"/>
-        <w:jc w:val="right"/>
+        <w:pStyle w:val="Heading3"/>
+        <w:bidi/>
       </w:pPr>
       <w:r>
-        <w:rPr>
-          <w:rFonts w:ascii="Segoe UI" w:hAnsi="Segoe UI"/>
-          <w:b/>
-          <w:color w:val="1E40AF"/>
-          <w:sz w:val="32"/>
-        </w:rPr>
         <w:t>אפשרות 1: גלישה ישירה בענן (מומלץ לכל מכשיר – מחשב, טאבלט, סמארטפון)</w:t>
       </w:r>
     </w:p>
     <w:p>
       <w:pPr>
-        <w:bidi w:val="1"/>
-        <w:jc w:val="right"/>
+        <w:bidi/>
       </w:pPr>
       <w:r>
-        <w:rPr>
-          <w:rFonts w:ascii="Segoe UI" w:hAnsi="Segoe UI"/>
-          <w:color w:val="334155"/>
-        </w:rPr>
         <w:t>האפליקציה נפרסה לענן וזמינה אונליין ללא צורך בהתקנה כלל:</w:t>
       </w:r>
     </w:p>
     <w:p>
       <w:pPr>
-        <w:bidi w:val="1"/>
-        <w:jc w:val="right"/>
+        <w:bidi/>
       </w:pPr>
       <w:r>
-        <w:rPr>
-          <w:rFonts w:ascii="Segoe UI" w:hAnsi="Segoe UI"/>
-          <w:color w:val="334155"/>
-        </w:rPr>
-        <w:t xml:space="preserve">👉 </w:t>
-      </w:r>
-      <w:r>
-        <w:rPr>
-          <w:rFonts w:ascii="Segoe UI" w:hAnsi="Segoe UI"/>
-          <w:b/>
-          <w:color w:val="0F172A"/>
-        </w:rPr>
-        <w:t>https://pyteen.onrender.com/</w:t>
-      </w:r>
-      <w:r>
-        <w:rPr>
-          <w:rFonts w:ascii="Segoe UI" w:hAnsi="Segoe UI"/>
-          <w:color w:val="334155"/>
-        </w:rPr>
+        <w:t>👉 **https://pyteen.onrender.com/**</w:t>
       </w:r>
     </w:p>
     <w:p>
       <w:pPr>
-        <w:bidi w:val="1"/>
-        <w:jc w:val="right"/>
+        <w:bidi/>
       </w:pPr>
       <w:r>
-        <w:rPr>
-          <w:rFonts w:ascii="Segoe UI" w:hAnsi="Segoe UI"/>
-          <w:color w:val="334155"/>
-        </w:rPr>
         <w:t>פשוט פותחים את הקישור מכל דפדפן ומתחילים ללמוד מיד!</w:t>
       </w:r>
     </w:p>
     <w:p>
       <w:pPr>
-        <w:pStyle w:val="Heading2"/>
-        <w:bidi w:val="1"/>
-        <w:jc w:val="right"/>
+        <w:pStyle w:val="Heading3"/>
+        <w:bidi/>
       </w:pPr>
       <w:r>
-        <w:rPr>
-          <w:rFonts w:ascii="Segoe UI" w:hAnsi="Segoe UI"/>
-          <w:b/>
-          <w:color w:val="1E40AF"/>
-          <w:sz w:val="32"/>
-        </w:rPr>
         <w:t>אפשרות 2: הפעלה מקומית על המחשב (Windows)</w:t>
       </w:r>
     </w:p>
     <w:p>
       <w:pPr>
-        <w:pStyle w:val="ListNumber"/>
-        <w:bidi w:val="1"/>
-        <w:jc w:val="right"/>
+        <w:bidi/>
       </w:pPr>
       <w:r>
-        <w:rPr>
-          <w:rFonts w:ascii="Segoe UI" w:hAnsi="Segoe UI"/>
-          <w:color w:val="334155"/>
-        </w:rPr>
-        <w:t>מורידים את תיקיית הפרויקט למחשב.</w:t>
+        <w:t>1. מורידים את תיקיית הפרויקט למחשב.</w:t>
       </w:r>
     </w:p>
     <w:p>
       <w:pPr>
-        <w:pStyle w:val="ListNumber"/>
-        <w:bidi w:val="1"/>
-        <w:jc w:val="right"/>
+        <w:bidi/>
       </w:pPr>
       <w:r>
-        <w:rPr>
-          <w:rFonts w:ascii="Segoe UI" w:hAnsi="Segoe UI"/>
-          <w:color w:val="334155"/>
-        </w:rPr>
-        <w:t>לוחצים פעמיים על הקובץ `run_app.bat`.</w:t>
+        <w:t>2. לוחצים פעמיים על הקובץ `run_app.bat`.</w:t>
       </w:r>
     </w:p>
     <w:p>
       <w:pPr>
-        <w:pStyle w:val="ListNumber"/>
-        <w:bidi w:val="1"/>
-        <w:jc w:val="right"/>
+        <w:bidi/>
       </w:pPr>
       <w:r>
-        <w:rPr>
-          <w:rFonts w:ascii="Segoe UI" w:hAnsi="Segoe UI"/>
-          <w:color w:val="334155"/>
-        </w:rPr>
-        <w:t>האפליקציה תופעל אוטומטית והדפדפן ייפתח בכתובת:</w:t>
+        <w:t>3. האפליקציה תופעל אוטומטית והדפדפן ייפתח בכתובת:</w:t>
       </w:r>
     </w:p>
     <w:p>
       <w:pPr>
-        <w:bidi w:val="1"/>
-        <w:jc w:val="right"/>
+        <w:bidi/>
       </w:pPr>
       <w:r>
-        <w:rPr>
-          <w:rFonts w:ascii="Segoe UI" w:hAnsi="Segoe UI"/>
-          <w:color w:val="334155"/>
-        </w:rPr>
-        <w:t xml:space="preserve">👉 </w:t>
-      </w:r>
-      <w:r>
-        <w:rPr>
-          <w:rFonts w:ascii="Segoe UI" w:hAnsi="Segoe UI"/>
-          <w:b/>
-          <w:color w:val="0F172A"/>
-        </w:rPr>
-        <w:t>http://localhost:8080</w:t>
-      </w:r>
-      <w:r>
-        <w:rPr>
-          <w:rFonts w:ascii="Segoe UI" w:hAnsi="Segoe UI"/>
-          <w:color w:val="334155"/>
-        </w:rPr>
+        <w:t>👉 **http://localhost:8080**</w:t>
       </w:r>
     </w:p>
     <w:p>
       <w:pPr>
-        <w:pStyle w:val="Heading2"/>
-        <w:bidi w:val="1"/>
-        <w:jc w:val="right"/>
+        <w:pStyle w:val="Heading3"/>
+        <w:bidi/>
       </w:pPr>
       <w:r>
-        <w:rPr>
-          <w:rFonts w:ascii="Segoe UI" w:hAnsi="Segoe UI"/>
-          <w:b/>
-          <w:color w:val="1E40AF"/>
-          <w:sz w:val="32"/>
-        </w:rPr>
         <w:t>מסך הפתיחה</w:t>
       </w:r>
     </w:p>
     <w:p>
       <w:pPr>
-        <w:bidi w:val="1"/>
-        <w:jc w:val="right"/>
+        <w:bidi/>
       </w:pPr>
       <w:r>
-        <w:rPr>
-          <w:rFonts w:ascii="Segoe UI" w:hAnsi="Segoe UI"/>
-          <w:color w:val="334155"/>
-        </w:rPr>
-        <w:t>בדף הבית תראה סקירה של מסלול הלימוד (42 שלבים ב-14 פרקים), לצד מונה התקדמות דינמי.</w:t>
+        <w:t>בדף הבית תראה סקירה של מסלול הלימוד (60 שלבים ב-18 פרקים), לצד מונה התקדמות דינמי.</w:t>
       </w:r>
     </w:p>
     <w:p>
       <w:pPr>
         <w:pStyle w:val="ListBullet"/>
-        <w:bidi w:val="1"/>
-        <w:jc w:val="right"/>
+        <w:bidi/>
       </w:pPr>
       <w:r>
-        <w:rPr>
-          <w:rFonts w:ascii="Segoe UI" w:hAnsi="Segoe UI"/>
-          <w:color w:val="334155"/>
-        </w:rPr>
-        <w:t xml:space="preserve">אם זו הפעם הראשונה שלך – לחץ על </w:t>
-      </w:r>
-      <w:r>
-        <w:rPr>
-          <w:rFonts w:ascii="Segoe UI" w:hAnsi="Segoe UI"/>
-          <w:b/>
-          <w:color w:val="1E293B"/>
-        </w:rPr>
-        <w:t>"🚀 התחל ללמוד עכשיו"</w:t>
-      </w:r>
-      <w:r>
-        <w:rPr>
-          <w:rFonts w:ascii="Segoe UI" w:hAnsi="Segoe UI"/>
-          <w:color w:val="334155"/>
-        </w:rPr>
-        <w:t>.</w:t>
+        <w:t>אם זו הפעם הראשונה שלך – לחץ על **"🚀 התחל ללמוד עכשיו"**.</w:t>
       </w:r>
     </w:p>
     <w:p>
       <w:pPr>
         <w:pStyle w:val="ListBullet"/>
-        <w:bidi w:val="1"/>
-        <w:jc w:val="right"/>
+        <w:bidi/>
       </w:pPr>
       <w:r>
-        <w:rPr>
-          <w:rFonts w:ascii="Segoe UI" w:hAnsi="Segoe UI"/>
-          <w:color w:val="334155"/>
-        </w:rPr>
-        <w:t xml:space="preserve">אם כבר למדת בעבר – המערכת תזהה אותך ותציג כפתור חכם: </w:t>
-      </w:r>
-      <w:r>
-        <w:rPr>
-          <w:rFonts w:ascii="Segoe UI" w:hAnsi="Segoe UI"/>
-          <w:b/>
-          <w:color w:val="1E293B"/>
-        </w:rPr>
-        <w:t>"🚀 המשך מאיפה שהפסקת (שלב X)"</w:t>
-      </w:r>
-      <w:r>
-        <w:rPr>
-          <w:rFonts w:ascii="Segoe UI" w:hAnsi="Segoe UI"/>
-          <w:color w:val="334155"/>
-        </w:rPr>
-        <w:t xml:space="preserve"> שייקח אותך ישר לשיעור האחרון!</w:t>
+        <w:t>אם כבר למדת בעבר – המערכת תזהה אותך ותציג כפתור חכם: **"🚀 המשך מאיפה שהפסקת (שלב X)"** שייקח אותך ישר לשיעור האחרון!</w:t>
       </w:r>
     </w:p>
     <w:p>
       <w:pPr>
-        <w:pStyle w:val="Heading1"/>
-        <w:bidi w:val="1"/>
-        <w:jc w:val="right"/>
+        <w:bidi/>
       </w:pPr>
       <w:r>
-        <w:rPr>
-          <w:rFonts w:ascii="Segoe UI" w:hAnsi="Segoe UI"/>
-          <w:b/>
-          <w:color w:val="0E7490"/>
-          <w:sz w:val="40"/>
-        </w:rPr>
+        <w:t>---</w:t>
+      </w:r>
+    </w:p>
+    <w:p>
+      <w:pPr>
+        <w:pStyle w:val="Heading2"/>
+        <w:bidi/>
+      </w:pPr>
+      <w:r>
         <w:t>🌓 מצבי תצוגה – לילה כהה או יום בהיר (Dark &amp; Light Modes)</w:t>
       </w:r>
     </w:p>
     <w:p>
       <w:pPr>
-        <w:bidi w:val="1"/>
-        <w:jc w:val="right"/>
+        <w:bidi/>
       </w:pPr>
       <w:r>
-        <w:rPr>
-          <w:rFonts w:ascii="Segoe UI" w:hAnsi="Segoe UI"/>
-          <w:color w:val="334155"/>
-        </w:rPr>
         <w:t>האפליקציה כוללת מערכת ערכות נושא (Themes) מלאה:</w:t>
       </w:r>
     </w:p>
     <w:p>
       <w:pPr>
         <w:pStyle w:val="ListBullet"/>
-        <w:bidi w:val="1"/>
-        <w:jc w:val="right"/>
+        <w:bidi/>
       </w:pPr>
       <w:r>
-        <w:rPr>
-          <w:rFonts w:ascii="Segoe UI" w:hAnsi="Segoe UI"/>
-          <w:color w:val="334155"/>
-        </w:rPr>
-      </w:r>
-      <w:r>
-        <w:rPr>
-          <w:rFonts w:ascii="Segoe UI" w:hAnsi="Segoe UI"/>
-          <w:b/>
-          <w:color w:val="1E293B"/>
-        </w:rPr>
-        <w:t>🌙 מצב לילה (Dark Mode):</w:t>
-      </w:r>
-      <w:r>
-        <w:rPr>
-          <w:rFonts w:ascii="Segoe UI" w:hAnsi="Segoe UI"/>
-          <w:color w:val="334155"/>
-        </w:rPr>
-        <w:t xml:space="preserve"> עיצוב יוקרתי בגווני כחול-עמוק וגרפיט, המקל על העיניים בעת למידה ממושכת או בשעות הערב.</w:t>
+        <w:t>**🌙 מצב לילה (Dark Mode):** עיצוב יוקרתי בגווני כחול-עמוק וגרפיט, המקל על העיניים בעת למידה ממושכת או בשעות הערב.</w:t>
       </w:r>
     </w:p>
     <w:p>
       <w:pPr>
         <w:pStyle w:val="ListBullet"/>
-        <w:bidi w:val="1"/>
-        <w:jc w:val="right"/>
+        <w:bidi/>
       </w:pPr>
       <w:r>
-        <w:rPr>
-          <w:rFonts w:ascii="Segoe UI" w:hAnsi="Segoe UI"/>
-          <w:color w:val="334155"/>
-        </w:rPr>
-      </w:r>
-      <w:r>
-        <w:rPr>
-          <w:rFonts w:ascii="Segoe UI" w:hAnsi="Segoe UI"/>
-          <w:b/>
-          <w:color w:val="1E293B"/>
-        </w:rPr>
-        <w:t>☀️ מצב יום (Light Mode):</w:t>
-      </w:r>
-      <w:r>
-        <w:rPr>
-          <w:rFonts w:ascii="Segoe UI" w:hAnsi="Segoe UI"/>
-          <w:color w:val="334155"/>
-        </w:rPr>
-        <w:t xml:space="preserve"> עיצוב נקי ובהיר עם ניגודיות גבוהה, מושלם לקריאה באור יום מלא או בכיתת לימוד.</w:t>
+        <w:t>**☀️ מצב יום (Light Mode):** עיצוב נקי ובהיר עם ניגודיות גבוהה, מושלם לקריאה באור יום מלא או בכיתת לימוד.</w:t>
       </w:r>
     </w:p>
     <w:p>
       <w:pPr>
-        <w:pStyle w:val="Heading2"/>
-        <w:bidi w:val="1"/>
-        <w:jc w:val="right"/>
+        <w:pStyle w:val="Heading3"/>
+        <w:bidi/>
       </w:pPr>
       <w:r>
-        <w:rPr>
-          <w:rFonts w:ascii="Segoe UI" w:hAnsi="Segoe UI"/>
-          <w:b/>
-          <w:color w:val="1E40AF"/>
-          <w:sz w:val="32"/>
-        </w:rPr>
         <w:t>איך מחליפים מצב?</w:t>
       </w:r>
     </w:p>
     <w:p>
       <w:pPr>
-        <w:bidi w:val="1"/>
-        <w:jc w:val="right"/>
+        <w:bidi/>
       </w:pPr>
       <w:r>
-        <w:rPr>
-          <w:rFonts w:ascii="Segoe UI" w:hAnsi="Segoe UI"/>
-          <w:color w:val="334155"/>
-        </w:rPr>
-        <w:t xml:space="preserve">בסרגל העליון (Header) מצד שמאל מופיע כפתור </w:t>
-      </w:r>
-      <w:r>
-        <w:rPr>
-          <w:rFonts w:ascii="Segoe UI" w:hAnsi="Segoe UI"/>
-          <w:b/>
-          <w:color w:val="0F172A"/>
-        </w:rPr>
-        <w:t>"🌙 לילה כהה"</w:t>
-      </w:r>
-      <w:r>
-        <w:rPr>
-          <w:rFonts w:ascii="Segoe UI" w:hAnsi="Segoe UI"/>
-          <w:color w:val="334155"/>
-        </w:rPr>
-        <w:t xml:space="preserve"> / </w:t>
-      </w:r>
-      <w:r>
-        <w:rPr>
-          <w:rFonts w:ascii="Segoe UI" w:hAnsi="Segoe UI"/>
-          <w:b/>
-          <w:color w:val="0F172A"/>
-        </w:rPr>
-        <w:t>"☀️ יום בהיר"</w:t>
-      </w:r>
-      <w:r>
-        <w:rPr>
-          <w:rFonts w:ascii="Segoe UI" w:hAnsi="Segoe UI"/>
-          <w:color w:val="334155"/>
-        </w:rPr>
-        <w:t>. לחיצה אחת מחליפה את התצוגה באופן מיידי בכל חלקי האתר.</w:t>
+        <w:t>בסרגל העליון (Header) מצד שמאל מופיע כפתור **"🌙 לילה כהה"** / **"☀️ יום בהיר"**. לחיצה אחת מחליפה את התצוגה באופן מיידי בכל חלקי האתר.</w:t>
       </w:r>
     </w:p>
     <w:p>
       <w:pPr>
         <w:pStyle w:val="ListBullet"/>
-        <w:bidi w:val="1"/>
-        <w:jc w:val="right"/>
+        <w:bidi/>
       </w:pPr>
       <w:r>
-        <w:rPr>
-          <w:rFonts w:ascii="Segoe UI" w:hAnsi="Segoe UI"/>
-          <w:color w:val="334155"/>
-        </w:rPr>
-      </w:r>
-      <w:r>
-        <w:rPr>
-          <w:rFonts w:ascii="Segoe UI" w:hAnsi="Segoe UI"/>
-          <w:b/>
-          <w:color w:val="1E293B"/>
-        </w:rPr>
-        <w:t>שמירה אוטומטית:</w:t>
-      </w:r>
-      <w:r>
-        <w:rPr>
-          <w:rFonts w:ascii="Segoe UI" w:hAnsi="Segoe UI"/>
-          <w:color w:val="334155"/>
-        </w:rPr>
-        <w:t xml:space="preserve"> בחירתך נשמרת בדפדפן (`localStorage`), כך שבכל כניסה עתידית האתר יופיע בדיוק במצב המועדף עליך.</w:t>
+        <w:t>**שמירה אוטומטית:** בחירתך נשמרת בדפדפן (`localStorage`), כך שבכל כניסה עתידית האתר יופיע בדיוק במצב המועדף עליך.</w:t>
       </w:r>
     </w:p>
     <w:p>
       <w:pPr>
         <w:pStyle w:val="ListBullet"/>
-        <w:bidi w:val="1"/>
-        <w:jc w:val="right"/>
+        <w:bidi/>
       </w:pPr>
       <w:r>
-        <w:rPr>
-          <w:rFonts w:ascii="Segoe UI" w:hAnsi="Segoe UI"/>
-          <w:color w:val="334155"/>
-        </w:rPr>
-      </w:r>
-      <w:r>
-        <w:rPr>
-          <w:rFonts w:ascii="Segoe UI" w:hAnsi="Segoe UI"/>
-          <w:b/>
-          <w:color w:val="1E293B"/>
-        </w:rPr>
-        <w:t>זיהוי ברירת מחדל של המכשיר:</w:t>
-      </w:r>
-      <w:r>
-        <w:rPr>
-          <w:rFonts w:ascii="Segoe UI" w:hAnsi="Segoe UI"/>
-          <w:color w:val="334155"/>
-        </w:rPr>
-        <w:t xml:space="preserve"> בכניסה הראשונה, המערכת מזהה אוטומטית האם מערכת ההפעלה שלך מוגדרת למצב כהה או בהיר ומתאימה את עצמה.</w:t>
+        <w:t>**זיהוי ברירת מחדל של המכשיר:** בכניסה הראשונה, המערכת מזהה אוטומטית האם מערכת ההפעלה שלך מוגדרת למצב כהה או בהיר ומתאימה את עצמה.</w:t>
       </w:r>
     </w:p>
     <w:p>
       <w:pPr>
-        <w:pStyle w:val="Heading1"/>
-        <w:bidi w:val="1"/>
-        <w:jc w:val="right"/>
+        <w:bidi/>
       </w:pPr>
       <w:r>
-        <w:rPr>
-          <w:rFonts w:ascii="Segoe UI" w:hAnsi="Segoe UI"/>
-          <w:b/>
-          <w:color w:val="0E7490"/>
-          <w:sz w:val="40"/>
-        </w:rPr>
+        <w:t>---</w:t>
+      </w:r>
+    </w:p>
+    <w:p>
+      <w:pPr>
+        <w:pStyle w:val="Heading2"/>
+        <w:bidi/>
+      </w:pPr>
+      <w:r>
         <w:t>📱 חוויית שימוש מותאמת לנייד ולטאבלט (Mobile &amp; Tablet)</w:t>
       </w:r>
     </w:p>
     <w:p>
       <w:pPr>
-        <w:bidi w:val="1"/>
-        <w:jc w:val="right"/>
+        <w:bidi/>
       </w:pPr>
       <w:r>
-        <w:rPr>
-          <w:rFonts w:ascii="Segoe UI" w:hAnsi="Segoe UI"/>
-          <w:color w:val="334155"/>
-        </w:rPr>
         <w:t>"פייתון בקלות" מותאמת באופן מלא למסכי מגע, סמארטפונים וטאבלטים:</w:t>
       </w:r>
     </w:p>
     <w:p>
       <w:pPr>
-        <w:pStyle w:val="ListNumber"/>
-        <w:bidi w:val="1"/>
-        <w:jc w:val="right"/>
+        <w:bidi/>
       </w:pPr>
       <w:r>
-        <w:rPr>
-          <w:rFonts w:ascii="Segoe UI" w:hAnsi="Segoe UI"/>
-          <w:color w:val="334155"/>
-        </w:rPr>
-      </w:r>
-      <w:r>
-        <w:rPr>
-          <w:rFonts w:ascii="Segoe UI" w:hAnsi="Segoe UI"/>
-          <w:b/>
-          <w:color w:val="1E293B"/>
-        </w:rPr>
-        <w:t>סרגל ניווט תחתון/עליון ייעודי:</w:t>
-      </w:r>
-      <w:r>
-        <w:rPr>
-          <w:rFonts w:ascii="Segoe UI" w:hAnsi="Segoe UI"/>
-          <w:color w:val="334155"/>
-        </w:rPr>
+        <w:t>1. **סרגל ניווט תחתון/עליון ייעודי:**</w:t>
       </w:r>
     </w:p>
     <w:p>
       <w:pPr>
-        <w:bidi w:val="1"/>
-        <w:jc w:val="right"/>
+        <w:bidi/>
       </w:pPr>
       <w:r>
-        <w:rPr>
-          <w:rFonts w:ascii="Segoe UI" w:hAnsi="Segoe UI"/>
-          <w:color w:val="334155"/>
-        </w:rPr>
         <w:t>במסכים צרים מופיע תפריט לשוניות נוח למעבר מהיר:</w:t>
       </w:r>
     </w:p>
     <w:p>
       <w:pPr>
         <w:pStyle w:val="ListBullet"/>
-        <w:bidi w:val="1"/>
-        <w:jc w:val="right"/>
+        <w:bidi/>
       </w:pPr>
       <w:r>
-        <w:rPr>
-          <w:rFonts w:ascii="Segoe UI" w:hAnsi="Segoe UI"/>
-          <w:color w:val="334155"/>
-        </w:rPr>
-      </w:r>
-      <w:r>
-        <w:rPr>
-          <w:rFonts w:ascii="Segoe UI" w:hAnsi="Segoe UI"/>
-          <w:b/>
-          <w:color w:val="1E293B"/>
-        </w:rPr>
-        <w:t>`📖 תוכן השיעור`</w:t>
-      </w:r>
-      <w:r>
-        <w:rPr>
-          <w:rFonts w:ascii="Segoe UI" w:hAnsi="Segoe UI"/>
-          <w:color w:val="334155"/>
-        </w:rPr>
-        <w:t xml:space="preserve"> – קריאת ההסבר, הטיפים והתמונה הגדולה.</w:t>
+        <w:t>**`📖 תוכן השיעור`** – קריאת ההסבר, הטיפים והתמונה הגדולה.</w:t>
       </w:r>
     </w:p>
     <w:p>
       <w:pPr>
         <w:pStyle w:val="ListBullet"/>
-        <w:bidi w:val="1"/>
-        <w:jc w:val="right"/>
+        <w:bidi/>
       </w:pPr>
       <w:r>
-        <w:rPr>
-          <w:rFonts w:ascii="Segoe UI" w:hAnsi="Segoe UI"/>
-          <w:color w:val="334155"/>
-        </w:rPr>
-      </w:r>
-      <w:r>
-        <w:rPr>
-          <w:rFonts w:ascii="Segoe UI" w:hAnsi="Segoe UI"/>
-          <w:b/>
-          <w:color w:val="1E293B"/>
-        </w:rPr>
-        <w:t>`💻 עורך והרצה`</w:t>
-      </w:r>
-      <w:r>
-        <w:rPr>
-          <w:rFonts w:ascii="Segoe UI" w:hAnsi="Segoe UI"/>
-          <w:color w:val="334155"/>
-        </w:rPr>
-        <w:t xml:space="preserve"> – כתיבת הקוד והפעלתו.</w:t>
+        <w:t>**`💻 עורך והרצה`** – כתיבת הקוד והפעלתו.</w:t>
       </w:r>
     </w:p>
     <w:p>
       <w:pPr>
         <w:pStyle w:val="ListBullet"/>
-        <w:bidi w:val="1"/>
-        <w:jc w:val="right"/>
+        <w:bidi/>
       </w:pPr>
       <w:r>
-        <w:rPr>
-          <w:rFonts w:ascii="Segoe UI" w:hAnsi="Segoe UI"/>
-          <w:color w:val="334155"/>
-        </w:rPr>
-      </w:r>
-      <w:r>
-        <w:rPr>
-          <w:rFonts w:ascii="Segoe UI" w:hAnsi="Segoe UI"/>
-          <w:b/>
-          <w:color w:val="1E293B"/>
-        </w:rPr>
-        <w:t>`📚 רשימת שלבים`</w:t>
-      </w:r>
-      <w:r>
-        <w:rPr>
-          <w:rFonts w:ascii="Segoe UI" w:hAnsi="Segoe UI"/>
-          <w:color w:val="334155"/>
-        </w:rPr>
-        <w:t xml:space="preserve"> – צפייה בסילבוס ובחירת שלב.</w:t>
+        <w:t>**`📚 רשימת שלבים`** – צפייה בסילבוס ובחירת שלב.</w:t>
       </w:r>
     </w:p>
     <w:p>
       <w:pPr>
-        <w:pStyle w:val="ListNumber"/>
-        <w:bidi w:val="1"/>
-        <w:jc w:val="right"/>
+        <w:bidi/>
       </w:pPr>
       <w:r>
-        <w:rPr>
-          <w:rFonts w:ascii="Segoe UI" w:hAnsi="Segoe UI"/>
-          <w:color w:val="334155"/>
-        </w:rPr>
-      </w:r>
-      <w:r>
-        <w:rPr>
-          <w:rFonts w:ascii="Segoe UI" w:hAnsi="Segoe UI"/>
-          <w:b/>
-          <w:color w:val="1E293B"/>
-        </w:rPr>
-        <w:t>כפתור מעבר מהיר לעורך:</w:t>
-      </w:r>
-      <w:r>
-        <w:rPr>
-          <w:rFonts w:ascii="Segoe UI" w:hAnsi="Segoe UI"/>
-          <w:color w:val="334155"/>
-        </w:rPr>
-        <w:t xml:space="preserve"> בסוף כל הסבר תאורטי מופיע כפתור גדול </w:t>
-      </w:r>
-      <w:r>
-        <w:rPr>
-          <w:rFonts w:ascii="Segoe UI" w:hAnsi="Segoe UI"/>
-          <w:b/>
-          <w:color w:val="1E293B"/>
-        </w:rPr>
-        <w:t>"עבור לכתיבת קוד והרצה 💻 ⬅️"</w:t>
-      </w:r>
-      <w:r>
-        <w:rPr>
-          <w:rFonts w:ascii="Segoe UI" w:hAnsi="Segoe UI"/>
-          <w:color w:val="334155"/>
-        </w:rPr>
-        <w:t>.</w:t>
+        <w:t>2. **כפתור מעבר מהיר לעורך:** בסוף כל הסבר תאורטי מופיע כפתור גדול **"עבור לכתיבת קוד והרצה 💻 ⬅️"**.</w:t>
       </w:r>
     </w:p>
     <w:p>
       <w:pPr>
-        <w:pStyle w:val="ListNumber"/>
-        <w:bidi w:val="1"/>
-        <w:jc w:val="right"/>
+        <w:bidi/>
       </w:pPr>
       <w:r>
-        <w:rPr>
-          <w:rFonts w:ascii="Segoe UI" w:hAnsi="Segoe UI"/>
-          <w:color w:val="334155"/>
-        </w:rPr>
-      </w:r>
-      <w:r>
-        <w:rPr>
-          <w:rFonts w:ascii="Segoe UI" w:hAnsi="Segoe UI"/>
-          <w:b/>
-          <w:color w:val="1E293B"/>
-        </w:rPr>
-        <w:t>כפתור `[ ⌨️ Tab ]` ייעודי:</w:t>
-      </w:r>
-      <w:r>
-        <w:rPr>
-          <w:rFonts w:ascii="Segoe UI" w:hAnsi="Segoe UI"/>
-          <w:color w:val="334155"/>
-        </w:rPr>
+        <w:t>3. **כפתור `[ ⌨️ Tab ]` ייעודי:**</w:t>
       </w:r>
     </w:p>
     <w:p>
       <w:pPr>
-        <w:bidi w:val="1"/>
-        <w:jc w:val="right"/>
+        <w:bidi/>
       </w:pPr>
       <w:r>
-        <w:rPr>
-          <w:rFonts w:ascii="Segoe UI" w:hAnsi="Segoe UI"/>
-          <w:color w:val="334155"/>
-        </w:rPr>
         <w:t>במקלדות וירטואליות של סמארטפונים אין מקש Tab פיזי. הוספנו כפתור `[ ⌨️ Tab ]` בסרגל העורך שמכניס בדיוק 4 רווחים בכל לחיצה – בלי להסתבך עם מקש הרווח!</w:t>
       </w:r>
     </w:p>
     <w:p>
       <w:pPr>
-        <w:pStyle w:val="ListNumber"/>
-        <w:bidi w:val="1"/>
-        <w:jc w:val="right"/>
+        <w:bidi/>
       </w:pPr>
       <w:r>
-        <w:rPr>
-          <w:rFonts w:ascii="Segoe UI" w:hAnsi="Segoe UI"/>
-          <w:color w:val="334155"/>
-        </w:rPr>
-      </w:r>
-      <w:r>
-        <w:rPr>
-          <w:rFonts w:ascii="Segoe UI" w:hAnsi="Segoe UI"/>
-          <w:b/>
-          <w:color w:val="1E293B"/>
-        </w:rPr>
-        <w:t>מניעת זום אוטומטי:</w:t>
-      </w:r>
-      <w:r>
-        <w:rPr>
-          <w:rFonts w:ascii="Segoe UI" w:hAnsi="Segoe UI"/>
-          <w:color w:val="334155"/>
-        </w:rPr>
-        <w:t xml:space="preserve"> גודל הגופן מותאם למניעת התקרבות מעצבנת (Auto-zoom) בעת נגיעה בתיבת העריכה במכשירי iOS ו-Android.</w:t>
+        <w:t>4. **מניעת זום אוטומטי:** גודל הגופן מותאם למניעת התקרבות מעצבנת (Auto-zoom) בעת נגיעה בתיבת העריכה במכשירי iOS ו-Android.</w:t>
       </w:r>
     </w:p>
     <w:p>
       <w:pPr>
-        <w:pStyle w:val="Heading1"/>
-        <w:bidi w:val="1"/>
-        <w:jc w:val="right"/>
+        <w:bidi/>
       </w:pPr>
       <w:r>
-        <w:rPr>
-          <w:rFonts w:ascii="Segoe UI" w:hAnsi="Segoe UI"/>
-          <w:b/>
-          <w:color w:val="0E7490"/>
-          <w:sz w:val="40"/>
-        </w:rPr>
+        <w:t>---</w:t>
+      </w:r>
+    </w:p>
+    <w:p>
+      <w:pPr>
+        <w:pStyle w:val="Heading2"/>
+        <w:bidi/>
+      </w:pPr>
+      <w:r>
         <w:t>🖥️ סיור בסביבת הלמידה – מה יש על המסך?</w:t>
       </w:r>
     </w:p>
     <w:p>
       <w:pPr>
-        <w:bidi w:val="1"/>
-        <w:jc w:val="right"/>
+        <w:bidi/>
       </w:pPr>
       <w:r>
-        <w:rPr>
-          <w:rFonts w:ascii="Segoe UI" w:hAnsi="Segoe UI"/>
-          <w:color w:val="334155"/>
-        </w:rPr>
         <w:t>במחשב שולחני, מסך העבודה מחולק לשלושה אזורים עיקריים:</w:t>
       </w:r>
     </w:p>
     <w:p>
       <w:pPr>
-        <w:bidi w:val="1"/>
-        <w:jc w:val="right"/>
+        <w:bidi/>
       </w:pPr>
       <w:r>
-        <w:rPr>
-          <w:rFonts w:ascii="Segoe UI" w:hAnsi="Segoe UI"/>
-          <w:color w:val="334155"/>
-        </w:rPr>
         <w:t>```</w:t>
       </w:r>
     </w:p>
     <w:p>
       <w:pPr>
-        <w:bidi w:val="1"/>
-        <w:jc w:val="right"/>
+        <w:bidi/>
       </w:pPr>
       <w:r>
-        <w:rPr>
-          <w:rFonts w:ascii="Segoe UI" w:hAnsi="Segoe UI"/>
-          <w:color w:val="334155"/>
-        </w:rPr>
         <w:t>┌─────────────────┬──────────────────────────┬──────────────────────────┐</w:t>
       </w:r>
     </w:p>
     <w:p>
       <w:pPr>
-        <w:bidi w:val="1"/>
-        <w:jc w:val="right"/>
+        <w:bidi/>
       </w:pPr>
       <w:r>
-        <w:rPr>
-          <w:rFonts w:ascii="Segoe UI" w:hAnsi="Segoe UI"/>
-          <w:color w:val="334155"/>
-        </w:rPr>
         <w:t>│  📚 סרגל צד      │  📖 חלונית התאוריה       │  💻 עורך הקוד והמסוף    │</w:t>
       </w:r>
     </w:p>
     <w:p>
       <w:pPr>
-        <w:bidi w:val="1"/>
-        <w:jc w:val="right"/>
+        <w:bidi/>
       </w:pPr>
       <w:r>
-        <w:rPr>
-          <w:rFonts w:ascii="Segoe UI" w:hAnsi="Segoe UI"/>
-          <w:color w:val="334155"/>
-        </w:rPr>
         <w:t>│  (רשימת הפרקים, │  (התמונה הגדולה, הסבר,   │  (כתיבת קוד, הרצה,       │</w:t>
       </w:r>
     </w:p>
     <w:p>
       <w:pPr>
-        <w:bidi w:val="1"/>
-        <w:jc w:val="right"/>
+        <w:bidi/>
       </w:pPr>
       <w:r>
-        <w:rPr>
-          <w:rFonts w:ascii="Segoe UI" w:hAnsi="Segoe UI"/>
-          <w:color w:val="334155"/>
-        </w:rPr>
         <w:t>│  סינון וחיפוש)  │   טיפים, ומנטור Gemini) │   משוב שגיאות ופלט)      │</w:t>
       </w:r>
     </w:p>
     <w:p>
       <w:pPr>
-        <w:bidi w:val="1"/>
-        <w:jc w:val="right"/>
+        <w:bidi/>
       </w:pPr>
       <w:r>
-        <w:rPr>
-          <w:rFonts w:ascii="Segoe UI" w:hAnsi="Segoe UI"/>
-          <w:color w:val="334155"/>
-        </w:rPr>
         <w:t>└─────────────────┴──────────────────────────┴──────────────────────────┘</w:t>
       </w:r>
     </w:p>
     <w:p>
       <w:pPr>
-        <w:bidi w:val="1"/>
-        <w:jc w:val="right"/>
+        <w:bidi/>
       </w:pPr>
       <w:r>
-        <w:rPr>
-          <w:rFonts w:ascii="Segoe UI" w:hAnsi="Segoe UI"/>
-          <w:color w:val="334155"/>
-        </w:rPr>
         <w:t>```</w:t>
       </w:r>
     </w:p>
     <w:p>
       <w:pPr>
-        <w:pStyle w:val="Heading2"/>
-        <w:bidi w:val="1"/>
-        <w:jc w:val="right"/>
+        <w:pStyle w:val="Heading3"/>
+        <w:bidi/>
       </w:pPr>
       <w:r>
-        <w:rPr>
-          <w:rFonts w:ascii="Segoe UI" w:hAnsi="Segoe UI"/>
-          <w:b/>
-          <w:color w:val="1E40AF"/>
-          <w:sz w:val="32"/>
-        </w:rPr>
         <w:t>1. 📚 סרגל הצד (Sidebar) – הניווט שלך</w:t>
       </w:r>
     </w:p>
     <w:p>
       <w:pPr>
         <w:pStyle w:val="ListBullet"/>
-        <w:bidi w:val="1"/>
-        <w:jc w:val="right"/>
+        <w:bidi/>
       </w:pPr>
       <w:r>
-        <w:rPr>
-          <w:rFonts w:ascii="Segoe UI" w:hAnsi="Segoe UI"/>
-          <w:color w:val="334155"/>
-        </w:rPr>
-      </w:r>
-      <w:r>
-        <w:rPr>
-          <w:rFonts w:ascii="Segoe UI" w:hAnsi="Segoe UI"/>
-          <w:b/>
-          <w:color w:val="1E293B"/>
-        </w:rPr>
-        <w:t>סינון לפי רמות:</w:t>
-      </w:r>
-      <w:r>
-        <w:rPr>
-          <w:rFonts w:ascii="Segoe UI" w:hAnsi="Segoe UI"/>
-          <w:color w:val="334155"/>
-        </w:rPr>
+        <w:t>**סינון לפי רמות:**</w:t>
       </w:r>
     </w:p>
     <w:p>
       <w:pPr>
         <w:pStyle w:val="ListBullet"/>
-        <w:bidi w:val="1"/>
-        <w:jc w:val="right"/>
+        <w:bidi/>
       </w:pPr>
       <w:r>
-        <w:rPr>
-          <w:rFonts w:ascii="Segoe UI" w:hAnsi="Segoe UI"/>
-          <w:color w:val="334155"/>
-        </w:rPr>
-      </w:r>
-      <w:r>
-        <w:rPr>
-          <w:rFonts w:ascii="Segoe UI" w:hAnsi="Segoe UI"/>
-          <w:b/>
-          <w:color w:val="1E293B"/>
-        </w:rPr>
-        <w:t>"כל השיעורים"</w:t>
-      </w:r>
-      <w:r>
-        <w:rPr>
-          <w:rFonts w:ascii="Segoe UI" w:hAnsi="Segoe UI"/>
-          <w:color w:val="334155"/>
-        </w:rPr>
-        <w:t xml:space="preserve"> (42 שלבים).</w:t>
+        <w:t>**"כל השיעורים"** (42 שלבים).</w:t>
       </w:r>
     </w:p>
     <w:p>
       <w:pPr>
         <w:pStyle w:val="ListBullet"/>
-        <w:bidi w:val="1"/>
-        <w:jc w:val="right"/>
+        <w:bidi/>
       </w:pPr>
       <w:r>
-        <w:rPr>
-          <w:rFonts w:ascii="Segoe UI" w:hAnsi="Segoe UI"/>
-          <w:color w:val="334155"/>
-        </w:rPr>
-      </w:r>
-      <w:r>
-        <w:rPr>
-          <w:rFonts w:ascii="Segoe UI" w:hAnsi="Segoe UI"/>
-          <w:b/>
-          <w:color w:val="1E293B"/>
-        </w:rPr>
-        <w:t>"יסודות"</w:t>
-      </w:r>
-      <w:r>
-        <w:rPr>
-          <w:rFonts w:ascii="Segoe UI" w:hAnsi="Segoe UI"/>
-          <w:color w:val="334155"/>
-        </w:rPr>
-        <w:t xml:space="preserve"> (שלבים 1–25: משתנים, תנאים, לולאות, רשימות ופונקציות).</w:t>
+        <w:t>**"יסודות"** (שלבים 1–25: משתנים, תנאים, לולאות, רשימות ופונקציות).</w:t>
       </w:r>
     </w:p>
     <w:p>
       <w:pPr>
         <w:pStyle w:val="ListBullet"/>
-        <w:bidi w:val="1"/>
-        <w:jc w:val="right"/>
+        <w:bidi/>
       </w:pPr>
       <w:r>
-        <w:rPr>
-          <w:rFonts w:ascii="Segoe UI" w:hAnsi="Segoe UI"/>
-          <w:color w:val="334155"/>
-        </w:rPr>
-      </w:r>
-      <w:r>
-        <w:rPr>
-          <w:rFonts w:ascii="Segoe UI" w:hAnsi="Segoe UI"/>
-          <w:b/>
-          <w:color w:val="1E293B"/>
-        </w:rPr>
-        <w:t>"מתקדם"</w:t>
-      </w:r>
-      <w:r>
-        <w:rPr>
-          <w:rFonts w:ascii="Segoe UI" w:hAnsi="Segoe UI"/>
-          <w:color w:val="334155"/>
-        </w:rPr>
-        <w:t xml:space="preserve"> (שלבים 26–42: טאפלים, סטים, טיפול בשגיאות, מודולים, מחלקות OOP ופרויקטים).</w:t>
+        <w:t>**"מתקדם"** (שלבים 26–42: טאפלים, סטים, טיפול בשגיאות, מודולים, מחלקות OOP ופרויקטים).</w:t>
       </w:r>
     </w:p>
     <w:p>
       <w:pPr>
         <w:pStyle w:val="ListBullet"/>
-        <w:bidi w:val="1"/>
-        <w:jc w:val="right"/>
+        <w:bidi/>
       </w:pPr>
       <w:r>
-        <w:rPr>
-          <w:rFonts w:ascii="Segoe UI" w:hAnsi="Segoe UI"/>
-          <w:color w:val="334155"/>
-        </w:rPr>
-      </w:r>
-      <w:r>
-        <w:rPr>
-          <w:rFonts w:ascii="Segoe UI" w:hAnsi="Segoe UI"/>
-          <w:b/>
-          <w:color w:val="1E293B"/>
-        </w:rPr>
-        <w:t>אקורדיון פרקים:</w:t>
-      </w:r>
-      <w:r>
-        <w:rPr>
-          <w:rFonts w:ascii="Segoe UI" w:hAnsi="Segoe UI"/>
-          <w:color w:val="334155"/>
-        </w:rPr>
+        <w:t>**אקורדיון פרקים:**</w:t>
       </w:r>
     </w:p>
     <w:p>
       <w:pPr>
-        <w:bidi w:val="1"/>
-        <w:jc w:val="right"/>
+        <w:bidi/>
       </w:pPr>
       <w:r>
-        <w:rPr>
-          <w:rFonts w:ascii="Segoe UI" w:hAnsi="Segoe UI"/>
-          <w:color w:val="334155"/>
-        </w:rPr>
         <w:t>כל פרק ניתן לפתיחה ולסגירה בלחיצה על הכותרת שלו. לצד כל פרק מוצג מונה התקדמות (למשל `3/3 ✓`).</w:t>
       </w:r>
     </w:p>
     <w:p>
       <w:pPr>
         <w:pStyle w:val="ListBullet"/>
-        <w:bidi w:val="1"/>
-        <w:jc w:val="right"/>
+        <w:bidi/>
       </w:pPr>
       <w:r>
-        <w:rPr>
-          <w:rFonts w:ascii="Segoe UI" w:hAnsi="Segoe UI"/>
-          <w:color w:val="334155"/>
-        </w:rPr>
-      </w:r>
-      <w:r>
-        <w:rPr>
-          <w:rFonts w:ascii="Segoe UI" w:hAnsi="Segoe UI"/>
-          <w:b/>
-          <w:color w:val="1E293B"/>
-        </w:rPr>
-        <w:t>חיפוש מהיר:</w:t>
-      </w:r>
-      <w:r>
-        <w:rPr>
-          <w:rFonts w:ascii="Segoe UI" w:hAnsi="Segoe UI"/>
-          <w:color w:val="334155"/>
-        </w:rPr>
+        <w:t>**חיפוש מהיר:**</w:t>
       </w:r>
     </w:p>
     <w:p>
       <w:pPr>
-        <w:bidi w:val="1"/>
-        <w:jc w:val="right"/>
+        <w:bidi/>
       </w:pPr>
       <w:r>
-        <w:rPr>
-          <w:rFonts w:ascii="Segoe UI" w:hAnsi="Segoe UI"/>
-          <w:color w:val="334155"/>
-        </w:rPr>
         <w:t>תיבת חיפוש בראש הסרגל מאפשרת למצוא כל נושא או מושג בשניות (למשל: "while", "מילון", "שגיאות").</w:t>
       </w:r>
     </w:p>
     <w:p>
       <w:pPr>
         <w:pStyle w:val="ListBullet"/>
-        <w:bidi w:val="1"/>
-        <w:jc w:val="right"/>
+        <w:bidi/>
       </w:pPr>
       <w:r>
-        <w:rPr>
-          <w:rFonts w:ascii="Segoe UI" w:hAnsi="Segoe UI"/>
-          <w:color w:val="334155"/>
-        </w:rPr>
-      </w:r>
-      <w:r>
-        <w:rPr>
-          <w:rFonts w:ascii="Segoe UI" w:hAnsi="Segoe UI"/>
-          <w:b/>
-          <w:color w:val="1E293B"/>
-        </w:rPr>
-        <w:t>סימוני הצלחה:</w:t>
-      </w:r>
-      <w:r>
-        <w:rPr>
-          <w:rFonts w:ascii="Segoe UI" w:hAnsi="Segoe UI"/>
-          <w:color w:val="334155"/>
-        </w:rPr>
+        <w:t>**סימוני הצלחה:**</w:t>
       </w:r>
     </w:p>
     <w:p>
       <w:pPr>
-        <w:bidi w:val="1"/>
-        <w:jc w:val="right"/>
+        <w:bidi/>
       </w:pPr>
       <w:r>
-        <w:rPr>
-          <w:rFonts w:ascii="Segoe UI" w:hAnsi="Segoe UI"/>
-          <w:color w:val="334155"/>
-        </w:rPr>
         <w:t>שלב שהשלמת יסומן ב-✅ ירוק, ושלב שטרם הושלם יסומן ב-⚪.</w:t>
       </w:r>
     </w:p>
     <w:p>
       <w:pPr>
-        <w:pStyle w:val="Heading2"/>
-        <w:bidi w:val="1"/>
-        <w:jc w:val="right"/>
+        <w:bidi/>
       </w:pPr>
       <w:r>
-        <w:rPr>
-          <w:rFonts w:ascii="Segoe UI" w:hAnsi="Segoe UI"/>
-          <w:b/>
-          <w:color w:val="1E40AF"/>
-          <w:sz w:val="32"/>
-        </w:rPr>
+        <w:t>---</w:t>
+      </w:r>
+    </w:p>
+    <w:p>
+      <w:pPr>
+        <w:pStyle w:val="Heading3"/>
+        <w:bidi/>
+      </w:pPr>
+      <w:r>
         <w:t>2. 📖 חלונית התאוריה והתמונה הגדולה</w:t>
       </w:r>
     </w:p>
     <w:p>
       <w:pPr>
-        <w:bidi w:val="1"/>
-        <w:jc w:val="right"/>
+        <w:bidi/>
       </w:pPr>
       <w:r>
-        <w:rPr>
-          <w:rFonts w:ascii="Segoe UI" w:hAnsi="Segoe UI"/>
-          <w:color w:val="334155"/>
-        </w:rPr>
         <w:t>לפני שקופצים לקוד, חשוב להבין את ההקשר הרחב:</w:t>
       </w:r>
     </w:p>
     <w:p>
       <w:pPr>
         <w:pStyle w:val="ListBullet"/>
-        <w:bidi w:val="1"/>
-        <w:jc w:val="right"/>
+        <w:bidi/>
       </w:pPr>
       <w:r>
-        <w:rPr>
-          <w:rFonts w:ascii="Segoe UI" w:hAnsi="Segoe UI"/>
-          <w:color w:val="334155"/>
-        </w:rPr>
-      </w:r>
-      <w:r>
-        <w:rPr>
-          <w:rFonts w:ascii="Segoe UI" w:hAnsi="Segoe UI"/>
-          <w:b/>
-          <w:color w:val="1E293B"/>
-        </w:rPr>
-        <w:t>🗺️ כרטיסיית "התמונה הגדולה והמסע שלך":</w:t>
-      </w:r>
-      <w:r>
-        <w:rPr>
-          <w:rFonts w:ascii="Segoe UI" w:hAnsi="Segoe UI"/>
-          <w:color w:val="334155"/>
-        </w:rPr>
+        <w:t>**🗺️ כרטיסיית "התמונה הגדולה והמסע שלך":**</w:t>
       </w:r>
     </w:p>
     <w:p>
       <w:pPr>
-        <w:pStyle w:val="ListNumber"/>
-        <w:bidi w:val="1"/>
-        <w:jc w:val="right"/>
+        <w:bidi/>
       </w:pPr>
       <w:r>
-        <w:rPr>
-          <w:rFonts w:ascii="Segoe UI" w:hAnsi="Segoe UI"/>
-          <w:color w:val="334155"/>
-        </w:rPr>
-      </w:r>
-      <w:r>
-        <w:rPr>
-          <w:rFonts w:ascii="Segoe UI" w:hAnsi="Segoe UI"/>
-          <w:b/>
-          <w:color w:val="1E293B"/>
-        </w:rPr>
-        <w:t>🔄 מה למדנו עד עכשיו?</w:t>
-      </w:r>
-      <w:r>
-        <w:rPr>
-          <w:rFonts w:ascii="Segoe UI" w:hAnsi="Segoe UI"/>
-          <w:color w:val="334155"/>
-        </w:rPr>
-        <w:t xml:space="preserve"> – תזכורת מהירה לכלים שכבר צברת, שמחברת את הידע ומעניקה ביטחון.</w:t>
+        <w:t>1. **🔄 מה למדנו עד עכשיו?** – תזכורת מהירה לכלים שכבר צברת, שמחברת את הידע ומעניקה ביטחון.</w:t>
       </w:r>
     </w:p>
     <w:p>
       <w:pPr>
-        <w:pStyle w:val="ListNumber"/>
-        <w:bidi w:val="1"/>
-        <w:jc w:val="right"/>
+        <w:bidi/>
       </w:pPr>
       <w:r>
-        <w:rPr>
-          <w:rFonts w:ascii="Segoe UI" w:hAnsi="Segoe UI"/>
-          <w:color w:val="334155"/>
-        </w:rPr>
-      </w:r>
-      <w:r>
-        <w:rPr>
-          <w:rFonts w:ascii="Segoe UI" w:hAnsi="Segoe UI"/>
-          <w:b/>
-          <w:color w:val="1E293B"/>
-        </w:rPr>
-        <w:t>🎯 למה אנחנו לומדים את זה?</w:t>
-      </w:r>
-      <w:r>
-        <w:rPr>
-          <w:rFonts w:ascii="Segoe UI" w:hAnsi="Segoe UI"/>
-          <w:color w:val="334155"/>
-        </w:rPr>
-        <w:t xml:space="preserve"> – המטרה של הכלי החדש ואיזו מגבלה הוא פותר.</w:t>
+        <w:t>2. **🎯 למה אנחנו לומדים את זה?** – המטרה של הכלי החדש ואיזו מגבלה הוא פותר.</w:t>
       </w:r>
     </w:p>
     <w:p>
       <w:pPr>
-        <w:pStyle w:val="ListNumber"/>
-        <w:bidi w:val="1"/>
-        <w:jc w:val="right"/>
+        <w:bidi/>
       </w:pPr>
       <w:r>
-        <w:rPr>
-          <w:rFonts w:ascii="Segoe UI" w:hAnsi="Segoe UI"/>
-          <w:color w:val="334155"/>
-        </w:rPr>
-      </w:r>
-      <w:r>
-        <w:rPr>
-          <w:rFonts w:ascii="Segoe UI" w:hAnsi="Segoe UI"/>
-          <w:b/>
-          <w:color w:val="1E293B"/>
-        </w:rPr>
-        <w:t>🛠️ מתי ואיך נשתמש בזה בעולם האמיתי?</w:t>
-      </w:r>
-      <w:r>
-        <w:rPr>
-          <w:rFonts w:ascii="Segoe UI" w:hAnsi="Segoe UI"/>
-          <w:color w:val="334155"/>
-        </w:rPr>
-        <w:t xml:space="preserve"> – דוגמאות שימוש באפליקציות אמיתיות (משחקים, אתרים, בסיסי נתונים).</w:t>
+        <w:t>3. **🛠️ מתי ואיך נשתמש בזה בעולם האמיתי?** – דוגמאות שימוש באפליקציות אמיתיות (משחקים, אתרים, בסיסי נתונים).</w:t>
       </w:r>
     </w:p>
     <w:p>
       <w:pPr>
-        <w:pStyle w:val="ListNumber"/>
-        <w:bidi w:val="1"/>
-        <w:jc w:val="right"/>
+        <w:bidi/>
       </w:pPr>
       <w:r>
-        <w:rPr>
-          <w:rFonts w:ascii="Segoe UI" w:hAnsi="Segoe UI"/>
-          <w:color w:val="334155"/>
-        </w:rPr>
-      </w:r>
-      <w:r>
-        <w:rPr>
-          <w:rFonts w:ascii="Segoe UI" w:hAnsi="Segoe UI"/>
-          <w:b/>
-          <w:color w:val="1E293B"/>
-        </w:rPr>
-        <w:t>🔭 מה צפוי לנו בהמשך המסע?</w:t>
-      </w:r>
-      <w:r>
-        <w:rPr>
-          <w:rFonts w:ascii="Segoe UI" w:hAnsi="Segoe UI"/>
-          <w:color w:val="334155"/>
-        </w:rPr>
-        <w:t xml:space="preserve"> – הצצה לשלב הבא כדי לדעת לאן הדרך מובילה.</w:t>
+        <w:t>4. **🔭 מה צפוי לנו בהמשך המסע?** – הצצה לשלב הבא כדי לדעת לאן הדרך מובילה.</w:t>
       </w:r>
     </w:p>
     <w:p>
       <w:pPr>
         <w:pStyle w:val="ListBullet"/>
-        <w:bidi w:val="1"/>
-        <w:jc w:val="right"/>
+        <w:bidi/>
       </w:pPr>
       <w:r>
-        <w:rPr>
-          <w:rFonts w:ascii="Segoe UI" w:hAnsi="Segoe UI"/>
-          <w:color w:val="334155"/>
-        </w:rPr>
-      </w:r>
-      <w:r>
-        <w:rPr>
-          <w:rFonts w:ascii="Segoe UI" w:hAnsi="Segoe UI"/>
-          <w:b/>
-          <w:color w:val="1E293B"/>
-        </w:rPr>
-        <w:t>תוכן השיעור:</w:t>
-      </w:r>
-      <w:r>
-        <w:rPr>
-          <w:rFonts w:ascii="Segoe UI" w:hAnsi="Segoe UI"/>
-          <w:color w:val="334155"/>
-        </w:rPr>
-        <w:t xml:space="preserve"> הסבר בהיר, קצר וקולע עם דוגמאות קוד ברורות.</w:t>
+        <w:t>**תוכן השיעור:** הסבר בהיר, קצר וקולע עם דוגמאות קוד ברורות.</w:t>
       </w:r>
     </w:p>
     <w:p>
       <w:pPr>
         <w:pStyle w:val="ListBullet"/>
-        <w:bidi w:val="1"/>
-        <w:jc w:val="right"/>
+        <w:bidi/>
       </w:pPr>
       <w:r>
-        <w:rPr>
-          <w:rFonts w:ascii="Segoe UI" w:hAnsi="Segoe UI"/>
-          <w:color w:val="334155"/>
-        </w:rPr>
-      </w:r>
-      <w:r>
-        <w:rPr>
-          <w:rFonts w:ascii="Segoe UI" w:hAnsi="Segoe UI"/>
-          <w:b/>
-          <w:color w:val="1E293B"/>
-        </w:rPr>
-        <w:t>💡 הטיפ שלנו:</w:t>
-      </w:r>
-      <w:r>
-        <w:rPr>
-          <w:rFonts w:ascii="Segoe UI" w:hAnsi="Segoe UI"/>
-          <w:color w:val="334155"/>
-        </w:rPr>
-        <w:t xml:space="preserve"> טיפ מעשי חשוב לכתיבת קוד נכונה ויעילה.</w:t>
+        <w:t>**💡 הטיפ שלנו:** טיפ מעשי חשוב לכתיבת קוד נכונה ויעילה.</w:t>
       </w:r>
     </w:p>
     <w:p>
       <w:pPr>
         <w:pStyle w:val="ListBullet"/>
-        <w:bidi w:val="1"/>
-        <w:jc w:val="right"/>
+        <w:bidi/>
       </w:pPr>
       <w:r>
-        <w:rPr>
-          <w:rFonts w:ascii="Segoe UI" w:hAnsi="Segoe UI"/>
-          <w:color w:val="334155"/>
-        </w:rPr>
-      </w:r>
-      <w:r>
-        <w:rPr>
-          <w:rFonts w:ascii="Segoe UI" w:hAnsi="Segoe UI"/>
-          <w:b/>
-          <w:color w:val="1E293B"/>
-        </w:rPr>
-        <w:t>⚠️ דוגמאות שגיאה וטעויות נפוצות:</w:t>
-      </w:r>
-      <w:r>
-        <w:rPr>
-          <w:rFonts w:ascii="Segoe UI" w:hAnsi="Segoe UI"/>
-          <w:color w:val="334155"/>
-        </w:rPr>
-        <w:t xml:space="preserve"> כרטיסייה ייעודית בכל שלב המציגה ממה להיזהר, שגיאות נפוצות שמתחילים עושים (כמו SyntaxError, IndentationError, NameError, מירכאות לא תואמות, שכחת נקודתיים וכו') ואיך להימנע מהן.</w:t>
+        <w:t>**⚠️ דוגמאות שגיאה וטעויות נפוצות:** כרטיסייה ייעודית בכל שלב המציגה ממה להיזהר, שגיאות נפוצות שמתחילים עושים (כמו SyntaxError, IndentationError, NameError, מירכאות לא תואמות, שכחת נקודתיים וכו') ואיך להימנע מהן.</w:t>
       </w:r>
     </w:p>
     <w:p>
       <w:pPr>
         <w:pStyle w:val="ListBullet"/>
-        <w:bidi w:val="1"/>
-        <w:jc w:val="right"/>
+        <w:bidi/>
       </w:pPr>
       <w:r>
-        <w:rPr>
-          <w:rFonts w:ascii="Segoe UI" w:hAnsi="Segoe UI"/>
-          <w:color w:val="334155"/>
-        </w:rPr>
-      </w:r>
-      <w:r>
-        <w:rPr>
-          <w:rFonts w:ascii="Segoe UI" w:hAnsi="Segoe UI"/>
-          <w:b/>
-          <w:color w:val="1E293B"/>
-        </w:rPr>
-        <w:t>💡 רמז לפתרון:</w:t>
-      </w:r>
-      <w:r>
-        <w:rPr>
-          <w:rFonts w:ascii="Segoe UI" w:hAnsi="Segoe UI"/>
-          <w:color w:val="334155"/>
-        </w:rPr>
-        <w:t xml:space="preserve"> כפתור שחושף רמז ממוקד אם נתקעת במשימה.</w:t>
+        <w:t>**💡 רמז לפתרון:** כפתור שחושף רמז ממוקד אם נתקעת במשימה.</w:t>
       </w:r>
     </w:p>
     <w:p>
       <w:pPr>
-        <w:pStyle w:val="Heading2"/>
-        <w:bidi w:val="1"/>
-        <w:jc w:val="right"/>
+        <w:bidi/>
       </w:pPr>
       <w:r>
-        <w:rPr>
-          <w:rFonts w:ascii="Segoe UI" w:hAnsi="Segoe UI"/>
-          <w:b/>
-          <w:color w:val="1E40AF"/>
-          <w:sz w:val="32"/>
-        </w:rPr>
+        <w:t>---</w:t>
+      </w:r>
+    </w:p>
+    <w:p>
+      <w:pPr>
+        <w:pStyle w:val="Heading3"/>
+        <w:bidi/>
+      </w:pPr>
+      <w:r>
         <w:t>3. 💻 עורך הקוד ומסוף הפלט</w:t>
       </w:r>
     </w:p>
     <w:p>
       <w:pPr>
         <w:pStyle w:val="ListBullet"/>
-        <w:bidi w:val="1"/>
-        <w:jc w:val="right"/>
+        <w:bidi/>
       </w:pPr>
       <w:r>
-        <w:rPr>
-          <w:rFonts w:ascii="Segoe UI" w:hAnsi="Segoe UI"/>
-          <w:color w:val="334155"/>
-        </w:rPr>
-      </w:r>
-      <w:r>
-        <w:rPr>
-          <w:rFonts w:ascii="Segoe UI" w:hAnsi="Segoe UI"/>
-          <w:b/>
-          <w:color w:val="1E293B"/>
-        </w:rPr>
-        <w:t>עורך הקוד (Code Editor):</w:t>
-      </w:r>
-      <w:r>
-        <w:rPr>
-          <w:rFonts w:ascii="Segoe UI" w:hAnsi="Segoe UI"/>
-          <w:color w:val="334155"/>
-        </w:rPr>
+        <w:t>**עורך הקוד (Code Editor):**</w:t>
       </w:r>
     </w:p>
     <w:p>
       <w:pPr>
         <w:pStyle w:val="ListBullet"/>
-        <w:bidi w:val="1"/>
-        <w:jc w:val="right"/>
+        <w:bidi/>
       </w:pPr>
       <w:r>
-        <w:rPr>
-          <w:rFonts w:ascii="Segoe UI" w:hAnsi="Segoe UI"/>
-          <w:color w:val="334155"/>
-        </w:rPr>
         <w:t>כותבים ועורכים את קוד הפייתון משמאל לימין.</w:t>
       </w:r>
     </w:p>
     <w:p>
       <w:pPr>
         <w:pStyle w:val="ListBullet"/>
-        <w:bidi w:val="1"/>
-        <w:jc w:val="right"/>
+        <w:bidi/>
       </w:pPr>
       <w:r>
-        <w:rPr>
-          <w:rFonts w:ascii="Segoe UI" w:hAnsi="Segoe UI"/>
-          <w:color w:val="334155"/>
-        </w:rPr>
-      </w:r>
-      <w:r>
-        <w:rPr>
-          <w:rFonts w:ascii="Segoe UI" w:hAnsi="Segoe UI"/>
-          <w:b/>
-          <w:color w:val="1E293B"/>
-        </w:rPr>
-        <w:t>מקש `Tab`:</w:t>
-      </w:r>
-      <w:r>
-        <w:rPr>
-          <w:rFonts w:ascii="Segoe UI" w:hAnsi="Segoe UI"/>
-          <w:color w:val="334155"/>
-        </w:rPr>
-        <w:t xml:space="preserve"> מכניס הזחה מדויקת של 4 רווחים (קריטי בפייתון!).</w:t>
+        <w:t>**מקש `Tab`:** מכניס הזחה מדויקת של 4 רווחים (קריטי בפייתון!).</w:t>
       </w:r>
     </w:p>
     <w:p>
       <w:pPr>
         <w:pStyle w:val="ListBullet"/>
-        <w:bidi w:val="1"/>
-        <w:jc w:val="right"/>
+        <w:bidi/>
       </w:pPr>
       <w:r>
-        <w:rPr>
-          <w:rFonts w:ascii="Segoe UI" w:hAnsi="Segoe UI"/>
-          <w:color w:val="334155"/>
-        </w:rPr>
-      </w:r>
-      <w:r>
-        <w:rPr>
-          <w:rFonts w:ascii="Segoe UI" w:hAnsi="Segoe UI"/>
-          <w:b/>
-          <w:color w:val="1E293B"/>
-        </w:rPr>
-        <w:t>קיצור דרך להרצה:</w:t>
-      </w:r>
-      <w:r>
-        <w:rPr>
-          <w:rFonts w:ascii="Segoe UI" w:hAnsi="Segoe UI"/>
-          <w:color w:val="334155"/>
-        </w:rPr>
-        <w:t xml:space="preserve"> לחיצה על `Ctrl + Enter` (או `Cmd + Enter` במק) מריצה את הקוד מיד!</w:t>
+        <w:t>**קיצור דרך להרצה:** לחיצה על `Ctrl + Enter` (או `Cmd + Enter` במק) מריצה את הקוד מיד!</w:t>
       </w:r>
     </w:p>
     <w:p>
       <w:pPr>
         <w:pStyle w:val="ListBullet"/>
-        <w:bidi w:val="1"/>
-        <w:jc w:val="right"/>
+        <w:bidi/>
       </w:pPr>
       <w:r>
-        <w:rPr>
-          <w:rFonts w:ascii="Segoe UI" w:hAnsi="Segoe UI"/>
-          <w:color w:val="334155"/>
-        </w:rPr>
-      </w:r>
-      <w:r>
-        <w:rPr>
-          <w:rFonts w:ascii="Segoe UI" w:hAnsi="Segoe UI"/>
-          <w:b/>
-          <w:color w:val="1E293B"/>
-        </w:rPr>
-        <w:t>שמירה אוטומטית של טיוטות (Auto-Save):</w:t>
-      </w:r>
-      <w:r>
-        <w:rPr>
-          <w:rFonts w:ascii="Segoe UI" w:hAnsi="Segoe UI"/>
-          <w:color w:val="334155"/>
-        </w:rPr>
+        <w:t>**שמירה אוטומטית של טיוטות (Auto-Save):**</w:t>
       </w:r>
     </w:p>
     <w:p>
       <w:pPr>
         <w:pStyle w:val="ListBullet"/>
-        <w:bidi w:val="1"/>
-        <w:jc w:val="right"/>
+        <w:bidi/>
       </w:pPr>
       <w:r>
-        <w:rPr>
-          <w:rFonts w:ascii="Segoe UI" w:hAnsi="Segoe UI"/>
-          <w:color w:val="334155"/>
-        </w:rPr>
         <w:t>כל שינוי שאתה מקליד נשמר אוטומטית בזיכרון המקומי של הדפדפן.</w:t>
       </w:r>
     </w:p>
     <w:p>
       <w:pPr>
         <w:pStyle w:val="ListBullet"/>
-        <w:bidi w:val="1"/>
-        <w:jc w:val="right"/>
+        <w:bidi/>
       </w:pPr>
       <w:r>
-        <w:rPr>
-          <w:rFonts w:ascii="Segoe UI" w:hAnsi="Segoe UI"/>
-          <w:color w:val="334155"/>
-        </w:rPr>
-        <w:t xml:space="preserve">אינדיקטור ירוק </w:t>
-      </w:r>
-      <w:r>
-        <w:rPr>
-          <w:rFonts w:ascii="Segoe UI" w:hAnsi="Segoe UI"/>
-          <w:b/>
-          <w:color w:val="1E293B"/>
-        </w:rPr>
-        <w:t>"💾 נשמר"</w:t>
-      </w:r>
-      <w:r>
-        <w:rPr>
-          <w:rFonts w:ascii="Segoe UI" w:hAnsi="Segoe UI"/>
-          <w:color w:val="334155"/>
-        </w:rPr>
-        <w:t xml:space="preserve"> מאשר שהקוד שלך מגובה. אם תרענן את הדף או תחזור מחר – הקוד שלך ימתין לך בדיוק כפי שהשארת אותו!</w:t>
+        <w:t>אינדיקטור ירוק **"💾 נשמר"** מאשר שהקוד שלך מגובה. אם תרענן את הדף או תחזור מחר – הקוד שלך ימתין לך בדיוק כפי שהשארת אותו!</w:t>
       </w:r>
     </w:p>
     <w:p>
       <w:pPr>
         <w:pStyle w:val="ListBullet"/>
-        <w:bidi w:val="1"/>
-        <w:jc w:val="right"/>
+        <w:bidi/>
       </w:pPr>
       <w:r>
-        <w:rPr>
-          <w:rFonts w:ascii="Segoe UI" w:hAnsi="Segoe UI"/>
-          <w:color w:val="334155"/>
-        </w:rPr>
-      </w:r>
-      <w:r>
-        <w:rPr>
-          <w:rFonts w:ascii="Segoe UI" w:hAnsi="Segoe UI"/>
-          <w:b/>
-          <w:color w:val="1E293B"/>
-        </w:rPr>
-        <w:t>כפתורי עזר:</w:t>
-      </w:r>
-      <w:r>
-        <w:rPr>
-          <w:rFonts w:ascii="Segoe UI" w:hAnsi="Segoe UI"/>
-          <w:color w:val="334155"/>
-        </w:rPr>
+        <w:t>**כפתורי עזר:**</w:t>
       </w:r>
     </w:p>
     <w:p>
       <w:pPr>
         <w:pStyle w:val="ListBullet"/>
-        <w:bidi w:val="1"/>
-        <w:jc w:val="right"/>
+        <w:bidi/>
       </w:pPr>
       <w:r>
-        <w:rPr>
-          <w:rFonts w:ascii="Segoe UI" w:hAnsi="Segoe UI"/>
-          <w:color w:val="334155"/>
-        </w:rPr>
-      </w:r>
-      <w:r>
-        <w:rPr>
-          <w:rFonts w:ascii="Segoe UI" w:hAnsi="Segoe UI"/>
-          <w:b/>
-          <w:color w:val="1E293B"/>
-        </w:rPr>
-        <w:t>▶️ הרץ קוד:</w:t>
-      </w:r>
-      <w:r>
-        <w:rPr>
-          <w:rFonts w:ascii="Segoe UI" w:hAnsi="Segoe UI"/>
-          <w:color w:val="334155"/>
-        </w:rPr>
-        <w:t xml:space="preserve"> מריץ את הקוד ובודק אם הפלט תואם למצופה.</w:t>
+        <w:t>**▶️ הרץ קוד:** מריץ את הקוד ובודק אם הפלט תואם למצופה.</w:t>
       </w:r>
     </w:p>
     <w:p>
       <w:pPr>
         <w:pStyle w:val="ListBullet"/>
-        <w:bidi w:val="1"/>
-        <w:jc w:val="right"/>
+        <w:bidi/>
       </w:pPr>
       <w:r>
-        <w:rPr>
-          <w:rFonts w:ascii="Segoe UI" w:hAnsi="Segoe UI"/>
-          <w:color w:val="334155"/>
-        </w:rPr>
-      </w:r>
-      <w:r>
-        <w:rPr>
-          <w:rFonts w:ascii="Segoe UI" w:hAnsi="Segoe UI"/>
-          <w:b/>
-          <w:color w:val="1E293B"/>
-        </w:rPr>
-        <w:t>🔄 איפוס קוד:</w:t>
-      </w:r>
-      <w:r>
-        <w:rPr>
-          <w:rFonts w:ascii="Segoe UI" w:hAnsi="Segoe UI"/>
-          <w:color w:val="334155"/>
-        </w:rPr>
-        <w:t xml:space="preserve"> מנקה את הטיוטה ומחזיר את הקוד בעורך למצבו ההתחלתי.</w:t>
+        <w:t>**🔄 איפוס קוד:** מנקה את הטיוטה ומחזיר את הקוד בעורך למצבו ההתחלתי.</w:t>
       </w:r>
     </w:p>
     <w:p>
       <w:pPr>
         <w:pStyle w:val="ListBullet"/>
-        <w:bidi w:val="1"/>
-        <w:jc w:val="right"/>
+        <w:bidi/>
       </w:pPr>
       <w:r>
-        <w:rPr>
-          <w:rFonts w:ascii="Segoe UI" w:hAnsi="Segoe UI"/>
-          <w:color w:val="334155"/>
-        </w:rPr>
-      </w:r>
-      <w:r>
-        <w:rPr>
-          <w:rFonts w:ascii="Segoe UI" w:hAnsi="Segoe UI"/>
-          <w:b/>
-          <w:color w:val="1E293B"/>
-        </w:rPr>
-        <w:t>🖥️ מסוף הפלט (Output Terminal):</w:t>
-      </w:r>
-      <w:r>
-        <w:rPr>
-          <w:rFonts w:ascii="Segoe UI" w:hAnsi="Segoe UI"/>
-          <w:color w:val="334155"/>
-        </w:rPr>
+        <w:t>**🖥️ מסוף הפלט (Output Terminal):**</w:t>
       </w:r>
     </w:p>
     <w:p>
       <w:pPr>
         <w:pStyle w:val="ListBullet"/>
-        <w:bidi w:val="1"/>
-        <w:jc w:val="right"/>
+        <w:bidi/>
       </w:pPr>
       <w:r>
-        <w:rPr>
-          <w:rFonts w:ascii="Segoe UI" w:hAnsi="Segoe UI"/>
-          <w:color w:val="334155"/>
-        </w:rPr>
         <w:t>מציג את תוצאות ההרצה בדיוק כפי שפייתון מחזירה.</w:t>
       </w:r>
     </w:p>
     <w:p>
       <w:pPr>
         <w:pStyle w:val="ListBullet"/>
-        <w:bidi w:val="1"/>
-        <w:jc w:val="right"/>
+        <w:bidi/>
       </w:pPr>
       <w:r>
-        <w:rPr>
-          <w:rFonts w:ascii="Segoe UI" w:hAnsi="Segoe UI"/>
-          <w:color w:val="334155"/>
-        </w:rPr>
-      </w:r>
-      <w:r>
-        <w:rPr>
-          <w:rFonts w:ascii="Segoe UI" w:hAnsi="Segoe UI"/>
-          <w:b/>
-          <w:color w:val="1E293B"/>
-        </w:rPr>
-        <w:t>הצלחה:</w:t>
-      </w:r>
-      <w:r>
-        <w:rPr>
-          <w:rFonts w:ascii="Segoe UI" w:hAnsi="Segoe UI"/>
-          <w:color w:val="334155"/>
-        </w:rPr>
-        <w:t xml:space="preserve"> באנר ירוק מעודד עם כפתור מהיר </w:t>
-      </w:r>
-      <w:r>
-        <w:rPr>
-          <w:rFonts w:ascii="Segoe UI" w:hAnsi="Segoe UI"/>
-          <w:b/>
-          <w:color w:val="1E293B"/>
-        </w:rPr>
-        <w:t>"לשלב הבא ⬅️"</w:t>
-      </w:r>
-      <w:r>
-        <w:rPr>
-          <w:rFonts w:ascii="Segoe UI" w:hAnsi="Segoe UI"/>
-          <w:color w:val="334155"/>
-        </w:rPr>
-        <w:t>.</w:t>
+        <w:t>**הצלחה:** באנר ירוק מעודד עם כפתור מהיר **"לשלב הבא ⬅️"**.</w:t>
       </w:r>
     </w:p>
     <w:p>
       <w:pPr>
         <w:pStyle w:val="ListBullet"/>
-        <w:bidi w:val="1"/>
-        <w:jc w:val="right"/>
+        <w:bidi/>
       </w:pPr>
       <w:r>
-        <w:rPr>
-          <w:rFonts w:ascii="Segoe UI" w:hAnsi="Segoe UI"/>
-          <w:color w:val="334155"/>
-        </w:rPr>
-      </w:r>
-      <w:r>
-        <w:rPr>
-          <w:rFonts w:ascii="Segoe UI" w:hAnsi="Segoe UI"/>
-          <w:b/>
-          <w:color w:val="1E293B"/>
-        </w:rPr>
-        <w:t>שגיאה:</w:t>
-      </w:r>
-      <w:r>
-        <w:rPr>
-          <w:rFonts w:ascii="Segoe UI" w:hAnsi="Segoe UI"/>
-          <w:color w:val="334155"/>
-        </w:rPr>
-        <w:t xml:space="preserve"> מנוע תרגום שגיאות חכם שמסביר בעברית פשוטה מה קרה (למשל: שכחת נקודתיים, רווח לא נכון, או חלוקה באפס).</w:t>
+        <w:t>**שגיאה:** מנוע תרגום שגיאות חכם שמסביר בעברית פשוטה מה קרה (למשל: שכחת נקודתיים, רווח לא נכון, או חלוקה באפס).</w:t>
       </w:r>
     </w:p>
     <w:p>
       <w:pPr>
-        <w:pStyle w:val="Heading1"/>
-        <w:bidi w:val="1"/>
-        <w:jc w:val="right"/>
+        <w:bidi/>
       </w:pPr>
       <w:r>
-        <w:rPr>
-          <w:rFonts w:ascii="Segoe UI" w:hAnsi="Segoe UI"/>
-          <w:b/>
-          <w:color w:val="0E7490"/>
-          <w:sz w:val="40"/>
-        </w:rPr>
+        <w:t>---</w:t>
+      </w:r>
+    </w:p>
+    <w:p>
+      <w:pPr>
+        <w:pStyle w:val="Heading2"/>
+        <w:bidi/>
+      </w:pPr>
+      <w:r>
         <w:t>🤖 המנטור האישי שלך: Gemini AI</w:t>
       </w:r>
     </w:p>
     <w:p>
       <w:pPr>
-        <w:bidi w:val="1"/>
-        <w:jc w:val="right"/>
+        <w:bidi/>
       </w:pPr>
       <w:r>
-        <w:rPr>
-          <w:rFonts w:ascii="Segoe UI" w:hAnsi="Segoe UI"/>
-          <w:color w:val="334155"/>
-        </w:rPr>
-        <w:t xml:space="preserve">אחד הפיצ'רים העוצמתיים ביותר באפליקציה הוא חיבור מובנה למודל השפה </w:t>
-      </w:r>
-      <w:r>
-        <w:rPr>
-          <w:rFonts w:ascii="Segoe UI" w:hAnsi="Segoe UI"/>
-          <w:b/>
-          <w:color w:val="0F172A"/>
-        </w:rPr>
-        <w:t>Google Gemini</w:t>
-      </w:r>
-      <w:r>
-        <w:rPr>
-          <w:rFonts w:ascii="Segoe UI" w:hAnsi="Segoe UI"/>
-          <w:color w:val="334155"/>
-        </w:rPr>
-        <w:t>!</w:t>
+        <w:t>אחד הפיצ'רים העוצמתיים ביותר באפליקציה הוא חיבור מובנה למודל השפה **Google Gemini**!</w:t>
       </w:r>
     </w:p>
     <w:p>
       <w:pPr>
-        <w:pStyle w:val="Heading2"/>
-        <w:bidi w:val="1"/>
-        <w:jc w:val="right"/>
+        <w:pStyle w:val="Heading3"/>
+        <w:bidi/>
       </w:pPr>
       <w:r>
-        <w:rPr>
-          <w:rFonts w:ascii="Segoe UI" w:hAnsi="Segoe UI"/>
-          <w:b/>
-          <w:color w:val="1E40AF"/>
-          <w:sz w:val="32"/>
-        </w:rPr>
         <w:t>עיצוב קומפקטי וחכם</w:t>
       </w:r>
     </w:p>
     <w:p>
       <w:pPr>
-        <w:bidi w:val="1"/>
-        <w:jc w:val="right"/>
+        <w:bidi/>
       </w:pPr>
       <w:r>
-        <w:rPr>
-          <w:rFonts w:ascii="Segoe UI" w:hAnsi="Segoe UI"/>
-          <w:color w:val="334155"/>
-        </w:rPr>
         <w:t>במקום כרטיסייה גדולה שתופסת חצי מסך, מנטור ה-AI מוצג כסרגל אלגנטי וקומפקטי המכיל את כל הפונקציות הנדרשות:</w:t>
       </w:r>
     </w:p>
     <w:p>
       <w:pPr>
         <w:pStyle w:val="ListBullet"/>
-        <w:bidi w:val="1"/>
-        <w:jc w:val="right"/>
+        <w:bidi/>
       </w:pPr>
       <w:r>
-        <w:rPr>
-          <w:rFonts w:ascii="Segoe UI" w:hAnsi="Segoe UI"/>
-          <w:color w:val="334155"/>
-        </w:rPr>
-      </w:r>
-      <w:r>
-        <w:rPr>
-          <w:rFonts w:ascii="Segoe UI" w:hAnsi="Segoe UI"/>
-          <w:b/>
-          <w:color w:val="1E293B"/>
-        </w:rPr>
-        <w:t>כפתור מידע `ℹ️ איך המנטור עובד?`:</w:t>
-      </w:r>
-      <w:r>
-        <w:rPr>
-          <w:rFonts w:ascii="Segoe UI" w:hAnsi="Segoe UI"/>
-          <w:color w:val="334155"/>
-        </w:rPr>
+        <w:t>**כפתור מידע `ℹ️ איך המנטור עובד?`:**</w:t>
       </w:r>
     </w:p>
     <w:p>
       <w:pPr>
-        <w:bidi w:val="1"/>
-        <w:jc w:val="right"/>
+        <w:bidi/>
       </w:pPr>
       <w:r>
-        <w:rPr>
-          <w:rFonts w:ascii="Segoe UI" w:hAnsi="Segoe UI"/>
-          <w:color w:val="334155"/>
-        </w:rPr>
         <w:t>לחיצה על הכפתור פותחת חלון קופץ (Modal) המסביר בפירוט את 4 עקרונות הפדגוגיה של המנטור (למידה מותאמת, מניעת עומס, דוגמאות מהחיים ואתגרי המשך).</w:t>
       </w:r>
     </w:p>
     <w:p>
       <w:pPr>
         <w:pStyle w:val="ListBullet"/>
-        <w:bidi w:val="1"/>
-        <w:jc w:val="right"/>
+        <w:bidi/>
       </w:pPr>
       <w:r>
-        <w:rPr>
-          <w:rFonts w:ascii="Segoe UI" w:hAnsi="Segoe UI"/>
-          <w:color w:val="334155"/>
-        </w:rPr>
-      </w:r>
-      <w:r>
-        <w:rPr>
-          <w:rFonts w:ascii="Segoe UI" w:hAnsi="Segoe UI"/>
-          <w:b/>
-          <w:color w:val="1E293B"/>
-        </w:rPr>
-        <w:t>כפתור `⚡ העתק ופתח ב-Gemini`:</w:t>
-      </w:r>
-      <w:r>
-        <w:rPr>
-          <w:rFonts w:ascii="Segoe UI" w:hAnsi="Segoe UI"/>
-          <w:color w:val="334155"/>
-        </w:rPr>
+        <w:t>**כפתור `⚡ העתק ופתח ב-Gemini`:**</w:t>
       </w:r>
     </w:p>
     <w:p>
       <w:pPr>
-        <w:bidi w:val="1"/>
-        <w:jc w:val="right"/>
+        <w:bidi/>
       </w:pPr>
       <w:r>
-        <w:rPr>
-          <w:rFonts w:ascii="Segoe UI" w:hAnsi="Segoe UI"/>
-          <w:color w:val="334155"/>
-        </w:rPr>
         <w:t>מעתיק את הפרומפט המותאם אישית ללוח ופותח מיד את Google Gemini בלשונית חדשה. כל שנותר לך הוא ללחוץ `Ctrl + V` ולשלוח!</w:t>
       </w:r>
     </w:p>
     <w:p>
       <w:pPr>
         <w:pStyle w:val="ListBullet"/>
-        <w:bidi w:val="1"/>
-        <w:jc w:val="right"/>
+        <w:bidi/>
       </w:pPr>
       <w:r>
-        <w:rPr>
-          <w:rFonts w:ascii="Segoe UI" w:hAnsi="Segoe UI"/>
-          <w:color w:val="334155"/>
-        </w:rPr>
-      </w:r>
-      <w:r>
-        <w:rPr>
-          <w:rFonts w:ascii="Segoe UI" w:hAnsi="Segoe UI"/>
-          <w:b/>
-          <w:color w:val="1E293B"/>
-        </w:rPr>
-        <w:t>כפתור `📋 העתק פרומפט`:</w:t>
-      </w:r>
-      <w:r>
-        <w:rPr>
-          <w:rFonts w:ascii="Segoe UI" w:hAnsi="Segoe UI"/>
-          <w:color w:val="334155"/>
-        </w:rPr>
+        <w:t>**כפתור `📋 העתק פרומפט`:**</w:t>
       </w:r>
     </w:p>
     <w:p>
       <w:pPr>
-        <w:bidi w:val="1"/>
-        <w:jc w:val="right"/>
+        <w:bidi/>
       </w:pPr>
       <w:r>
-        <w:rPr>
-          <w:rFonts w:ascii="Segoe UI" w:hAnsi="Segoe UI"/>
-          <w:color w:val="334155"/>
-        </w:rPr>
         <w:t>מעתיק את הפרומפט בלבד (עם חיווי `✔️ הועתק!`) ללא פתיחת לשונית נוספת – מושלם אם ג'מיני כבר פתוח אצלך במסך מפוצל!</w:t>
       </w:r>
     </w:p>
     <w:p>
       <w:pPr>
         <w:pStyle w:val="ListBullet"/>
-        <w:bidi w:val="1"/>
-        <w:jc w:val="right"/>
+        <w:bidi/>
       </w:pPr>
       <w:r>
-        <w:rPr>
-          <w:rFonts w:ascii="Segoe UI" w:hAnsi="Segoe UI"/>
-          <w:color w:val="334155"/>
-        </w:rPr>
-      </w:r>
-      <w:r>
-        <w:rPr>
-          <w:rFonts w:ascii="Segoe UI" w:hAnsi="Segoe UI"/>
-          <w:b/>
-          <w:color w:val="1E293B"/>
-        </w:rPr>
-        <w:t>כפתור `👁️ הצג/הסתר פרומפט`:</w:t>
-      </w:r>
-      <w:r>
-        <w:rPr>
-          <w:rFonts w:ascii="Segoe UI" w:hAnsi="Segoe UI"/>
-          <w:color w:val="334155"/>
-        </w:rPr>
+        <w:t>**כפתור `👁️ הצג/הסתר פרומפט`:**</w:t>
       </w:r>
     </w:p>
     <w:p>
       <w:pPr>
-        <w:bidi w:val="1"/>
-        <w:jc w:val="right"/>
+        <w:bidi/>
       </w:pPr>
       <w:r>
-        <w:rPr>
-          <w:rFonts w:ascii="Segoe UI" w:hAnsi="Segoe UI"/>
-          <w:color w:val="334155"/>
-        </w:rPr>
         <w:t>פותח תיבת תצוגה מקדימה המאפשרת לך לקרוא את הפרומפט המלא לפני שליחתו או להעתיק ממנו רק חלקים.</w:t>
       </w:r>
     </w:p>
     <w:p>
       <w:pPr>
-        <w:pStyle w:val="Heading2"/>
-        <w:bidi w:val="1"/>
-        <w:jc w:val="right"/>
+        <w:pStyle w:val="Heading3"/>
+        <w:bidi/>
       </w:pPr>
       <w:r>
-        <w:rPr>
-          <w:rFonts w:ascii="Segoe UI" w:hAnsi="Segoe UI"/>
-          <w:b/>
-          <w:color w:val="1E40AF"/>
-          <w:sz w:val="32"/>
-        </w:rPr>
         <w:t>למה הפרומפט הזה ייחודי?</w:t>
       </w:r>
     </w:p>
     <w:p>
       <w:pPr>
-        <w:bidi w:val="1"/>
-        <w:jc w:val="right"/>
+        <w:bidi/>
       </w:pPr>
       <w:r>
-        <w:rPr>
-          <w:rFonts w:ascii="Segoe UI" w:hAnsi="Segoe UI"/>
-          <w:color w:val="334155"/>
-        </w:rPr>
-        <w:t xml:space="preserve">הפרומפט </w:t>
-      </w:r>
-      <w:r>
-        <w:rPr>
-          <w:rFonts w:ascii="Segoe UI" w:hAnsi="Segoe UI"/>
-          <w:b/>
-          <w:color w:val="0F172A"/>
-        </w:rPr>
-        <w:t>אינו סתם שאלה כללית</w:t>
-      </w:r>
-      <w:r>
-        <w:rPr>
-          <w:rFonts w:ascii="Segoe UI" w:hAnsi="Segoe UI"/>
-          <w:color w:val="334155"/>
-        </w:rPr>
-        <w:t xml:space="preserve">, אלא מייצר לג'מיני </w:t>
-      </w:r>
-      <w:r>
-        <w:rPr>
-          <w:rFonts w:ascii="Segoe UI" w:hAnsi="Segoe UI"/>
-          <w:b/>
-          <w:color w:val="0F172A"/>
-        </w:rPr>
-        <w:t>פרופיל למידה אישי ומדויק שלך</w:t>
-      </w:r>
-      <w:r>
-        <w:rPr>
-          <w:rFonts w:ascii="Segoe UI" w:hAnsi="Segoe UI"/>
-          <w:color w:val="334155"/>
-        </w:rPr>
-        <w:t>:</w:t>
+        <w:t>הפרומפט **אינו סתם שאלה כללית**, אלא מייצר לג'מיני **פרופיל למידה אישי ומדויק שלך**:</w:t>
       </w:r>
     </w:p>
     <w:p>
       <w:pPr>
-        <w:pStyle w:val="ListNumber"/>
-        <w:bidi w:val="1"/>
-        <w:jc w:val="right"/>
+        <w:bidi/>
       </w:pPr>
       <w:r>
-        <w:rPr>
-          <w:rFonts w:ascii="Segoe UI" w:hAnsi="Segoe UI"/>
-          <w:color w:val="334155"/>
-        </w:rPr>
-        <w:t xml:space="preserve">הוא מציין לג'מיני </w:t>
-      </w:r>
-      <w:r>
-        <w:rPr>
-          <w:rFonts w:ascii="Segoe UI" w:hAnsi="Segoe UI"/>
-          <w:b/>
-          <w:color w:val="1E293B"/>
-        </w:rPr>
-        <w:t>באיזה שלב בדיוק אתה נמצא</w:t>
-      </w:r>
-      <w:r>
-        <w:rPr>
-          <w:rFonts w:ascii="Segoe UI" w:hAnsi="Segoe UI"/>
-          <w:color w:val="334155"/>
-        </w:rPr>
-        <w:t xml:space="preserve"> ואת אחוז ההתקדמות שלך בקורס.</w:t>
+        <w:t>1. הוא מציין לג'מיני **באיזה שלב בדיוק אתה נמצא** ואת אחוז ההתקדמות שלך בקורס.</w:t>
       </w:r>
     </w:p>
     <w:p>
       <w:pPr>
-        <w:pStyle w:val="ListNumber"/>
-        <w:bidi w:val="1"/>
-        <w:jc w:val="right"/>
+        <w:bidi/>
       </w:pPr>
       <w:r>
-        <w:rPr>
-          <w:rFonts w:ascii="Segoe UI" w:hAnsi="Segoe UI"/>
-          <w:color w:val="334155"/>
-        </w:rPr>
-        <w:t xml:space="preserve">הוא מעביר לג'מיני </w:t>
-      </w:r>
-      <w:r>
-        <w:rPr>
-          <w:rFonts w:ascii="Segoe UI" w:hAnsi="Segoe UI"/>
-          <w:b/>
-          <w:color w:val="1E293B"/>
-        </w:rPr>
-        <w:t>רשימה מפורטת של כל הכלים שכבר למדת עד לשלב זה</w:t>
-      </w:r>
-      <w:r>
-        <w:rPr>
-          <w:rFonts w:ascii="Segoe UI" w:hAnsi="Segoe UI"/>
-          <w:color w:val="334155"/>
-        </w:rPr>
-        <w:t>.</w:t>
+        <w:t>2. הוא מעביר לג'מיני **רשימה מפורטת של כל הכלים שכבר למדת עד לשלב זה**.</w:t>
       </w:r>
     </w:p>
     <w:p>
       <w:pPr>
-        <w:pStyle w:val="ListNumber"/>
-        <w:bidi w:val="1"/>
-        <w:jc w:val="right"/>
+        <w:bidi/>
       </w:pPr>
       <w:r>
-        <w:rPr>
-          <w:rFonts w:ascii="Segoe UI" w:hAnsi="Segoe UI"/>
-          <w:color w:val="334155"/>
-        </w:rPr>
-      </w:r>
-      <w:r>
-        <w:rPr>
-          <w:rFonts w:ascii="Segoe UI" w:hAnsi="Segoe UI"/>
-          <w:b/>
-          <w:color w:val="1E293B"/>
-        </w:rPr>
-        <w:t>הוראה פדגוגית קריטית:</w:t>
-      </w:r>
-      <w:r>
-        <w:rPr>
-          <w:rFonts w:ascii="Segoe UI" w:hAnsi="Segoe UI"/>
-          <w:color w:val="334155"/>
-        </w:rPr>
-        <w:t xml:space="preserve"> הוא מורה לג'מיני במפורש: *"אל תשתמש במושגים שהתלמיד עדיין לא למד!"*. כך ג'מיני לא יבלבל אותך עם פונקציות מסובכות או מושגים מתקדמים מדי.</w:t>
+        <w:t>3. **הוראה פדגוגית קריטית:** הוא מורה לג'מיני במפורש: *"אל תשתמש במושגים שהתלמיד עדיין לא למד!"*. כך ג'מיני לא יבלבל אותך עם פונקציות מסובכות או מושגים מתקדמים מדי.</w:t>
       </w:r>
     </w:p>
     <w:p>
       <w:pPr>
-        <w:pStyle w:val="ListNumber"/>
-        <w:bidi w:val="1"/>
-        <w:jc w:val="right"/>
+        <w:bidi/>
       </w:pPr>
       <w:r>
-        <w:rPr>
-          <w:rFonts w:ascii="Segoe UI" w:hAnsi="Segoe UI"/>
-          <w:color w:val="334155"/>
-        </w:rPr>
-        <w:t>הוא מבקש מג'מיני:</w:t>
+        <w:t>4. הוא מבקש מג'מיני:</w:t>
       </w:r>
     </w:p>
     <w:p>
       <w:pPr>
         <w:pStyle w:val="ListBullet"/>
-        <w:bidi w:val="1"/>
-        <w:jc w:val="right"/>
+        <w:bidi/>
       </w:pPr>
       <w:r>
-        <w:rPr>
-          <w:rFonts w:ascii="Segoe UI" w:hAnsi="Segoe UI"/>
-          <w:color w:val="334155"/>
-        </w:rPr>
-      </w:r>
-      <w:r>
-        <w:rPr>
-          <w:rFonts w:ascii="Segoe UI" w:hAnsi="Segoe UI"/>
-          <w:b/>
-          <w:color w:val="1E293B"/>
-        </w:rPr>
-        <w:t>משל או אנלוגיה מהחיים</w:t>
-      </w:r>
-      <w:r>
-        <w:rPr>
-          <w:rFonts w:ascii="Segoe UI" w:hAnsi="Segoe UI"/>
-          <w:color w:val="334155"/>
-        </w:rPr>
-        <w:t xml:space="preserve"> להבנה אינטואיטיבית.</w:t>
+        <w:t>**משל או אנלוגיה מהחיים** להבנה אינטואיטיבית.</w:t>
       </w:r>
     </w:p>
     <w:p>
       <w:pPr>
         <w:pStyle w:val="ListBullet"/>
-        <w:bidi w:val="1"/>
-        <w:jc w:val="right"/>
+        <w:bidi/>
       </w:pPr>
       <w:r>
-        <w:rPr>
-          <w:rFonts w:ascii="Segoe UI" w:hAnsi="Segoe UI"/>
-          <w:color w:val="334155"/>
-        </w:rPr>
-      </w:r>
-      <w:r>
-        <w:rPr>
-          <w:rFonts w:ascii="Segoe UI" w:hAnsi="Segoe UI"/>
-          <w:b/>
-          <w:color w:val="1E293B"/>
-        </w:rPr>
-        <w:t>הסבר טכני מותאם לרמתך</w:t>
-      </w:r>
-      <w:r>
-        <w:rPr>
-          <w:rFonts w:ascii="Segoe UI" w:hAnsi="Segoe UI"/>
-          <w:color w:val="334155"/>
-        </w:rPr>
-        <w:t xml:space="preserve"> על מה פייתון עושה מאחורי הקלעים.</w:t>
+        <w:t>**הסבר טכני מותאם לרמתך** על מה פייתון עושה מאחורי הקלעים.</w:t>
       </w:r>
     </w:p>
     <w:p>
       <w:pPr>
         <w:pStyle w:val="ListBullet"/>
-        <w:bidi w:val="1"/>
-        <w:jc w:val="right"/>
+        <w:bidi/>
       </w:pPr>
       <w:r>
-        <w:rPr>
-          <w:rFonts w:ascii="Segoe UI" w:hAnsi="Segoe UI"/>
-          <w:color w:val="334155"/>
-        </w:rPr>
-      </w:r>
-      <w:r>
-        <w:rPr>
-          <w:rFonts w:ascii="Segoe UI" w:hAnsi="Segoe UI"/>
-          <w:b/>
-          <w:color w:val="1E293B"/>
-        </w:rPr>
-        <w:t>2 דוגמאות שימוש נוספות מהעולם האמיתי</w:t>
-      </w:r>
-      <w:r>
-        <w:rPr>
-          <w:rFonts w:ascii="Segoe UI" w:hAnsi="Segoe UI"/>
-          <w:color w:val="334155"/>
-        </w:rPr>
-        <w:t>.</w:t>
+        <w:t>**2 דוגמאות שימוש נוספות מהעולם האמיתי**.</w:t>
       </w:r>
     </w:p>
     <w:p>
       <w:pPr>
         <w:pStyle w:val="ListBullet"/>
-        <w:bidi w:val="1"/>
-        <w:jc w:val="right"/>
+        <w:bidi/>
       </w:pPr>
       <w:r>
-        <w:rPr>
-          <w:rFonts w:ascii="Segoe UI" w:hAnsi="Segoe UI"/>
-          <w:color w:val="334155"/>
-        </w:rPr>
-      </w:r>
-      <w:r>
-        <w:rPr>
-          <w:rFonts w:ascii="Segoe UI" w:hAnsi="Segoe UI"/>
-          <w:b/>
-          <w:color w:val="1E293B"/>
-        </w:rPr>
-        <w:t>חיבור מעודד לשלב הבא</w:t>
-      </w:r>
-      <w:r>
-        <w:rPr>
-          <w:rFonts w:ascii="Segoe UI" w:hAnsi="Segoe UI"/>
-          <w:color w:val="334155"/>
-        </w:rPr>
-        <w:t xml:space="preserve"> שיעזור לך להתמיד.</w:t>
+        <w:t>**חיבור מעודד לשלב הבא** שיעזור לך להתמיד.</w:t>
       </w:r>
     </w:p>
     <w:p>
       <w:pPr>
         <w:pStyle w:val="ListBullet"/>
-        <w:bidi w:val="1"/>
-        <w:jc w:val="right"/>
+        <w:bidi/>
       </w:pPr>
       <w:r>
-        <w:rPr>
-          <w:rFonts w:ascii="Segoe UI" w:hAnsi="Segoe UI"/>
-          <w:color w:val="334155"/>
-        </w:rPr>
-      </w:r>
-      <w:r>
-        <w:rPr>
-          <w:rFonts w:ascii="Segoe UI" w:hAnsi="Segoe UI"/>
-          <w:b/>
-          <w:color w:val="1E293B"/>
-        </w:rPr>
-        <w:t>אתגר חשיבה קטן</w:t>
-      </w:r>
-      <w:r>
-        <w:rPr>
-          <w:rFonts w:ascii="Segoe UI" w:hAnsi="Segoe UI"/>
-          <w:color w:val="334155"/>
-        </w:rPr>
-        <w:t xml:space="preserve"> עם רמז לבדיקת הבנה.</w:t>
+        <w:t>**אתגר חשיבה קטן** עם רמז לבדיקת הבנה.</w:t>
       </w:r>
     </w:p>
     <w:p>
       <w:pPr>
-        <w:pStyle w:val="Heading1"/>
-        <w:bidi w:val="1"/>
-        <w:jc w:val="right"/>
+        <w:bidi/>
       </w:pPr>
       <w:r>
-        <w:rPr>
-          <w:rFonts w:ascii="Segoe UI" w:hAnsi="Segoe UI"/>
-          <w:b/>
-          <w:color w:val="0E7490"/>
-          <w:sz w:val="40"/>
-        </w:rPr>
+        <w:t>---</w:t>
+      </w:r>
+    </w:p>
+    <w:p>
+      <w:pPr>
+        <w:pStyle w:val="Heading2"/>
+        <w:bidi/>
+      </w:pPr>
+      <w:r>
         <w:t>💾 זיכרון התקדמות וטיוטות (ללא צורך בהרשמה או דאטה-בייס)</w:t>
       </w:r>
     </w:p>
     <w:p>
       <w:pPr>
-        <w:bidi w:val="1"/>
-        <w:jc w:val="right"/>
+        <w:bidi/>
       </w:pPr>
       <w:r>
-        <w:rPr>
-          <w:rFonts w:ascii="Segoe UI" w:hAnsi="Segoe UI"/>
-          <w:color w:val="334155"/>
-        </w:rPr>
         <w:t>בניגוד למערכות הדורשות רישום מיילים, סיסמאות ובסיסי נתונים כבדים:</w:t>
       </w:r>
     </w:p>
     <w:p>
       <w:pPr>
         <w:pStyle w:val="ListBullet"/>
-        <w:bidi w:val="1"/>
-        <w:jc w:val="right"/>
+        <w:bidi/>
       </w:pPr>
       <w:r>
-        <w:rPr>
-          <w:rFonts w:ascii="Segoe UI" w:hAnsi="Segoe UI"/>
-          <w:color w:val="334155"/>
-        </w:rPr>
-      </w:r>
-      <w:r>
-        <w:rPr>
-          <w:rFonts w:ascii="Segoe UI" w:hAnsi="Segoe UI"/>
-          <w:b/>
-          <w:color w:val="1E293B"/>
-        </w:rPr>
-        <w:t>פרטיות מלאה:</w:t>
-      </w:r>
-      <w:r>
-        <w:rPr>
-          <w:rFonts w:ascii="Segoe UI" w:hAnsi="Segoe UI"/>
-          <w:color w:val="334155"/>
-        </w:rPr>
-        <w:t xml:space="preserve"> כל הנתונים נשמרים מקומית על הדפדפן שלך (`localStorage`). שום מידע אישי לא נשלח לשרת.</w:t>
+        <w:t>**פרטיות מלאה:** כל הנתונים נשמרים מקומית על הדפדפן שלך (`localStorage`). שום מידע אישי לא נשלח לשרת.</w:t>
       </w:r>
     </w:p>
     <w:p>
       <w:pPr>
         <w:pStyle w:val="ListBullet"/>
-        <w:bidi w:val="1"/>
-        <w:jc w:val="right"/>
+        <w:bidi/>
       </w:pPr>
       <w:r>
-        <w:rPr>
-          <w:rFonts w:ascii="Segoe UI" w:hAnsi="Segoe UI"/>
-          <w:color w:val="334155"/>
-        </w:rPr>
-      </w:r>
-      <w:r>
-        <w:rPr>
-          <w:rFonts w:ascii="Segoe UI" w:hAnsi="Segoe UI"/>
-          <w:b/>
-          <w:color w:val="1E293B"/>
-        </w:rPr>
-        <w:t>השלבים שהושלמו:</w:t>
-      </w:r>
-      <w:r>
-        <w:rPr>
-          <w:rFonts w:ascii="Segoe UI" w:hAnsi="Segoe UI"/>
-          <w:color w:val="334155"/>
-        </w:rPr>
-        <w:t xml:space="preserve"> כל שלב שעברת בהצלחה מסומן ב-V ירוק בסרגל הצד ונשמר לצמיתות בדפדפן.</w:t>
+        <w:t>**השלבים שהושלמו:** כל שלב שעברת בהצלחה מסומן ב-V ירוק בסרגל הצד ונשמר לצמיתות בדפדפן.</w:t>
       </w:r>
     </w:p>
     <w:p>
       <w:pPr>
         <w:pStyle w:val="ListBullet"/>
-        <w:bidi w:val="1"/>
-        <w:jc w:val="right"/>
+        <w:bidi/>
       </w:pPr>
       <w:r>
-        <w:rPr>
-          <w:rFonts w:ascii="Segoe UI" w:hAnsi="Segoe UI"/>
-          <w:color w:val="334155"/>
-        </w:rPr>
-      </w:r>
-      <w:r>
-        <w:rPr>
-          <w:rFonts w:ascii="Segoe UI" w:hAnsi="Segoe UI"/>
-          <w:b/>
-          <w:color w:val="1E293B"/>
-        </w:rPr>
-        <w:t>טיוטת קוד לכל שיעור:</w:t>
-      </w:r>
-      <w:r>
-        <w:rPr>
-          <w:rFonts w:ascii="Segoe UI" w:hAnsi="Segoe UI"/>
-          <w:color w:val="334155"/>
-        </w:rPr>
-        <w:t xml:space="preserve"> המערכת שומרת את הקוד האישי שלך בכל שלב. אם יצאת באמצע פתרון תרגיל, תחזור בדיוק לאותה נקודה.</w:t>
+        <w:t>**טיוטת קוד לכל שיעור:** המערכת שומרת את הקוד האישי שלך בכל שלב. אם יצאת באמצע פתרון תרגיל, תחזור בדיוק לאותה נקודה.</w:t>
       </w:r>
     </w:p>
     <w:p>
       <w:pPr>
         <w:pStyle w:val="ListBullet"/>
-        <w:bidi w:val="1"/>
-        <w:jc w:val="right"/>
+        <w:bidi/>
       </w:pPr>
       <w:r>
-        <w:rPr>
-          <w:rFonts w:ascii="Segoe UI" w:hAnsi="Segoe UI"/>
-          <w:color w:val="334155"/>
-        </w:rPr>
-      </w:r>
-      <w:r>
-        <w:rPr>
-          <w:rFonts w:ascii="Segoe UI" w:hAnsi="Segoe UI"/>
-          <w:b/>
-          <w:color w:val="1E293B"/>
-        </w:rPr>
-        <w:t>איפוס לפי הצורך:</w:t>
-      </w:r>
-      <w:r>
-        <w:rPr>
-          <w:rFonts w:ascii="Segoe UI" w:hAnsi="Segoe UI"/>
-          <w:color w:val="334155"/>
-        </w:rPr>
-        <w:t xml:space="preserve"> אם תרצה להתחיל שיעור מסוים מחדש, כפתור </w:t>
-      </w:r>
-      <w:r>
-        <w:rPr>
-          <w:rFonts w:ascii="Segoe UI" w:hAnsi="Segoe UI"/>
-          <w:b/>
-          <w:color w:val="1E293B"/>
-        </w:rPr>
-        <w:t>"🔄 איפוס קוד"</w:t>
-      </w:r>
-      <w:r>
-        <w:rPr>
-          <w:rFonts w:ascii="Segoe UI" w:hAnsi="Segoe UI"/>
-          <w:color w:val="334155"/>
-        </w:rPr>
-        <w:t xml:space="preserve"> יחזיר את ברירת המחדל של השיעור בלבד בלי לפגוע בהתקדמות הכללית.</w:t>
+        <w:t>**איפוס לפי הצורך:** אם תרצה להתחיל שיעור מסוים מחדש, כפתור **"🔄 איפוס קוד"** יחזיר את ברירת המחדל של השיעור בלבד בלי לפגוע בהתקדמות הכללית.</w:t>
       </w:r>
     </w:p>
     <w:p>
       <w:pPr>
-        <w:pStyle w:val="Heading1"/>
-        <w:bidi w:val="1"/>
-        <w:jc w:val="right"/>
+        <w:bidi/>
       </w:pPr>
       <w:r>
-        <w:rPr>
-          <w:rFonts w:ascii="Segoe UI" w:hAnsi="Segoe UI"/>
-          <w:b/>
-          <w:color w:val="0E7490"/>
-          <w:sz w:val="40"/>
-        </w:rPr>
+        <w:t>---</w:t>
+      </w:r>
+    </w:p>
+    <w:p>
+      <w:pPr>
+        <w:pStyle w:val="Heading2"/>
+        <w:bidi/>
+      </w:pPr>
+      <w:r>
         <w:t>🏆 טיפים ללמידה נכונה והתמדה</w:t>
       </w:r>
     </w:p>
     <w:p>
       <w:pPr>
-        <w:bidi w:val="1"/>
-        <w:jc w:val="right"/>
+        <w:bidi/>
       </w:pPr>
       <w:r>
-        <w:rPr>
-          <w:rFonts w:ascii="Segoe UI" w:hAnsi="Segoe UI"/>
-          <w:color w:val="334155"/>
-        </w:rPr>
         <w:t>תכנות הוא מיומנות מעשית – כמו נגינה על גיטרה או רכיבה על אופניים. הנה 5 כללי זהב שיבטיחו שתצליח:</w:t>
       </w:r>
     </w:p>
     <w:p>
       <w:pPr>
-        <w:pStyle w:val="Heading2"/>
-        <w:bidi w:val="1"/>
-        <w:jc w:val="right"/>
+        <w:pStyle w:val="Heading3"/>
+        <w:bidi/>
       </w:pPr>
       <w:r>
-        <w:rPr>
-          <w:rFonts w:ascii="Segoe UI" w:hAnsi="Segoe UI"/>
-          <w:b/>
-          <w:color w:val="1E40AF"/>
-          <w:sz w:val="32"/>
-        </w:rPr>
         <w:t>1. אל תעתיק סתם – תקליד בעצמך! ⌨️</w:t>
       </w:r>
     </w:p>
     <w:p>
       <w:pPr>
-        <w:bidi w:val="1"/>
-        <w:jc w:val="right"/>
+        <w:bidi/>
       </w:pPr>
       <w:r>
-        <w:rPr>
-          <w:rFonts w:ascii="Segoe UI" w:hAnsi="Segoe UI"/>
-          <w:color w:val="334155"/>
-        </w:rPr>
         <w:t>גם כשיש קוד מוכן או דוגמה, מחק אותה והקלד שורה אחר שורה בעצמך.</w:t>
       </w:r>
     </w:p>
     <w:p>
       <w:pPr>
-        <w:bidi w:val="1"/>
-        <w:jc w:val="right"/>
+        <w:bidi/>
       </w:pPr>
       <w:r>
-        <w:rPr>
-          <w:rFonts w:ascii="Segoe UI" w:hAnsi="Segoe UI"/>
-          <w:color w:val="334155"/>
-        </w:rPr>
         <w:t>ההקלדה בונה "זיכרון שריר" באצבעות, וגורמת למוח שלך לקלוט את מבנה הפקודות, הסוגריים והמירכאות.</w:t>
       </w:r>
     </w:p>
     <w:p>
       <w:pPr>
-        <w:pStyle w:val="Heading2"/>
-        <w:bidi w:val="1"/>
-        <w:jc w:val="right"/>
+        <w:pStyle w:val="Heading3"/>
+        <w:bidi/>
       </w:pPr>
       <w:r>
-        <w:rPr>
-          <w:rFonts w:ascii="Segoe UI" w:hAnsi="Segoe UI"/>
-          <w:b/>
-          <w:color w:val="1E40AF"/>
-          <w:sz w:val="32"/>
-        </w:rPr>
         <w:t>2. "שבור את הקוד" בכוונה 🔨</w:t>
       </w:r>
     </w:p>
     <w:p>
       <w:pPr>
-        <w:bidi w:val="1"/>
-        <w:jc w:val="right"/>
+        <w:bidi/>
       </w:pPr>
       <w:r>
-        <w:rPr>
-          <w:rFonts w:ascii="Segoe UI" w:hAnsi="Segoe UI"/>
-          <w:color w:val="334155"/>
-        </w:rPr>
         <w:t>אחת הדרכים הכי טובות ללמוד היא לראות מה קורה כשטועים:</w:t>
       </w:r>
     </w:p>
     <w:p>
       <w:pPr>
         <w:pStyle w:val="ListBullet"/>
-        <w:bidi w:val="1"/>
-        <w:jc w:val="right"/>
+        <w:bidi/>
       </w:pPr>
       <w:r>
-        <w:rPr>
-          <w:rFonts w:ascii="Segoe UI" w:hAnsi="Segoe UI"/>
-          <w:color w:val="334155"/>
-        </w:rPr>
         <w:t>מה קורה אם מוחקים את הנקודתיים בסוף ה-`if`?</w:t>
       </w:r>
     </w:p>
     <w:p>
       <w:pPr>
         <w:pStyle w:val="ListBullet"/>
-        <w:bidi w:val="1"/>
-        <w:jc w:val="right"/>
+        <w:bidi/>
       </w:pPr>
       <w:r>
-        <w:rPr>
-          <w:rFonts w:ascii="Segoe UI" w:hAnsi="Segoe UI"/>
-          <w:color w:val="334155"/>
-        </w:rPr>
         <w:t>מה קורה אם שוכחים לסגור סוגריים?</w:t>
       </w:r>
     </w:p>
     <w:p>
       <w:pPr>
         <w:pStyle w:val="ListBullet"/>
-        <w:bidi w:val="1"/>
-        <w:jc w:val="right"/>
+        <w:bidi/>
       </w:pPr>
       <w:r>
-        <w:rPr>
-          <w:rFonts w:ascii="Segoe UI" w:hAnsi="Segoe UI"/>
-          <w:color w:val="334155"/>
-        </w:rPr>
         <w:t>מה קורה אם מחברים טקסט ומספר בלי המרה?</w:t>
       </w:r>
     </w:p>
     <w:p>
       <w:pPr>
-        <w:bidi w:val="1"/>
-        <w:jc w:val="right"/>
+        <w:bidi/>
       </w:pPr>
       <w:r>
-        <w:rPr>
-          <w:rFonts w:ascii="Segoe UI" w:hAnsi="Segoe UI"/>
-          <w:color w:val="334155"/>
-        </w:rPr>
         <w:t>כשרואים את הודעת השגיאה בעברית, מבינים בדיוק למה פייתון זקוקה לכל תו.</w:t>
       </w:r>
     </w:p>
     <w:p>
       <w:pPr>
-        <w:pStyle w:val="Heading2"/>
-        <w:bidi w:val="1"/>
-        <w:jc w:val="right"/>
+        <w:pStyle w:val="Heading3"/>
+        <w:bidi/>
       </w:pPr>
       <w:r>
-        <w:rPr>
-          <w:rFonts w:ascii="Segoe UI" w:hAnsi="Segoe UI"/>
-          <w:b/>
-          <w:color w:val="1E40AF"/>
-          <w:sz w:val="32"/>
-        </w:rPr>
         <w:t>3. עקרון ה-20 דקות ביום (התמדה מנצחת עומס!) ⏳</w:t>
       </w:r>
     </w:p>
     <w:p>
       <w:pPr>
-        <w:bidi w:val="1"/>
-        <w:jc w:val="right"/>
+        <w:bidi/>
       </w:pPr>
       <w:r>
-        <w:rPr>
-          <w:rFonts w:ascii="Segoe UI" w:hAnsi="Segoe UI"/>
-          <w:color w:val="334155"/>
-        </w:rPr>
-        <w:t xml:space="preserve">עדיף בהרבה לפתור </w:t>
-      </w:r>
-      <w:r>
-        <w:rPr>
-          <w:rFonts w:ascii="Segoe UI" w:hAnsi="Segoe UI"/>
-          <w:b/>
-          <w:color w:val="0F172A"/>
-        </w:rPr>
-        <w:t>2–3 שלבים ביום בכל יום</w:t>
-      </w:r>
-      <w:r>
-        <w:rPr>
-          <w:rFonts w:ascii="Segoe UI" w:hAnsi="Segoe UI"/>
-          <w:color w:val="334155"/>
-        </w:rPr>
-        <w:t>, מאשר לשבת 5 שעות ברצף פעם בשבוע.</w:t>
+        <w:t>עדיף בהרבה לפתור **2–3 שלבים ביום בכל יום**, מאשר לשבת 5 שעות ברצף פעם בשבוע.</w:t>
       </w:r>
     </w:p>
     <w:p>
       <w:pPr>
-        <w:bidi w:val="1"/>
-        <w:jc w:val="right"/>
+        <w:bidi/>
       </w:pPr>
       <w:r>
-        <w:rPr>
-          <w:rFonts w:ascii="Segoe UI" w:hAnsi="Segoe UI"/>
-          <w:color w:val="334155"/>
-        </w:rPr>
         <w:t>המוח מעבד ומטמיע את מושגי התכנות בזמן מנוחה בין יום ליום. קביעות קטנה מובילה להישגים ענקיים!</w:t>
       </w:r>
     </w:p>
     <w:p>
       <w:pPr>
-        <w:pStyle w:val="Heading2"/>
-        <w:bidi w:val="1"/>
-        <w:jc w:val="right"/>
+        <w:pStyle w:val="Heading3"/>
+        <w:bidi/>
       </w:pPr>
       <w:r>
-        <w:rPr>
-          <w:rFonts w:ascii="Segoe UI" w:hAnsi="Segoe UI"/>
-          <w:b/>
-          <w:color w:val="1E40AF"/>
-          <w:sz w:val="32"/>
-        </w:rPr>
         <w:t>4. נתקעת? השתמש בשילוש הקדוש 🪜</w:t>
       </w:r>
     </w:p>
     <w:p>
       <w:pPr>
-        <w:bidi w:val="1"/>
-        <w:jc w:val="right"/>
+        <w:bidi/>
       </w:pPr>
       <w:r>
-        <w:rPr>
-          <w:rFonts w:ascii="Segoe UI" w:hAnsi="Segoe UI"/>
-          <w:color w:val="334155"/>
-        </w:rPr>
         <w:t>אם שלב מסוים לא עובר:</w:t>
       </w:r>
     </w:p>
     <w:p>
       <w:pPr>
-        <w:pStyle w:val="ListNumber"/>
-        <w:bidi w:val="1"/>
-        <w:jc w:val="right"/>
+        <w:bidi/>
       </w:pPr>
       <w:r>
-        <w:rPr>
-          <w:rFonts w:ascii="Segoe UI" w:hAnsi="Segoe UI"/>
-          <w:color w:val="334155"/>
-        </w:rPr>
-        <w:t>קרא שוב את ה-</w:t>
-      </w:r>
-      <w:r>
-        <w:rPr>
-          <w:rFonts w:ascii="Segoe UI" w:hAnsi="Segoe UI"/>
-          <w:b/>
-          <w:color w:val="1E293B"/>
-        </w:rPr>
-        <w:t>💡 טיפ</w:t>
-      </w:r>
-      <w:r>
-        <w:rPr>
-          <w:rFonts w:ascii="Segoe UI" w:hAnsi="Segoe UI"/>
-          <w:color w:val="334155"/>
-        </w:rPr>
-        <w:t xml:space="preserve"> ואת כפתור ה-</w:t>
-      </w:r>
-      <w:r>
-        <w:rPr>
-          <w:rFonts w:ascii="Segoe UI" w:hAnsi="Segoe UI"/>
-          <w:b/>
-          <w:color w:val="1E293B"/>
-        </w:rPr>
-        <w:t>💡 רמז</w:t>
-      </w:r>
-      <w:r>
-        <w:rPr>
-          <w:rFonts w:ascii="Segoe UI" w:hAnsi="Segoe UI"/>
-          <w:color w:val="334155"/>
-        </w:rPr>
-        <w:t>.</w:t>
+        <w:t>1. קרא שוב את ה-**💡 טיפ** ואת כפתור ה-**💡 רמז**.</w:t>
       </w:r>
     </w:p>
     <w:p>
       <w:pPr>
-        <w:pStyle w:val="ListNumber"/>
-        <w:bidi w:val="1"/>
-        <w:jc w:val="right"/>
+        <w:bidi/>
       </w:pPr>
       <w:r>
-        <w:rPr>
-          <w:rFonts w:ascii="Segoe UI" w:hAnsi="Segoe UI"/>
-          <w:color w:val="334155"/>
-        </w:rPr>
-        <w:t xml:space="preserve">בדוק את </w:t>
-      </w:r>
-      <w:r>
-        <w:rPr>
-          <w:rFonts w:ascii="Segoe UI" w:hAnsi="Segoe UI"/>
-          <w:b/>
-          <w:color w:val="1E293B"/>
-        </w:rPr>
-        <w:t>מסוף הפלט</w:t>
-      </w:r>
-      <w:r>
-        <w:rPr>
-          <w:rFonts w:ascii="Segoe UI" w:hAnsi="Segoe UI"/>
-          <w:color w:val="334155"/>
-        </w:rPr>
-        <w:t xml:space="preserve"> – הוא מסביר בדיוק באיזו שורה קרתה התקלה ואיך לתקן אותה.</w:t>
+        <w:t>2. בדוק את **מסוף הפלט** – הוא מסביר בדיוק באיזו שורה קרתה התקלה ואיך לתקן אותה.</w:t>
       </w:r>
     </w:p>
     <w:p>
       <w:pPr>
-        <w:pStyle w:val="ListNumber"/>
-        <w:bidi w:val="1"/>
-        <w:jc w:val="right"/>
+        <w:bidi/>
       </w:pPr>
       <w:r>
-        <w:rPr>
-          <w:rFonts w:ascii="Segoe UI" w:hAnsi="Segoe UI"/>
-          <w:color w:val="334155"/>
-        </w:rPr>
-        <w:t>העתק את הפרומפט ל-</w:t>
-      </w:r>
-      <w:r>
-        <w:rPr>
-          <w:rFonts w:ascii="Segoe UI" w:hAnsi="Segoe UI"/>
-          <w:b/>
-          <w:color w:val="1E293B"/>
-        </w:rPr>
-        <w:t>Gemini</w:t>
-      </w:r>
-      <w:r>
-        <w:rPr>
-          <w:rFonts w:ascii="Segoe UI" w:hAnsi="Segoe UI"/>
-          <w:color w:val="334155"/>
-        </w:rPr>
-        <w:t xml:space="preserve"> ובקש ממנו הכוונה נוספת.</w:t>
+        <w:t>3. העתק את הפרומפט ל-**Gemini** ובקש ממנו הכוונה נוספת.</w:t>
       </w:r>
     </w:p>
     <w:p>
       <w:pPr>
-        <w:pStyle w:val="Heading2"/>
-        <w:bidi w:val="1"/>
-        <w:jc w:val="right"/>
+        <w:pStyle w:val="Heading3"/>
+        <w:bidi/>
       </w:pPr>
       <w:r>
-        <w:rPr>
-          <w:rFonts w:ascii="Segoe UI" w:hAnsi="Segoe UI"/>
-          <w:b/>
-          <w:color w:val="1E40AF"/>
-          <w:sz w:val="32"/>
-        </w:rPr>
         <w:t>5. שחק עם הקוד מעבר לנדרש 🎨</w:t>
       </w:r>
     </w:p>
     <w:p>
       <w:pPr>
-        <w:bidi w:val="1"/>
-        <w:jc w:val="right"/>
+        <w:bidi/>
       </w:pPr>
       <w:r>
-        <w:rPr>
-          <w:rFonts w:ascii="Segoe UI" w:hAnsi="Segoe UI"/>
-          <w:color w:val="334155"/>
-        </w:rPr>
         <w:t>עברת את השלב בהצלחה? מעולה! לפני שאתה לוחץ "לשלב הבא", נסה לשנות משהו:</w:t>
       </w:r>
     </w:p>
     <w:p>
       <w:pPr>
         <w:pStyle w:val="ListBullet"/>
-        <w:bidi w:val="1"/>
-        <w:jc w:val="right"/>
+        <w:bidi/>
       </w:pPr>
       <w:r>
-        <w:rPr>
-          <w:rFonts w:ascii="Segoe UI" w:hAnsi="Segoe UI"/>
-          <w:color w:val="334155"/>
-        </w:rPr>
         <w:t>שנה את המספרים.</w:t>
       </w:r>
     </w:p>
     <w:p>
       <w:pPr>
         <w:pStyle w:val="ListBullet"/>
-        <w:bidi w:val="1"/>
-        <w:jc w:val="right"/>
+        <w:bidi/>
       </w:pPr>
       <w:r>
-        <w:rPr>
-          <w:rFonts w:ascii="Segoe UI" w:hAnsi="Segoe UI"/>
-          <w:color w:val="334155"/>
-        </w:rPr>
         <w:t>הוסף תנאי נוסף.</w:t>
       </w:r>
     </w:p>
     <w:p>
       <w:pPr>
         <w:pStyle w:val="ListBullet"/>
-        <w:bidi w:val="1"/>
-        <w:jc w:val="right"/>
+        <w:bidi/>
       </w:pPr>
       <w:r>
-        <w:rPr>
-          <w:rFonts w:ascii="Segoe UI" w:hAnsi="Segoe UI"/>
-          <w:color w:val="334155"/>
-        </w:rPr>
         <w:t>שנה את ההודעות המודפסות.</w:t>
       </w:r>
     </w:p>
     <w:p>
       <w:pPr>
-        <w:bidi w:val="1"/>
-        <w:jc w:val="right"/>
+        <w:bidi/>
       </w:pPr>
       <w:r>
-        <w:rPr>
-          <w:rFonts w:ascii="Segoe UI" w:hAnsi="Segoe UI"/>
-          <w:color w:val="334155"/>
-        </w:rPr>
         <w:t>הניסויים האלה הם המקום שבו ההבנה הופכת לשליטה אמיתית.</w:t>
       </w:r>
     </w:p>
     <w:p>
       <w:pPr>
-        <w:pStyle w:val="Heading1"/>
-        <w:bidi w:val="1"/>
-        <w:jc w:val="right"/>
+        <w:bidi/>
       </w:pPr>
       <w:r>
-        <w:rPr>
-          <w:rFonts w:ascii="Segoe UI" w:hAnsi="Segoe UI"/>
-          <w:b/>
-          <w:color w:val="0E7490"/>
-          <w:sz w:val="40"/>
-        </w:rPr>
-        <w:t>🗺️ מפת המסלול המלא (42 שלבים ב-14 פרקים)</w:t>
+        <w:t>---</w:t>
       </w:r>
     </w:p>
-    <w:tbl>
-      <w:tblPr>
-        <w:tblW w:type="auto" w:w="0"/>
-        <w:jc w:val="center"/>
-        <w:tblLook w:firstColumn="1" w:firstRow="1" w:lastColumn="0" w:lastRow="0" w:noHBand="0" w:noVBand="1" w:val="04A0"/>
-        <w:bidiVisual/>
-      </w:tblPr>
-      <w:tblGrid>
-        <w:gridCol w:w="3312"/>
-        <w:gridCol w:w="3312"/>
-        <w:gridCol w:w="3312"/>
-      </w:tblGrid>
-      <w:tr>
-        <w:tc>
-          <w:tcPr>
-            <w:tcW w:type="dxa" w:w="3312"/>
-            <w:shd w:fill="0F172A"/>
-          </w:tcPr>
-          <w:p>
-            <w:pPr>
-              <w:bidi w:val="1"/>
-              <w:jc w:val="right"/>
-            </w:pPr>
-            <w:r>
-              <w:rPr>
-                <w:rFonts w:ascii="Segoe UI" w:hAnsi="Segoe UI"/>
-                <w:b/>
-                <w:color w:val="FFFFFF"/>
-                <w:sz w:val="21"/>
-              </w:rPr>
-              <w:t>פרק</w:t>
-            </w:r>
-          </w:p>
-        </w:tc>
-        <w:tc>
-          <w:tcPr>
-            <w:tcW w:type="dxa" w:w="3312"/>
-            <w:shd w:fill="0F172A"/>
-          </w:tcPr>
-          <w:p>
-            <w:pPr>
-              <w:bidi w:val="1"/>
-              <w:jc w:val="right"/>
-            </w:pPr>
-            <w:r>
-              <w:rPr>
-                <w:rFonts w:ascii="Segoe UI" w:hAnsi="Segoe UI"/>
-                <w:b/>
-                <w:color w:val="FFFFFF"/>
-                <w:sz w:val="21"/>
-              </w:rPr>
-              <w:t>נושא</w:t>
-            </w:r>
-          </w:p>
-        </w:tc>
-        <w:tc>
-          <w:tcPr>
-            <w:tcW w:type="dxa" w:w="3312"/>
-            <w:shd w:fill="0F172A"/>
-          </w:tcPr>
-          <w:p>
-            <w:pPr>
-              <w:bidi w:val="1"/>
-              <w:jc w:val="right"/>
-            </w:pPr>
-            <w:r>
-              <w:rPr>
-                <w:rFonts w:ascii="Segoe UI" w:hAnsi="Segoe UI"/>
-                <w:b/>
-                <w:color w:val="FFFFFF"/>
-                <w:sz w:val="21"/>
-              </w:rPr>
-              <w:t>שלבים</w:t>
-            </w:r>
-          </w:p>
-        </w:tc>
-      </w:tr>
-      <w:tr>
-        <w:tc>
-          <w:tcPr>
-            <w:tcW w:type="dxa" w:w="3312"/>
-            <w:shd w:fill="F8FAFC"/>
-          </w:tcPr>
-          <w:p>
-            <w:pPr>
-              <w:bidi w:val="1"/>
-              <w:jc w:val="right"/>
-            </w:pPr>
-            <w:r>
-              <w:rPr>
-                <w:rFonts w:ascii="Segoe UI" w:hAnsi="Segoe UI"/>
-                <w:color w:val="1E293B"/>
-                <w:sz w:val="21"/>
-              </w:rPr>
-              <w:t>פרק 1</w:t>
-            </w:r>
-          </w:p>
-        </w:tc>
-        <w:tc>
-          <w:tcPr>
-            <w:tcW w:type="dxa" w:w="3312"/>
-            <w:shd w:fill="F8FAFC"/>
-          </w:tcPr>
-          <w:p>
-            <w:pPr>
-              <w:bidi w:val="1"/>
-              <w:jc w:val="right"/>
-            </w:pPr>
-            <w:r>
-              <w:rPr>
-                <w:rFonts w:ascii="Segoe UI" w:hAnsi="Segoe UI"/>
-                <w:color w:val="1E293B"/>
-                <w:sz w:val="21"/>
-              </w:rPr>
-              <w:t>צעדים ראשונים</w:t>
-            </w:r>
-          </w:p>
-        </w:tc>
-        <w:tc>
-          <w:tcPr>
-            <w:tcW w:type="dxa" w:w="3312"/>
-            <w:shd w:fill="F8FAFC"/>
-          </w:tcPr>
-          <w:p>
-            <w:pPr>
-              <w:bidi w:val="1"/>
-              <w:jc w:val="right"/>
-            </w:pPr>
-            <w:r>
-              <w:rPr>
-                <w:rFonts w:ascii="Segoe UI" w:hAnsi="Segoe UI"/>
-                <w:color w:val="1E293B"/>
-                <w:sz w:val="21"/>
-              </w:rPr>
-              <w:t>שלבים 1–3: שלום עולם, חישובים, הדפסת ערכים מרובים</w:t>
-            </w:r>
-          </w:p>
-        </w:tc>
-      </w:tr>
-      <w:tr>
-        <w:tc>
-          <w:tcPr>
-            <w:tcW w:type="dxa" w:w="3312"/>
-          </w:tcPr>
-          <w:p>
-            <w:pPr>
-              <w:bidi w:val="1"/>
-              <w:jc w:val="right"/>
-            </w:pPr>
-            <w:r>
-              <w:rPr>
-                <w:rFonts w:ascii="Segoe UI" w:hAnsi="Segoe UI"/>
-                <w:color w:val="1E293B"/>
-                <w:sz w:val="21"/>
-              </w:rPr>
-              <w:t>פרק 2</w:t>
-            </w:r>
-          </w:p>
-        </w:tc>
-        <w:tc>
-          <w:tcPr>
-            <w:tcW w:type="dxa" w:w="3312"/>
-          </w:tcPr>
-          <w:p>
-            <w:pPr>
-              <w:bidi w:val="1"/>
-              <w:jc w:val="right"/>
-            </w:pPr>
-            <w:r>
-              <w:rPr>
-                <w:rFonts w:ascii="Segoe UI" w:hAnsi="Segoe UI"/>
-                <w:color w:val="1E293B"/>
-                <w:sz w:val="21"/>
-              </w:rPr>
-              <w:t>משתנים וסוגי נתונים</w:t>
-            </w:r>
-          </w:p>
-        </w:tc>
-        <w:tc>
-          <w:tcPr>
-            <w:tcW w:type="dxa" w:w="3312"/>
-          </w:tcPr>
-          <w:p>
-            <w:pPr>
-              <w:bidi w:val="1"/>
-              <w:jc w:val="right"/>
-            </w:pPr>
-            <w:r>
-              <w:rPr>
-                <w:rFonts w:ascii="Segoe UI" w:hAnsi="Segoe UI"/>
-                <w:color w:val="1E293B"/>
-                <w:sz w:val="21"/>
-              </w:rPr>
-              <w:t>שלבים 4–7: משתנים, f-strings, המרות int/str, בוליאנים</w:t>
-            </w:r>
-          </w:p>
-        </w:tc>
-      </w:tr>
-      <w:tr>
-        <w:tc>
-          <w:tcPr>
-            <w:tcW w:type="dxa" w:w="3312"/>
-            <w:shd w:fill="F8FAFC"/>
-          </w:tcPr>
-          <w:p>
-            <w:pPr>
-              <w:bidi w:val="1"/>
-              <w:jc w:val="right"/>
-            </w:pPr>
-            <w:r>
-              <w:rPr>
-                <w:rFonts w:ascii="Segoe UI" w:hAnsi="Segoe UI"/>
-                <w:color w:val="1E293B"/>
-                <w:sz w:val="21"/>
-              </w:rPr>
-              <w:t>פרק 3</w:t>
-            </w:r>
-          </w:p>
-        </w:tc>
-        <w:tc>
-          <w:tcPr>
-            <w:tcW w:type="dxa" w:w="3312"/>
-            <w:shd w:fill="F8FAFC"/>
-          </w:tcPr>
-          <w:p>
-            <w:pPr>
-              <w:bidi w:val="1"/>
-              <w:jc w:val="right"/>
-            </w:pPr>
-            <w:r>
-              <w:rPr>
-                <w:rFonts w:ascii="Segoe UI" w:hAnsi="Segoe UI"/>
-                <w:color w:val="1E293B"/>
-                <w:sz w:val="21"/>
-              </w:rPr>
-              <w:t>תנאים והחלטות</w:t>
-            </w:r>
-          </w:p>
-        </w:tc>
-        <w:tc>
-          <w:tcPr>
-            <w:tcW w:type="dxa" w:w="3312"/>
-            <w:shd w:fill="F8FAFC"/>
-          </w:tcPr>
-          <w:p>
-            <w:pPr>
-              <w:bidi w:val="1"/>
-              <w:jc w:val="right"/>
-            </w:pPr>
-            <w:r>
-              <w:rPr>
-                <w:rFonts w:ascii="Segoe UI" w:hAnsi="Segoe UI"/>
-                <w:color w:val="1E293B"/>
-                <w:sz w:val="21"/>
-              </w:rPr>
-              <w:t>שלבים 8–11: תנאי if, if-else, elif, תנאים מורכבים and/or</w:t>
-            </w:r>
-          </w:p>
-        </w:tc>
-      </w:tr>
-      <w:tr>
-        <w:tc>
-          <w:tcPr>
-            <w:tcW w:type="dxa" w:w="3312"/>
-          </w:tcPr>
-          <w:p>
-            <w:pPr>
-              <w:bidi w:val="1"/>
-              <w:jc w:val="right"/>
-            </w:pPr>
-            <w:r>
-              <w:rPr>
-                <w:rFonts w:ascii="Segoe UI" w:hAnsi="Segoe UI"/>
-                <w:color w:val="1E293B"/>
-                <w:sz w:val="21"/>
-              </w:rPr>
-              <w:t>פרק 4</w:t>
-            </w:r>
-          </w:p>
-        </w:tc>
-        <w:tc>
-          <w:tcPr>
-            <w:tcW w:type="dxa" w:w="3312"/>
-          </w:tcPr>
-          <w:p>
-            <w:pPr>
-              <w:bidi w:val="1"/>
-              <w:jc w:val="right"/>
-            </w:pPr>
-            <w:r>
-              <w:rPr>
-                <w:rFonts w:ascii="Segoe UI" w:hAnsi="Segoe UI"/>
-                <w:color w:val="1E293B"/>
-                <w:sz w:val="21"/>
-              </w:rPr>
-              <w:t>לולאות וחזרות</w:t>
-            </w:r>
-          </w:p>
-        </w:tc>
-        <w:tc>
-          <w:tcPr>
-            <w:tcW w:type="dxa" w:w="3312"/>
-          </w:tcPr>
-          <w:p>
-            <w:pPr>
-              <w:bidi w:val="1"/>
-              <w:jc w:val="right"/>
-            </w:pPr>
-            <w:r>
-              <w:rPr>
-                <w:rFonts w:ascii="Segoe UI" w:hAnsi="Segoe UI"/>
-                <w:color w:val="1E293B"/>
-                <w:sz w:val="21"/>
-              </w:rPr>
-              <w:t>שלבים 12–15: לולאת for, טווחי range, לולאת while, עצירה עם break</w:t>
-            </w:r>
-          </w:p>
-        </w:tc>
-      </w:tr>
-      <w:tr>
-        <w:tc>
-          <w:tcPr>
-            <w:tcW w:type="dxa" w:w="3312"/>
-            <w:shd w:fill="F8FAFC"/>
-          </w:tcPr>
-          <w:p>
-            <w:pPr>
-              <w:bidi w:val="1"/>
-              <w:jc w:val="right"/>
-            </w:pPr>
-            <w:r>
-              <w:rPr>
-                <w:rFonts w:ascii="Segoe UI" w:hAnsi="Segoe UI"/>
-                <w:color w:val="1E293B"/>
-                <w:sz w:val="21"/>
-              </w:rPr>
-              <w:t>פרק 5</w:t>
-            </w:r>
-          </w:p>
-        </w:tc>
-        <w:tc>
-          <w:tcPr>
-            <w:tcW w:type="dxa" w:w="3312"/>
-            <w:shd w:fill="F8FAFC"/>
-          </w:tcPr>
-          <w:p>
-            <w:pPr>
-              <w:bidi w:val="1"/>
-              <w:jc w:val="right"/>
-            </w:pPr>
-            <w:r>
-              <w:rPr>
-                <w:rFonts w:ascii="Segoe UI" w:hAnsi="Segoe UI"/>
-                <w:color w:val="1E293B"/>
-                <w:sz w:val="21"/>
-              </w:rPr>
-              <w:t>רשימות (Lists)</w:t>
-            </w:r>
-          </w:p>
-        </w:tc>
-        <w:tc>
-          <w:tcPr>
-            <w:tcW w:type="dxa" w:w="3312"/>
-            <w:shd w:fill="F8FAFC"/>
-          </w:tcPr>
-          <w:p>
-            <w:pPr>
-              <w:bidi w:val="1"/>
-              <w:jc w:val="right"/>
-            </w:pPr>
-            <w:r>
-              <w:rPr>
-                <w:rFonts w:ascii="Segoe UI" w:hAnsi="Segoe UI"/>
-                <w:color w:val="1E293B"/>
-                <w:sz w:val="21"/>
-              </w:rPr>
-              <w:t>שלבים 16–18: אינדקסים, append, len, סריקה בלולאה</w:t>
-            </w:r>
-          </w:p>
-        </w:tc>
-      </w:tr>
-      <w:tr>
-        <w:tc>
-          <w:tcPr>
-            <w:tcW w:type="dxa" w:w="3312"/>
-          </w:tcPr>
-          <w:p>
-            <w:pPr>
-              <w:bidi w:val="1"/>
-              <w:jc w:val="right"/>
-            </w:pPr>
-            <w:r>
-              <w:rPr>
-                <w:rFonts w:ascii="Segoe UI" w:hAnsi="Segoe UI"/>
-                <w:color w:val="1E293B"/>
-                <w:sz w:val="21"/>
-              </w:rPr>
-              <w:t>פרק 6</w:t>
-            </w:r>
-          </w:p>
-        </w:tc>
-        <w:tc>
-          <w:tcPr>
-            <w:tcW w:type="dxa" w:w="3312"/>
-          </w:tcPr>
-          <w:p>
-            <w:pPr>
-              <w:bidi w:val="1"/>
-              <w:jc w:val="right"/>
-            </w:pPr>
-            <w:r>
-              <w:rPr>
-                <w:rFonts w:ascii="Segoe UI" w:hAnsi="Segoe UI"/>
-                <w:color w:val="1E293B"/>
-                <w:sz w:val="21"/>
-              </w:rPr>
-              <w:t>מילונים (Dictionaries)</w:t>
-            </w:r>
-          </w:p>
-        </w:tc>
-        <w:tc>
-          <w:tcPr>
-            <w:tcW w:type="dxa" w:w="3312"/>
-          </w:tcPr>
-          <w:p>
-            <w:pPr>
-              <w:bidi w:val="1"/>
-              <w:jc w:val="right"/>
-            </w:pPr>
-            <w:r>
-              <w:rPr>
-                <w:rFonts w:ascii="Segoe UI" w:hAnsi="Segoe UI"/>
-                <w:color w:val="1E293B"/>
-                <w:sz w:val="21"/>
-              </w:rPr>
-              <w:t>שלבים 19–20: מבנה מפתח-ערך, שליפת נתונים, עדכון והוספה</w:t>
-            </w:r>
-          </w:p>
-        </w:tc>
-      </w:tr>
-      <w:tr>
-        <w:tc>
-          <w:tcPr>
-            <w:tcW w:type="dxa" w:w="3312"/>
-            <w:shd w:fill="F8FAFC"/>
-          </w:tcPr>
-          <w:p>
-            <w:pPr>
-              <w:bidi w:val="1"/>
-              <w:jc w:val="right"/>
-            </w:pPr>
-            <w:r>
-              <w:rPr>
-                <w:rFonts w:ascii="Segoe UI" w:hAnsi="Segoe UI"/>
-                <w:color w:val="1E293B"/>
-                <w:sz w:val="21"/>
-              </w:rPr>
-              <w:t>פרק 7</w:t>
-            </w:r>
-          </w:p>
-        </w:tc>
-        <w:tc>
-          <w:tcPr>
-            <w:tcW w:type="dxa" w:w="3312"/>
-            <w:shd w:fill="F8FAFC"/>
-          </w:tcPr>
-          <w:p>
-            <w:pPr>
-              <w:bidi w:val="1"/>
-              <w:jc w:val="right"/>
-            </w:pPr>
-            <w:r>
-              <w:rPr>
-                <w:rFonts w:ascii="Segoe UI" w:hAnsi="Segoe UI"/>
-                <w:color w:val="1E293B"/>
-                <w:sz w:val="21"/>
-              </w:rPr>
-              <w:t>פונקציות (Functions)</w:t>
-            </w:r>
-          </w:p>
-        </w:tc>
-        <w:tc>
-          <w:tcPr>
-            <w:tcW w:type="dxa" w:w="3312"/>
-            <w:shd w:fill="F8FAFC"/>
-          </w:tcPr>
-          <w:p>
-            <w:pPr>
-              <w:bidi w:val="1"/>
-              <w:jc w:val="right"/>
-            </w:pPr>
-            <w:r>
-              <w:rPr>
-                <w:rFonts w:ascii="Segoe UI" w:hAnsi="Segoe UI"/>
-                <w:color w:val="1E293B"/>
-                <w:sz w:val="21"/>
-              </w:rPr>
-              <w:t>שלבים 21–23: הגדרה עם def, פרמטרים, החזרת ערך עם return</w:t>
-            </w:r>
-          </w:p>
-        </w:tc>
-      </w:tr>
-      <w:tr>
-        <w:tc>
-          <w:tcPr>
-            <w:tcW w:type="dxa" w:w="3312"/>
-          </w:tcPr>
-          <w:p>
-            <w:pPr>
-              <w:bidi w:val="1"/>
-              <w:jc w:val="right"/>
-            </w:pPr>
-            <w:r>
-              <w:rPr>
-                <w:rFonts w:ascii="Segoe UI" w:hAnsi="Segoe UI"/>
-                <w:color w:val="1E293B"/>
-                <w:sz w:val="21"/>
-              </w:rPr>
-              <w:t>פרק 8</w:t>
-            </w:r>
-          </w:p>
-        </w:tc>
-        <w:tc>
-          <w:tcPr>
-            <w:tcW w:type="dxa" w:w="3312"/>
-          </w:tcPr>
-          <w:p>
-            <w:pPr>
-              <w:bidi w:val="1"/>
-              <w:jc w:val="right"/>
-            </w:pPr>
-            <w:r>
-              <w:rPr>
-                <w:rFonts w:ascii="Segoe UI" w:hAnsi="Segoe UI"/>
-                <w:color w:val="1E293B"/>
-                <w:sz w:val="21"/>
-              </w:rPr>
-              <w:t>אתגרים מסכמים (יסודות)</w:t>
-            </w:r>
-          </w:p>
-        </w:tc>
-        <w:tc>
-          <w:tcPr>
-            <w:tcW w:type="dxa" w:w="3312"/>
-          </w:tcPr>
-          <w:p>
-            <w:pPr>
-              <w:bidi w:val="1"/>
-              <w:jc w:val="right"/>
-            </w:pPr>
-            <w:r>
-              <w:rPr>
-                <w:rFonts w:ascii="Segoe UI" w:hAnsi="Segoe UI"/>
-                <w:color w:val="1E293B"/>
-                <w:sz w:val="21"/>
-              </w:rPr>
-              <w:t>שלבים 24–25: אתגר הסינון (זוגי/אי-זוגי), אתגר ה-FizzBuzz העולמי</w:t>
-            </w:r>
-          </w:p>
-        </w:tc>
-      </w:tr>
-      <w:tr>
-        <w:tc>
-          <w:tcPr>
-            <w:tcW w:type="dxa" w:w="3312"/>
-            <w:shd w:fill="F8FAFC"/>
-          </w:tcPr>
-          <w:p>
-            <w:pPr>
-              <w:bidi w:val="1"/>
-              <w:jc w:val="right"/>
-            </w:pPr>
-            <w:r>
-              <w:rPr>
-                <w:rFonts w:ascii="Segoe UI" w:hAnsi="Segoe UI"/>
-                <w:color w:val="1E293B"/>
-                <w:sz w:val="21"/>
-              </w:rPr>
-              <w:t>פרק 9</w:t>
-            </w:r>
-          </w:p>
-        </w:tc>
-        <w:tc>
-          <w:tcPr>
-            <w:tcW w:type="dxa" w:w="3312"/>
-            <w:shd w:fill="F8FAFC"/>
-          </w:tcPr>
-          <w:p>
-            <w:pPr>
-              <w:bidi w:val="1"/>
-              <w:jc w:val="right"/>
-            </w:pPr>
-            <w:r>
-              <w:rPr>
-                <w:rFonts w:ascii="Segoe UI" w:hAnsi="Segoe UI"/>
-                <w:color w:val="1E293B"/>
-                <w:sz w:val="21"/>
-              </w:rPr>
-              <w:t>מבני נתונים מתקדמים</w:t>
-            </w:r>
-          </w:p>
-        </w:tc>
-        <w:tc>
-          <w:tcPr>
-            <w:tcW w:type="dxa" w:w="3312"/>
-            <w:shd w:fill="F8FAFC"/>
-          </w:tcPr>
-          <w:p>
-            <w:pPr>
-              <w:bidi w:val="1"/>
-              <w:jc w:val="right"/>
-            </w:pPr>
-            <w:r>
-              <w:rPr>
-                <w:rFonts w:ascii="Segoe UI" w:hAnsi="Segoe UI"/>
-                <w:color w:val="1E293B"/>
-                <w:sz w:val="21"/>
-              </w:rPr>
-              <w:t>שלבים 26–28: טאפלים (Tuples), סטים (Sets), List Comprehension</w:t>
-            </w:r>
-          </w:p>
-        </w:tc>
-      </w:tr>
-      <w:tr>
-        <w:tc>
-          <w:tcPr>
-            <w:tcW w:type="dxa" w:w="3312"/>
-          </w:tcPr>
-          <w:p>
-            <w:pPr>
-              <w:bidi w:val="1"/>
-              <w:jc w:val="right"/>
-            </w:pPr>
-            <w:r>
-              <w:rPr>
-                <w:rFonts w:ascii="Segoe UI" w:hAnsi="Segoe UI"/>
-                <w:color w:val="1E293B"/>
-                <w:sz w:val="21"/>
-              </w:rPr>
-              <w:t>פרק 10</w:t>
-            </w:r>
-          </w:p>
-        </w:tc>
-        <w:tc>
-          <w:tcPr>
-            <w:tcW w:type="dxa" w:w="3312"/>
-          </w:tcPr>
-          <w:p>
-            <w:pPr>
-              <w:bidi w:val="1"/>
-              <w:jc w:val="right"/>
-            </w:pPr>
-            <w:r>
-              <w:rPr>
-                <w:rFonts w:ascii="Segoe UI" w:hAnsi="Segoe UI"/>
-                <w:color w:val="1E293B"/>
-                <w:sz w:val="21"/>
-              </w:rPr>
-              <w:t>טיפול בשגיאות</w:t>
-            </w:r>
-          </w:p>
-        </w:tc>
-        <w:tc>
-          <w:tcPr>
-            <w:tcW w:type="dxa" w:w="3312"/>
-          </w:tcPr>
-          <w:p>
-            <w:pPr>
-              <w:bidi w:val="1"/>
-              <w:jc w:val="right"/>
-            </w:pPr>
-            <w:r>
-              <w:rPr>
-                <w:rFonts w:ascii="Segoe UI" w:hAnsi="Segoe UI"/>
-                <w:color w:val="1E293B"/>
-                <w:sz w:val="21"/>
-              </w:rPr>
-              <w:t>שלבים 29–31: try ו-except, שגיאות מרובות, else ו-finally</w:t>
-            </w:r>
-          </w:p>
-        </w:tc>
-      </w:tr>
-      <w:tr>
-        <w:tc>
-          <w:tcPr>
-            <w:tcW w:type="dxa" w:w="3312"/>
-            <w:shd w:fill="F8FAFC"/>
-          </w:tcPr>
-          <w:p>
-            <w:pPr>
-              <w:bidi w:val="1"/>
-              <w:jc w:val="right"/>
-            </w:pPr>
-            <w:r>
-              <w:rPr>
-                <w:rFonts w:ascii="Segoe UI" w:hAnsi="Segoe UI"/>
-                <w:color w:val="1E293B"/>
-                <w:sz w:val="21"/>
-              </w:rPr>
-              <w:t>פרק 11</w:t>
-            </w:r>
-          </w:p>
-        </w:tc>
-        <w:tc>
-          <w:tcPr>
-            <w:tcW w:type="dxa" w:w="3312"/>
-            <w:shd w:fill="F8FAFC"/>
-          </w:tcPr>
-          <w:p>
-            <w:pPr>
-              <w:bidi w:val="1"/>
-              <w:jc w:val="right"/>
-            </w:pPr>
-            <w:r>
-              <w:rPr>
-                <w:rFonts w:ascii="Segoe UI" w:hAnsi="Segoe UI"/>
-                <w:color w:val="1E293B"/>
-                <w:sz w:val="21"/>
-              </w:rPr>
-              <w:t>מודולים וספריות</w:t>
-            </w:r>
-          </w:p>
-        </w:tc>
-        <w:tc>
-          <w:tcPr>
-            <w:tcW w:type="dxa" w:w="3312"/>
-            <w:shd w:fill="F8FAFC"/>
-          </w:tcPr>
-          <w:p>
-            <w:pPr>
-              <w:bidi w:val="1"/>
-              <w:jc w:val="right"/>
-            </w:pPr>
-            <w:r>
-              <w:rPr>
-                <w:rFonts w:ascii="Segoe UI" w:hAnsi="Segoe UI"/>
-                <w:color w:val="1E293B"/>
-                <w:sz w:val="21"/>
-              </w:rPr>
-              <w:t>שלבים 32–34: מודול math, מודול random, עבודה עם JSON</w:t>
-            </w:r>
-          </w:p>
-        </w:tc>
-      </w:tr>
-      <w:tr>
-        <w:tc>
-          <w:tcPr>
-            <w:tcW w:type="dxa" w:w="3312"/>
-          </w:tcPr>
-          <w:p>
-            <w:pPr>
-              <w:bidi w:val="1"/>
-              <w:jc w:val="right"/>
-            </w:pPr>
-            <w:r>
-              <w:rPr>
-                <w:rFonts w:ascii="Segoe UI" w:hAnsi="Segoe UI"/>
-                <w:color w:val="1E293B"/>
-                <w:sz w:val="21"/>
-              </w:rPr>
-              <w:t>פרק 12</w:t>
-            </w:r>
-          </w:p>
-        </w:tc>
-        <w:tc>
-          <w:tcPr>
-            <w:tcW w:type="dxa" w:w="3312"/>
-          </w:tcPr>
-          <w:p>
-            <w:pPr>
-              <w:bidi w:val="1"/>
-              <w:jc w:val="right"/>
-            </w:pPr>
-            <w:r>
-              <w:rPr>
-                <w:rFonts w:ascii="Segoe UI" w:hAnsi="Segoe UI"/>
-                <w:color w:val="1E293B"/>
-                <w:sz w:val="21"/>
-              </w:rPr>
-              <w:t>תכנות מונחה עצמים (OOP)</w:t>
-            </w:r>
-          </w:p>
-        </w:tc>
-        <w:tc>
-          <w:tcPr>
-            <w:tcW w:type="dxa" w:w="3312"/>
-          </w:tcPr>
-          <w:p>
-            <w:pPr>
-              <w:bidi w:val="1"/>
-              <w:jc w:val="right"/>
-            </w:pPr>
-            <w:r>
-              <w:rPr>
-                <w:rFonts w:ascii="Segoe UI" w:hAnsi="Segoe UI"/>
-                <w:color w:val="1E293B"/>
-                <w:sz w:val="21"/>
-              </w:rPr>
-              <w:t>שלבים 35–37: מחלקות (Class &amp; Object), הבנאי __init__, מתודות</w:t>
-            </w:r>
-          </w:p>
-        </w:tc>
-      </w:tr>
-      <w:tr>
-        <w:tc>
-          <w:tcPr>
-            <w:tcW w:type="dxa" w:w="3312"/>
-            <w:shd w:fill="F8FAFC"/>
-          </w:tcPr>
-          <w:p>
-            <w:pPr>
-              <w:bidi w:val="1"/>
-              <w:jc w:val="right"/>
-            </w:pPr>
-            <w:r>
-              <w:rPr>
-                <w:rFonts w:ascii="Segoe UI" w:hAnsi="Segoe UI"/>
-                <w:color w:val="1E293B"/>
-                <w:sz w:val="21"/>
-              </w:rPr>
-              <w:t>פרק 13</w:t>
-            </w:r>
-          </w:p>
-        </w:tc>
-        <w:tc>
-          <w:tcPr>
-            <w:tcW w:type="dxa" w:w="3312"/>
-            <w:shd w:fill="F8FAFC"/>
-          </w:tcPr>
-          <w:p>
-            <w:pPr>
-              <w:bidi w:val="1"/>
-              <w:jc w:val="right"/>
-            </w:pPr>
-            <w:r>
-              <w:rPr>
-                <w:rFonts w:ascii="Segoe UI" w:hAnsi="Segoe UI"/>
-                <w:color w:val="1E293B"/>
-                <w:sz w:val="21"/>
-              </w:rPr>
-              <w:t>OOP מתקדם</w:t>
-            </w:r>
-          </w:p>
-        </w:tc>
-        <w:tc>
-          <w:tcPr>
-            <w:tcW w:type="dxa" w:w="3312"/>
-            <w:shd w:fill="F8FAFC"/>
-          </w:tcPr>
-          <w:p>
-            <w:pPr>
-              <w:bidi w:val="1"/>
-              <w:jc w:val="right"/>
-            </w:pPr>
-            <w:r>
-              <w:rPr>
-                <w:rFonts w:ascii="Segoe UI" w:hAnsi="Segoe UI"/>
-                <w:color w:val="1E293B"/>
-                <w:sz w:val="21"/>
-              </w:rPr>
-              <w:t>שלבים 38–39: ירושה (Inheritance), דריסת מתודות עם super()</w:t>
-            </w:r>
-          </w:p>
-        </w:tc>
-      </w:tr>
-      <w:tr>
-        <w:tc>
-          <w:tcPr>
-            <w:tcW w:type="dxa" w:w="3312"/>
-          </w:tcPr>
-          <w:p>
-            <w:pPr>
-              <w:bidi w:val="1"/>
-              <w:jc w:val="right"/>
-            </w:pPr>
-            <w:r>
-              <w:rPr>
-                <w:rFonts w:ascii="Segoe UI" w:hAnsi="Segoe UI"/>
-                <w:color w:val="1E293B"/>
-                <w:sz w:val="21"/>
-              </w:rPr>
-              <w:t>פרק 14</w:t>
-            </w:r>
-          </w:p>
-        </w:tc>
-        <w:tc>
-          <w:tcPr>
-            <w:tcW w:type="dxa" w:w="3312"/>
-          </w:tcPr>
-          <w:p>
-            <w:pPr>
-              <w:bidi w:val="1"/>
-              <w:jc w:val="right"/>
-            </w:pPr>
-            <w:r>
-              <w:rPr>
-                <w:rFonts w:ascii="Segoe UI" w:hAnsi="Segoe UI"/>
-                <w:color w:val="1E293B"/>
-                <w:sz w:val="21"/>
-              </w:rPr>
-              <w:t>פרויקטים מתקדמים</w:t>
-            </w:r>
-          </w:p>
-        </w:tc>
-        <w:tc>
-          <w:tcPr>
-            <w:tcW w:type="dxa" w:w="3312"/>
-          </w:tcPr>
-          <w:p>
-            <w:pPr>
-              <w:bidi w:val="1"/>
-              <w:jc w:val="right"/>
-            </w:pPr>
-            <w:r>
-              <w:rPr>
-                <w:rFonts w:ascii="Segoe UI" w:hAnsi="Segoe UI"/>
-                <w:color w:val="1E293B"/>
-                <w:sz w:val="21"/>
-              </w:rPr>
-              <w:t>שלבים 40–42: מחשבון מונחה עצמים, מחולל סיסמאות, מערכת Task Manager</w:t>
-            </w:r>
-          </w:p>
-        </w:tc>
-      </w:tr>
-    </w:tbl>
-    <w:p/>
     <w:p>
       <w:pPr>
-        <w:pStyle w:val="Heading1"/>
-        <w:bidi w:val="1"/>
-        <w:jc w:val="right"/>
+        <w:pStyle w:val="Heading2"/>
+        <w:bidi/>
       </w:pPr>
       <w:r>
-        <w:rPr>
-          <w:rFonts w:ascii="Segoe UI" w:hAnsi="Segoe UI"/>
-          <w:b/>
-          <w:color w:val="0E7490"/>
-          <w:sz w:val="40"/>
-        </w:rPr>
+        <w:t>🗺️ מפת המסלול המלא (60 שלבים ב-18 פרקים)</w:t>
+      </w:r>
+    </w:p>
+    <w:p>
+      <w:pPr>
+        <w:bidi/>
+      </w:pPr>
+      <w:r>
+        <w:t>פרק | נושא | שלבים</w:t>
+      </w:r>
+    </w:p>
+    <w:p>
+      <w:pPr>
+        <w:bidi/>
+      </w:pPr>
+      <w:r>
+        <w:t>**פרק 1** | צעדים ראשונים | שלבים 1–3: שלום עולם, חישובים, הדפסת ערכים מרובים</w:t>
+      </w:r>
+    </w:p>
+    <w:p>
+      <w:pPr>
+        <w:bidi/>
+      </w:pPr>
+      <w:r>
+        <w:t>**פרק 2** | משתנים וסוגי נתונים | שלבים 4–7: משתנים, f-strings, המרות int/str, בוליאנים</w:t>
+      </w:r>
+    </w:p>
+    <w:p>
+      <w:pPr>
+        <w:bidi/>
+      </w:pPr>
+      <w:r>
+        <w:t>**פרק 3** | תנאים והחלטות | שלבים 8–11: תנאי if, if-else, elif, תנאים מורכבים and/or</w:t>
+      </w:r>
+    </w:p>
+    <w:p>
+      <w:pPr>
+        <w:bidi/>
+      </w:pPr>
+      <w:r>
+        <w:t>**פרק 4** | לולאות וחזרות | שלבים 12–15: לולאת for, טווחי range, לולאת while, עצירה עם break</w:t>
+      </w:r>
+    </w:p>
+    <w:p>
+      <w:pPr>
+        <w:bidi/>
+      </w:pPr>
+      <w:r>
+        <w:t>**פרק 5** | רשימות (Lists) | שלבים 16–18: אינדקסים, append, len, סריקה בלולאה</w:t>
+      </w:r>
+    </w:p>
+    <w:p>
+      <w:pPr>
+        <w:bidi/>
+      </w:pPr>
+      <w:r>
+        <w:t>**פרק 6** | מילונים (Dictionaries) | שלבים 19–20: מבנה מפתח-ערך, שליפת נתונים, עדכון והוספה</w:t>
+      </w:r>
+    </w:p>
+    <w:p>
+      <w:pPr>
+        <w:bidi/>
+      </w:pPr>
+      <w:r>
+        <w:t>**פרק 7** | פונקציות (Functions) | שלבים 21–23: הגדרה עם def, פרמטרים, החזרת ערך עם return</w:t>
+      </w:r>
+    </w:p>
+    <w:p>
+      <w:pPr>
+        <w:bidi/>
+      </w:pPr>
+      <w:r>
+        <w:t>**פרק 8** | אתגרים מסכמים (יסודות) | שלבים 24–25: אתגר הסינון (זוגי/אי-זוגי), אתגר ה-FizzBuzz העולמי</w:t>
+      </w:r>
+    </w:p>
+    <w:p>
+      <w:pPr>
+        <w:bidi/>
+      </w:pPr>
+      <w:r>
+        <w:t>**פרק 9** | מבני נתונים מתקדמים | שלבים 26–28: טאפלים (Tuples), סטים (Sets), List Comprehension</w:t>
+      </w:r>
+    </w:p>
+    <w:p>
+      <w:pPr>
+        <w:bidi/>
+      </w:pPr>
+      <w:r>
+        <w:t>**פרק 10** | טיפול בשגיאות | שלבים 29–31: try ו-except, שגיאות מרובות, else ו-finally</w:t>
+      </w:r>
+    </w:p>
+    <w:p>
+      <w:pPr>
+        <w:bidi/>
+      </w:pPr>
+      <w:r>
+        <w:t>**פרק 11** | מודולים וספריות | שלבים 32–34: מודול math, מודול random, עבודה עם JSON</w:t>
+      </w:r>
+    </w:p>
+    <w:p>
+      <w:pPr>
+        <w:bidi/>
+      </w:pPr>
+      <w:r>
+        <w:t>**פרק 12** | תכנות מונחה עצמים (OOP) | שלבים 35–37: מחלקות (Class &amp; Object), הבנאי \_\_init\_\_, מתודות</w:t>
+      </w:r>
+    </w:p>
+    <w:p>
+      <w:pPr>
+        <w:bidi/>
+      </w:pPr>
+      <w:r>
+        <w:t>**פרק 13** | OOP מתקדם | שלבים 38–39: ירושה (Inheritance), דריסת מתודות עם super()</w:t>
+      </w:r>
+    </w:p>
+    <w:p>
+      <w:pPr>
+        <w:bidi/>
+      </w:pPr>
+      <w:r>
+        <w:t>**פרק 14** | פרויקטים מתקדמים | שלבים 40–42: מחשבון מונחה עצמים, מחולל סיסמאות, מערכת Task Manager</w:t>
+      </w:r>
+    </w:p>
+    <w:p>
+      <w:pPr>
+        <w:bidi/>
+      </w:pPr>
+      <w:r>
+        <w:t>**פרק 15** | עיבוד נתונים מהיר (NumPy) | שלבים 43–47: מערכים, וקטוריזציה, מטריצות 2D, פריסה ו-Reshape, סינון ומסכות</w:t>
+      </w:r>
+    </w:p>
+    <w:p>
+      <w:pPr>
+        <w:bidi/>
+      </w:pPr>
+      <w:r>
+        <w:t>**פרק 16** | ניתוח נתונים טבלאיים (Pandas) | שלבים 48–52: Series ו-DataFrame, חקירת נתונים, סינון מתקדם, טיפול בחסרים, GroupBy</w:t>
+      </w:r>
+    </w:p>
+    <w:p>
+      <w:pPr>
+        <w:bidi/>
+      </w:pPr>
+      <w:r>
+        <w:t>**פרק 17** | יסודות למידת מכונה (ML) | שלבים 53–56: תכונות ותוויות ($X$ ו-$y$), train_test_split, מודל GaussianNB, מדד דיוק</w:t>
+      </w:r>
+    </w:p>
+    <w:p>
+      <w:pPr>
+        <w:bidi/>
+      </w:pPr>
+      <w:r>
+        <w:t>**פרק 18** | מודלים קלאסיים ופרויקט AI | שלבים 57–60: עצי החלטה, שכנים קרובים (KNN), רגרסיה ליניארית, צינור ML שלם</w:t>
+      </w:r>
+    </w:p>
+    <w:p>
+      <w:pPr>
+        <w:bidi/>
+      </w:pPr>
+      <w:r>
+        <w:t>---</w:t>
+      </w:r>
+    </w:p>
+    <w:p>
+      <w:pPr>
+        <w:pStyle w:val="Heading2"/>
+        <w:bidi/>
+      </w:pPr>
+      <w:r>
         <w:t>💬 שאלות ותשובות נפוצות (FAQ)</w:t>
       </w:r>
     </w:p>
     <w:p>
       <w:pPr>
         <w:pStyle w:val="ListBullet"/>
-        <w:bidi w:val="1"/>
-        <w:jc w:val="right"/>
+        <w:bidi/>
       </w:pPr>
       <w:r>
-        <w:rPr>
-          <w:rFonts w:ascii="Segoe UI" w:hAnsi="Segoe UI"/>
-          <w:color w:val="334155"/>
-        </w:rPr>
-      </w:r>
-      <w:r>
-        <w:rPr>
-          <w:rFonts w:ascii="Segoe UI" w:hAnsi="Segoe UI"/>
-          <w:b/>
-          <w:color w:val="1E293B"/>
-        </w:rPr>
-        <w:t>האם ההתקדמות והקוד שלי נשמרים אם אסגור את הדפדפן?</w:t>
-      </w:r>
-      <w:r>
-        <w:rPr>
-          <w:rFonts w:ascii="Segoe UI" w:hAnsi="Segoe UI"/>
-          <w:color w:val="334155"/>
-        </w:rPr>
+        <w:t>**האם ההתקדמות והקוד שלי נשמרים אם אסגור את הדפדפן?**</w:t>
       </w:r>
     </w:p>
     <w:p>
       <w:pPr>
-        <w:bidi w:val="1"/>
-        <w:jc w:val="right"/>
+        <w:bidi/>
       </w:pPr>
       <w:r>
-        <w:rPr>
-          <w:rFonts w:ascii="Segoe UI" w:hAnsi="Segoe UI"/>
-          <w:color w:val="334155"/>
-        </w:rPr>
-      </w:r>
-      <w:r>
-        <w:rPr>
-          <w:rFonts w:ascii="Segoe UI" w:hAnsi="Segoe UI"/>
-          <w:b/>
-          <w:color w:val="0F172A"/>
-        </w:rPr>
-        <w:t>כן, באופן מלא!</w:t>
-      </w:r>
-      <w:r>
-        <w:rPr>
-          <w:rFonts w:ascii="Segoe UI" w:hAnsi="Segoe UI"/>
-          <w:color w:val="334155"/>
-        </w:rPr>
-        <w:t xml:space="preserve"> האפליקציה שומרת את כל השלבים שהשלמת וטיוטות הקוד שכתבת ב-`localStorage` של הדפדפן. בפעם הבאה שתיכנס, תמשיך בדיוק מהמקום שבו עצרת.</w:t>
+        <w:t>**כן, באופן מלא!** האפליקציה שומרת את כל השלבים שהשלמת וטיוטות הקוד שכתבת ב-`localStorage` של הדפדפן. בפעם הבאה שתיכנס, תמשיך בדיוק מהמקום שבו עצרת.</w:t>
       </w:r>
     </w:p>
     <w:p>
       <w:pPr>
         <w:pStyle w:val="ListBullet"/>
-        <w:bidi w:val="1"/>
-        <w:jc w:val="right"/>
+        <w:bidi/>
       </w:pPr>
       <w:r>
-        <w:rPr>
-          <w:rFonts w:ascii="Segoe UI" w:hAnsi="Segoe UI"/>
-          <w:color w:val="334155"/>
-        </w:rPr>
-      </w:r>
-      <w:r>
-        <w:rPr>
-          <w:rFonts w:ascii="Segoe UI" w:hAnsi="Segoe UI"/>
-          <w:b/>
-          <w:color w:val="1E293B"/>
-        </w:rPr>
-        <w:t>האם אפשר להשתמש באפליקציה מהטלפון הנייד?</w:t>
-      </w:r>
-      <w:r>
-        <w:rPr>
-          <w:rFonts w:ascii="Segoe UI" w:hAnsi="Segoe UI"/>
-          <w:color w:val="334155"/>
-        </w:rPr>
+        <w:t>**האם אפשר להשתמש באפליקציה מהטלפון הנייד?**</w:t>
       </w:r>
     </w:p>
     <w:p>
       <w:pPr>
-        <w:bidi w:val="1"/>
-        <w:jc w:val="right"/>
+        <w:bidi/>
       </w:pPr>
       <w:r>
-        <w:rPr>
-          <w:rFonts w:ascii="Segoe UI" w:hAnsi="Segoe UI"/>
-          <w:color w:val="334155"/>
-        </w:rPr>
-      </w:r>
-      <w:r>
-        <w:rPr>
-          <w:rFonts w:ascii="Segoe UI" w:hAnsi="Segoe UI"/>
-          <w:b/>
-          <w:color w:val="0F172A"/>
-        </w:rPr>
-        <w:t>כן!</w:t>
-      </w:r>
-      <w:r>
-        <w:rPr>
-          <w:rFonts w:ascii="Segoe UI" w:hAnsi="Segoe UI"/>
-          <w:color w:val="334155"/>
-        </w:rPr>
-        <w:t xml:space="preserve"> האתר מותאם לחלוטין לנייד כולל סרגל לשוניות מותאם, פריסה רספונסיבית וכפתור ייעודי להזחת Tab.</w:t>
+        <w:t>**כן!** האתר מותאם לחלוטין לנייד כולל סרגל לשוניות מותאם, פריסה רספונסיבית וכפתור ייעודי להזחת Tab.</w:t>
       </w:r>
     </w:p>
     <w:p>
       <w:pPr>
         <w:pStyle w:val="ListBullet"/>
-        <w:bidi w:val="1"/>
-        <w:jc w:val="right"/>
+        <w:bidi/>
       </w:pPr>
       <w:r>
-        <w:rPr>
-          <w:rFonts w:ascii="Segoe UI" w:hAnsi="Segoe UI"/>
-          <w:color w:val="334155"/>
-        </w:rPr>
-      </w:r>
-      <w:r>
-        <w:rPr>
-          <w:rFonts w:ascii="Segoe UI" w:hAnsi="Segoe UI"/>
-          <w:b/>
-          <w:color w:val="1E293B"/>
-        </w:rPr>
-        <w:t>למה יש שני כפתורים שונים ל-Gemini?</w:t>
-      </w:r>
-      <w:r>
-        <w:rPr>
-          <w:rFonts w:ascii="Segoe UI" w:hAnsi="Segoe UI"/>
-          <w:color w:val="334155"/>
-        </w:rPr>
+        <w:t>**למה יש שני כפתורים שונים ל-Gemini?**</w:t>
       </w:r>
     </w:p>
     <w:p>
       <w:pPr>
         <w:pStyle w:val="ListBullet"/>
-        <w:bidi w:val="1"/>
-        <w:jc w:val="right"/>
+        <w:bidi/>
       </w:pPr>
       <w:r>
-        <w:rPr>
-          <w:rFonts w:ascii="Segoe UI" w:hAnsi="Segoe UI"/>
-          <w:color w:val="334155"/>
-        </w:rPr>
-        <w:t xml:space="preserve">כפתור </w:t>
-      </w:r>
-      <w:r>
-        <w:rPr>
-          <w:rFonts w:ascii="Segoe UI" w:hAnsi="Segoe UI"/>
-          <w:b/>
-          <w:color w:val="1E293B"/>
-        </w:rPr>
-        <w:t>"⚡ העתק ופתח ב-Gemini"</w:t>
-      </w:r>
-      <w:r>
-        <w:rPr>
-          <w:rFonts w:ascii="Segoe UI" w:hAnsi="Segoe UI"/>
-          <w:color w:val="334155"/>
-        </w:rPr>
-        <w:t xml:space="preserve"> גם מעתיק את הפרומפט וגם פותח את ג'מיני בדפדפן.</w:t>
+        <w:t>כפתור **"⚡ העתק ופתח ב-Gemini"** גם מעתיק את הפרומפט וגם פותח את ג'מיני בדפדפן.</w:t>
       </w:r>
     </w:p>
     <w:p>
       <w:pPr>
         <w:pStyle w:val="ListBullet"/>
-        <w:bidi w:val="1"/>
-        <w:jc w:val="right"/>
+        <w:bidi/>
       </w:pPr>
       <w:r>
-        <w:rPr>
-          <w:rFonts w:ascii="Segoe UI" w:hAnsi="Segoe UI"/>
-          <w:color w:val="334155"/>
-        </w:rPr>
-        <w:t xml:space="preserve">כפתור </w:t>
-      </w:r>
-      <w:r>
-        <w:rPr>
-          <w:rFonts w:ascii="Segoe UI" w:hAnsi="Segoe UI"/>
-          <w:b/>
-          <w:color w:val="1E293B"/>
-        </w:rPr>
-        <w:t>"📋 העתק פרומפט"</w:t>
-      </w:r>
-      <w:r>
-        <w:rPr>
-          <w:rFonts w:ascii="Segoe UI" w:hAnsi="Segoe UI"/>
-          <w:color w:val="334155"/>
-        </w:rPr>
-        <w:t xml:space="preserve"> מיועד למי שג'מיני כבר פתוח אצלו במסך מפוצל או בלשונית סמוכה, ורוצה להעתיק את הפרומפט ללוח בלי לפתוח חלונות מיותרים.</w:t>
+        <w:t>כפתור **"📋 העתק פרומפט"** מיועד למי שג'מיני כבר פתוח אצלו במסך מפוצל או בלשונית סמוכה, ורוצה להעתיק את הפרומפט ללוח בלי לפתוח חלונות מיותרים.</w:t>
       </w:r>
     </w:p>
     <w:p>
       <w:pPr>
         <w:pStyle w:val="ListBullet"/>
-        <w:bidi w:val="1"/>
-        <w:jc w:val="right"/>
+        <w:bidi/>
       </w:pPr>
       <w:r>
-        <w:rPr>
-          <w:rFonts w:ascii="Segoe UI" w:hAnsi="Segoe UI"/>
-          <w:color w:val="334155"/>
-        </w:rPr>
-      </w:r>
-      <w:r>
-        <w:rPr>
-          <w:rFonts w:ascii="Segoe UI" w:hAnsi="Segoe UI"/>
-          <w:b/>
-          <w:color w:val="1E293B"/>
-        </w:rPr>
-        <w:t>האם אפשר לחזור לשלבים קודמים?</w:t>
-      </w:r>
-      <w:r>
-        <w:rPr>
-          <w:rFonts w:ascii="Segoe UI" w:hAnsi="Segoe UI"/>
-          <w:color w:val="334155"/>
-        </w:rPr>
+        <w:t>**האם אפשר לחזור לשלבים קודמים?**</w:t>
       </w:r>
     </w:p>
     <w:p>
       <w:pPr>
-        <w:bidi w:val="1"/>
-        <w:jc w:val="right"/>
+        <w:bidi/>
       </w:pPr>
       <w:r>
-        <w:rPr>
-          <w:rFonts w:ascii="Segoe UI" w:hAnsi="Segoe UI"/>
-          <w:color w:val="334155"/>
-        </w:rPr>
-      </w:r>
-      <w:r>
-        <w:rPr>
-          <w:rFonts w:ascii="Segoe UI" w:hAnsi="Segoe UI"/>
-          <w:b/>
-          <w:color w:val="0F172A"/>
-        </w:rPr>
-        <w:t>בוודאי!</w:t>
-      </w:r>
-      <w:r>
-        <w:rPr>
-          <w:rFonts w:ascii="Segoe UI" w:hAnsi="Segoe UI"/>
-          <w:color w:val="334155"/>
-        </w:rPr>
-        <w:t xml:space="preserve"> אפשר ללחוץ על כל שיעור בסרגל הצד בכל רגע כדי לחזור, לרענן את הזיכרון או לנסות פתרון אחר.</w:t>
+        <w:t>**בוודאי!** אפשר ללחוץ על כל שיעור בסרגל הצד בכל רגע כדי לחזור, לרענן את הזיכרון או לנסות פתרון אחר.</w:t>
       </w:r>
     </w:p>
     <w:p>
       <w:pPr>
         <w:pStyle w:val="ListBullet"/>
-        <w:bidi w:val="1"/>
-        <w:jc w:val="right"/>
+        <w:bidi/>
       </w:pPr>
       <w:r>
-        <w:rPr>
-          <w:rFonts w:ascii="Segoe UI" w:hAnsi="Segoe UI"/>
-          <w:color w:val="334155"/>
-        </w:rPr>
-      </w:r>
-      <w:r>
-        <w:rPr>
-          <w:rFonts w:ascii="Segoe UI" w:hAnsi="Segoe UI"/>
-          <w:b/>
-          <w:color w:val="1E293B"/>
-        </w:rPr>
-        <w:t>איך מאפסים את ההתקדמות לחלוטין כדי להתחיל מחדש?</w:t>
-      </w:r>
-      <w:r>
-        <w:rPr>
-          <w:rFonts w:ascii="Segoe UI" w:hAnsi="Segoe UI"/>
-          <w:color w:val="334155"/>
-        </w:rPr>
+        <w:t>**איך מאפסים את ההתקדמות לחלוטין כדי להתחיל מחדש?**</w:t>
       </w:r>
     </w:p>
     <w:p>
       <w:pPr>
-        <w:bidi w:val="1"/>
-        <w:jc w:val="right"/>
+        <w:bidi/>
       </w:pPr>
       <w:r>
-        <w:rPr>
-          <w:rFonts w:ascii="Segoe UI" w:hAnsi="Segoe UI"/>
-          <w:color w:val="334155"/>
-        </w:rPr>
         <w:t>בדפדפן: לוחצים F12 -&gt; פותחים Application (או Storage) -&gt; בוחרים Local Storage -&gt; ומוחקים את המפתחות שמתחילים ב-`py_bekalut_`.</w:t>
       </w:r>
     </w:p>
     <w:p>
       <w:pPr>
-        <w:bidi w:val="1"/>
-        <w:jc w:val="right"/>
+        <w:bidi/>
       </w:pPr>
       <w:r>
-        <w:rPr>
-          <w:rFonts w:ascii="Segoe UI" w:hAnsi="Segoe UI"/>
-          <w:color w:val="334155"/>
-        </w:rPr>
-      </w:r>
-      <w:r>
-        <w:rPr>
-          <w:rFonts w:ascii="Segoe UI" w:hAnsi="Segoe UI"/>
-          <w:b/>
-          <w:color w:val="0F172A"/>
-        </w:rPr>
-        <w:t>צא לדרך, תהנה מהלמידה, ותזכור: כל מתכנת בכיר בעולם התחיל בדיוק מאותה שורת קוד שאתה כותב היום! בהצלחה! 🚀</w:t>
-      </w:r>
-      <w:r>
-        <w:rPr>
-          <w:rFonts w:ascii="Segoe UI" w:hAnsi="Segoe UI"/>
-          <w:color w:val="334155"/>
-        </w:rPr>
+        <w:t>---</w:t>
       </w:r>
     </w:p>
     <w:p>
       <w:pPr>
-        <w:bidi w:val="1"/>
-        <w:jc w:val="right"/>
+        <w:bidi/>
       </w:pPr>
       <w:r>
-        <w:rPr>
-          <w:rFonts w:ascii="Segoe UI" w:hAnsi="Segoe UI"/>
-          <w:color w:val="334155"/>
-        </w:rPr>
+        <w:t>**צא לדרך, תהנה מהלמידה, ותזכור: כל מתכנת בכיר בעולם התחיל בדיוק מאותה שורת קוד שאתה כותב היום! בהצלחה! 🚀**</w:t>
+      </w:r>
+    </w:p>
+    <w:p>
+      <w:pPr>
+        <w:bidi/>
+      </w:pPr>
+      <w:r>
+        <w:t>---</w:t>
+      </w:r>
+    </w:p>
+    <w:p>
+      <w:pPr>
+        <w:bidi/>
+      </w:pPr>
+      <w:r>
         <w:t>&lt;div align="center"&gt;</w:t>
       </w:r>
     </w:p>
     <w:p>
       <w:pPr>
-        <w:bidi w:val="1"/>
-        <w:jc w:val="right"/>
+        <w:bidi/>
       </w:pPr>
       <w:r>
-        <w:rPr>
-          <w:rFonts w:ascii="Segoe UI" w:hAnsi="Segoe UI"/>
-          <w:color w:val="334155"/>
-        </w:rPr>
         <w:t>&lt;sub&gt;כל הזכויות שמורות למשפחת ברעם ©&lt;/sub&gt;</w:t>
       </w:r>
     </w:p>
     <w:p>
       <w:pPr>
-        <w:bidi w:val="1"/>
-        <w:jc w:val="right"/>
+        <w:bidi/>
       </w:pPr>
       <w:r>
-        <w:rPr>
-          <w:rFonts w:ascii="Segoe UI" w:hAnsi="Segoe UI"/>
-          <w:color w:val="334155"/>
-        </w:rPr>
         <w:t>&lt;/div&gt;</w:t>
       </w:r>
     </w:p>
     <w:sectPr>
       <w:pgSz w:w="12240" w:h="15840"/>
-      <w:pgMar w:top="1152" w:right="1152" w:bottom="1152" w:left="1152" w:header="720" w:footer="720" w:gutter="0"/>
+      <w:pgMar w:top="1440" w:right="1800" w:bottom="1440" w:left="1800" w:header="720" w:footer="720" w:gutter="0"/>
       <w:cols w:space="720"/>
       <w:docGrid w:linePitch="360"/>
     </w:sectPr>

</xml_diff>

<commit_message>
feat: complete entire DigitalOcean curriculum (68 lessons) with Deep Learning & Reinforcement Learning
</commit_message>
<xml_diff>
--- a/USER_GUIDE.docx
+++ b/USER_GUIDE.docx
@@ -41,7 +41,7 @@
         <w:bidi/>
       </w:pPr>
       <w:r>
-        <w:t>**פייתון בקלות (PyTeen)** היא סביבת למידה אינטראקטיבית, חווייתית וקלילה, שנועדה לקחת אותך צעד אחר צעד – מההדפסה הראשונה של `"Hello, Python!"` ועד לכתיבת תוכניות מונחות עצמים (OOP), טיפול בשגיאות, עיבוד נתונים ב-NumPy ו-Pandas, ולמידת מכונה ו-AI עם Scikit-learn.</w:t>
+        <w:t>**פייתון בקלות (PyTeen)** היא סביבת למידה אינטראקטיבית, חווייתית וקלילה, שנועדה לקחת אותך צעד אחר צעד – מההדפסה הראשונה של `"Hello, Python!"` ועד לכתיבת תוכניות מונחות עצמים (OOP), טיפול בשגיאות, עיבוד נתונים ב-NumPy ו-Pandas, למידת מכונה (Scikit-learn), למידה עמוקה (רשתות נוירונים) ולמידת חיזוק (סוכני AI למשחקים).</w:t>
       </w:r>
     </w:p>
     <w:p>
@@ -157,7 +157,7 @@
         <w:bidi/>
       </w:pPr>
       <w:r>
-        <w:t>בדף הבית תראה סקירה של מסלול הלימוד (60 שלבים ב-18 פרקים), לצד מונה התקדמות דינמי.</w:t>
+        <w:t>בדף הבית תראה סקירה של מסלול הלימוד (68 שלבים ב-20 פרקים), לצד מונה התקדמות דינמי.</w:t>
       </w:r>
     </w:p>
     <w:p>
@@ -1277,7 +1277,7 @@
         <w:bidi/>
       </w:pPr>
       <w:r>
-        <w:t>🗺️ מפת המסלול המלא (60 שלבים ב-18 פרקים)</w:t>
+        <w:t>🗺️ מפת המסלול המלא (68 שלבים ב-20 פרקים)</w:t>
       </w:r>
     </w:p>
     <w:p>
@@ -1430,6 +1430,22 @@
       </w:pPr>
       <w:r>
         <w:t>**פרק 18** | מודלים קלאסיים ופרויקט AI | שלבים 57–60: עצי החלטה, שכנים קרובים (KNN), רגרסיה ליניארית, צינור ML שלם</w:t>
+      </w:r>
+    </w:p>
+    <w:p>
+      <w:pPr>
+        <w:bidi/>
+      </w:pPr>
+      <w:r>
+        <w:t>**פרק 19** | רשתות נוירונים ולמידה עמוקה | שלבים 61–64: מבנה הנוירון, פונקציות שפעול Sigmoid/ReLU, רשת MLP, זיהוי ספרות (MNIST)</w:t>
+      </w:r>
+    </w:p>
+    <w:p>
+      <w:pPr>
+        <w:bidi/>
+      </w:pPr>
+      <w:r>
+        <w:t>**פרק 20** | למידת חיזוק וסוכני AI חכמים | שלבים 65–68: סוכן וסביבה, טבלת Q ומשוואת בלמן, דילמת חקירה/ניצול, בוט משחק אוטונומי</w:t>
       </w:r>
     </w:p>
     <w:p>

</xml_diff>